<commit_message>
Implement clark, park transform and SVPWM
</commit_message>
<xml_diff>
--- a/Datasheet/Equations_SS.docx
+++ b/Datasheet/Equations_SS.docx
@@ -3,6 +3,32 @@
 <w:document xmlns:wpc="http://schemas.microsoft.com/office/word/2010/wordprocessingCanvas" xmlns:cx="http://schemas.microsoft.com/office/drawing/2014/chartex" xmlns:cx1="http://schemas.microsoft.com/office/drawing/2015/9/8/chartex" xmlns:cx2="http://schemas.microsoft.com/office/drawing/2015/10/21/chartex" xmlns:cx3="http://schemas.microsoft.com/office/drawing/2016/5/9/chartex" xmlns:cx4="http://schemas.microsoft.com/office/drawing/2016/5/10/chartex" xmlns:cx5="http://schemas.microsoft.com/office/drawing/2016/5/11/chartex" xmlns:cx6="http://schemas.microsoft.com/office/drawing/2016/5/12/chartex" xmlns:cx7="http://schemas.microsoft.com/office/drawing/2016/5/13/chartex" xmlns:cx8="http://schemas.microsoft.com/office/drawing/2016/5/14/chartex" xmlns:mc="http://schemas.openxmlformats.org/markup-compatibility/2006" xmlns:aink="http://schemas.microsoft.com/office/drawing/2016/ink" xmlns:am3d="http://schemas.microsoft.com/office/drawing/2017/model3d" xmlns:o="urn:schemas-microsoft-com:office:office" xmlns:oel="http://schemas.microsoft.com/office/2019/extlst" xmlns:r="http://schemas.openxmlformats.org/officeDocument/2006/relationships" xmlns:m="http://schemas.openxmlformats.org/officeDocument/2006/math" xmlns:v="urn:schemas-microsoft-com:vml" xmlns:wp14="http://schemas.microsoft.com/office/word/2010/wordprocessingDrawing" xmlns:wp="http://schemas.openxmlformats.org/drawingml/2006/wordprocessingDrawing" xmlns:w10="urn:schemas-microsoft-com:office:word" xmlns:w="http://schemas.openxmlformats.org/wordprocessingml/2006/main" xmlns:w14="http://schemas.microsoft.com/office/word/2010/wordml" xmlns:w15="http://schemas.microsoft.com/office/word/2012/wordml" xmlns:w16cex="http://schemas.microsoft.com/office/word/2018/wordml/cex" xmlns:w16cid="http://schemas.microsoft.com/office/word/2016/wordml/cid" xmlns:w16="http://schemas.microsoft.com/office/word/2018/wordml" xmlns:w16du="http://schemas.microsoft.com/office/word/2023/wordml/word16du" xmlns:w16sdtdh="http://schemas.microsoft.com/office/word/2020/wordml/sdtdatahash" xmlns:w16sdtfl="http://schemas.microsoft.com/office/word/2024/wordml/sdtformatlock" xmlns:w16se="http://schemas.microsoft.com/office/word/2015/wordml/symex" xmlns:wpg="http://schemas.microsoft.com/office/word/2010/wordprocessingGroup" xmlns:wpi="http://schemas.microsoft.com/office/word/2010/wordprocessingInk" xmlns:wne="http://schemas.microsoft.com/office/word/2006/wordml" xmlns:wps="http://schemas.microsoft.com/office/word/2010/wordprocessingShape" mc:Ignorable="w14 w15 w16se w16cid w16 w16cex w16sdtdh w16sdtfl w16du wp14">
   <w:body>
     <w:p>
+      <w:pPr>
+        <w:rPr>
+          <w:rFonts w:eastAsiaTheme="minorEastAsia"/>
+        </w:rPr>
+      </w:pPr>
+      <w:r>
+        <w:rPr>
+          <w:rFonts w:eastAsiaTheme="minorEastAsia"/>
+        </w:rPr>
+        <w:t xml:space="preserve">RT </w:t>
+      </w:r>
+      <w:proofErr w:type="spellStart"/>
+      <w:r>
+        <w:rPr>
+          <w:rFonts w:eastAsiaTheme="minorEastAsia"/>
+        </w:rPr>
+        <w:t>charactersitics</w:t>
+      </w:r>
+      <w:proofErr w:type="spellEnd"/>
+    </w:p>
+    <w:p>
+      <w:pPr>
+        <w:rPr>
+          <w:rFonts w:eastAsiaTheme="minorEastAsia"/>
+        </w:rPr>
+      </w:pPr>
       <m:oMathPara>
         <m:oMath>
           <m:sSub>
@@ -91,6 +117,2902 @@
           </m:r>
         </m:oMath>
       </m:oMathPara>
+    </w:p>
+    <w:p>
+      <w:pPr>
+        <w:rPr>
+          <w:rFonts w:eastAsiaTheme="minorEastAsia"/>
+        </w:rPr>
+      </w:pPr>
+    </w:p>
+    <w:p>
+      <w:pPr>
+        <w:rPr>
+          <w:rFonts w:eastAsiaTheme="minorEastAsia"/>
+        </w:rPr>
+      </w:pPr>
+      <w:r>
+        <w:rPr>
+          <w:rFonts w:eastAsiaTheme="minorEastAsia"/>
+        </w:rPr>
+        <w:t>Clarke transformation</w:t>
+      </w:r>
+    </w:p>
+    <w:p>
+      <w:pPr>
+        <w:rPr>
+          <w:rFonts w:eastAsiaTheme="minorEastAsia"/>
+        </w:rPr>
+      </w:pPr>
+      <m:oMathPara>
+        <m:oMath>
+          <m:sSub>
+            <m:sSubPr>
+              <m:ctrlPr>
+                <w:rPr>
+                  <w:rFonts w:ascii="Cambria Math" w:eastAsiaTheme="minorEastAsia" w:hAnsi="Cambria Math"/>
+                  <w:i/>
+                </w:rPr>
+              </m:ctrlPr>
+            </m:sSubPr>
+            <m:e>
+              <m:r>
+                <w:rPr>
+                  <w:rFonts w:ascii="Cambria Math" w:eastAsiaTheme="minorEastAsia" w:hAnsi="Cambria Math"/>
+                </w:rPr>
+                <m:t>I</m:t>
+              </m:r>
+            </m:e>
+            <m:sub>
+              <m:r>
+                <w:rPr>
+                  <w:rFonts w:ascii="Cambria Math" w:eastAsiaTheme="minorEastAsia" w:hAnsi="Cambria Math"/>
+                </w:rPr>
+                <m:t>α</m:t>
+              </m:r>
+            </m:sub>
+          </m:sSub>
+          <m:r>
+            <w:rPr>
+              <w:rFonts w:ascii="Cambria Math" w:eastAsiaTheme="minorEastAsia" w:hAnsi="Cambria Math"/>
+            </w:rPr>
+            <m:t>=</m:t>
+          </m:r>
+          <m:f>
+            <m:fPr>
+              <m:ctrlPr>
+                <w:rPr>
+                  <w:rFonts w:ascii="Cambria Math" w:eastAsiaTheme="minorEastAsia" w:hAnsi="Cambria Math"/>
+                  <w:i/>
+                </w:rPr>
+              </m:ctrlPr>
+            </m:fPr>
+            <m:num>
+              <m:r>
+                <w:rPr>
+                  <w:rFonts w:ascii="Cambria Math" w:eastAsiaTheme="minorEastAsia" w:hAnsi="Cambria Math"/>
+                </w:rPr>
+                <m:t>2</m:t>
+              </m:r>
+            </m:num>
+            <m:den>
+              <m:r>
+                <w:rPr>
+                  <w:rFonts w:ascii="Cambria Math" w:eastAsiaTheme="minorEastAsia" w:hAnsi="Cambria Math"/>
+                </w:rPr>
+                <m:t>3</m:t>
+              </m:r>
+            </m:den>
+          </m:f>
+          <m:r>
+            <w:rPr>
+              <w:rFonts w:ascii="Cambria Math" w:eastAsiaTheme="minorEastAsia" w:hAnsi="Cambria Math"/>
+            </w:rPr>
+            <m:t>(</m:t>
+          </m:r>
+          <m:sSub>
+            <m:sSubPr>
+              <m:ctrlPr>
+                <w:rPr>
+                  <w:rFonts w:ascii="Cambria Math" w:eastAsiaTheme="minorEastAsia" w:hAnsi="Cambria Math"/>
+                  <w:i/>
+                </w:rPr>
+              </m:ctrlPr>
+            </m:sSubPr>
+            <m:e>
+              <m:r>
+                <w:rPr>
+                  <w:rFonts w:ascii="Cambria Math" w:eastAsiaTheme="minorEastAsia" w:hAnsi="Cambria Math"/>
+                </w:rPr>
+                <m:t>I</m:t>
+              </m:r>
+            </m:e>
+            <m:sub>
+              <m:r>
+                <w:rPr>
+                  <w:rFonts w:ascii="Cambria Math" w:eastAsiaTheme="minorEastAsia" w:hAnsi="Cambria Math"/>
+                </w:rPr>
+                <m:t>a</m:t>
+              </m:r>
+            </m:sub>
+          </m:sSub>
+          <m:r>
+            <w:rPr>
+              <w:rFonts w:ascii="Cambria Math" w:eastAsiaTheme="minorEastAsia" w:hAnsi="Cambria Math"/>
+            </w:rPr>
+            <m:t>-</m:t>
+          </m:r>
+          <m:f>
+            <m:fPr>
+              <m:ctrlPr>
+                <w:rPr>
+                  <w:rFonts w:ascii="Cambria Math" w:eastAsiaTheme="minorEastAsia" w:hAnsi="Cambria Math"/>
+                  <w:i/>
+                </w:rPr>
+              </m:ctrlPr>
+            </m:fPr>
+            <m:num>
+              <m:r>
+                <w:rPr>
+                  <w:rFonts w:ascii="Cambria Math" w:eastAsiaTheme="minorEastAsia" w:hAnsi="Cambria Math"/>
+                </w:rPr>
+                <m:t>1</m:t>
+              </m:r>
+            </m:num>
+            <m:den>
+              <m:r>
+                <w:rPr>
+                  <w:rFonts w:ascii="Cambria Math" w:eastAsiaTheme="minorEastAsia" w:hAnsi="Cambria Math"/>
+                </w:rPr>
+                <m:t>2</m:t>
+              </m:r>
+            </m:den>
+          </m:f>
+          <m:sSub>
+            <m:sSubPr>
+              <m:ctrlPr>
+                <w:rPr>
+                  <w:rFonts w:ascii="Cambria Math" w:eastAsiaTheme="minorEastAsia" w:hAnsi="Cambria Math"/>
+                  <w:i/>
+                </w:rPr>
+              </m:ctrlPr>
+            </m:sSubPr>
+            <m:e>
+              <m:r>
+                <w:rPr>
+                  <w:rFonts w:ascii="Cambria Math" w:eastAsiaTheme="minorEastAsia" w:hAnsi="Cambria Math"/>
+                </w:rPr>
+                <m:t>I</m:t>
+              </m:r>
+            </m:e>
+            <m:sub>
+              <m:r>
+                <w:rPr>
+                  <w:rFonts w:ascii="Cambria Math" w:eastAsiaTheme="minorEastAsia" w:hAnsi="Cambria Math"/>
+                </w:rPr>
+                <m:t>b</m:t>
+              </m:r>
+            </m:sub>
+          </m:sSub>
+          <m:r>
+            <w:rPr>
+              <w:rFonts w:ascii="Cambria Math" w:eastAsiaTheme="minorEastAsia" w:hAnsi="Cambria Math"/>
+            </w:rPr>
+            <m:t>-</m:t>
+          </m:r>
+          <m:f>
+            <m:fPr>
+              <m:ctrlPr>
+                <w:rPr>
+                  <w:rFonts w:ascii="Cambria Math" w:eastAsiaTheme="minorEastAsia" w:hAnsi="Cambria Math"/>
+                  <w:i/>
+                </w:rPr>
+              </m:ctrlPr>
+            </m:fPr>
+            <m:num>
+              <m:r>
+                <w:rPr>
+                  <w:rFonts w:ascii="Cambria Math" w:eastAsiaTheme="minorEastAsia" w:hAnsi="Cambria Math"/>
+                </w:rPr>
+                <m:t>1</m:t>
+              </m:r>
+            </m:num>
+            <m:den>
+              <m:r>
+                <w:rPr>
+                  <w:rFonts w:ascii="Cambria Math" w:eastAsiaTheme="minorEastAsia" w:hAnsi="Cambria Math"/>
+                </w:rPr>
+                <m:t>2</m:t>
+              </m:r>
+            </m:den>
+          </m:f>
+          <m:sSub>
+            <m:sSubPr>
+              <m:ctrlPr>
+                <w:rPr>
+                  <w:rFonts w:ascii="Cambria Math" w:eastAsiaTheme="minorEastAsia" w:hAnsi="Cambria Math"/>
+                  <w:i/>
+                </w:rPr>
+              </m:ctrlPr>
+            </m:sSubPr>
+            <m:e>
+              <m:r>
+                <w:rPr>
+                  <w:rFonts w:ascii="Cambria Math" w:eastAsiaTheme="minorEastAsia" w:hAnsi="Cambria Math"/>
+                </w:rPr>
+                <m:t>I</m:t>
+              </m:r>
+            </m:e>
+            <m:sub>
+              <m:r>
+                <w:rPr>
+                  <w:rFonts w:ascii="Cambria Math" w:eastAsiaTheme="minorEastAsia" w:hAnsi="Cambria Math"/>
+                </w:rPr>
+                <m:t>c</m:t>
+              </m:r>
+            </m:sub>
+          </m:sSub>
+          <m:r>
+            <w:rPr>
+              <w:rFonts w:ascii="Cambria Math" w:eastAsiaTheme="minorEastAsia" w:hAnsi="Cambria Math"/>
+            </w:rPr>
+            <m:t>)</m:t>
+          </m:r>
+        </m:oMath>
+      </m:oMathPara>
+    </w:p>
+    <w:p>
+      <w:pPr>
+        <w:rPr>
+          <w:rFonts w:eastAsiaTheme="minorEastAsia"/>
+        </w:rPr>
+      </w:pPr>
+      <m:oMathPara>
+        <m:oMath>
+          <m:sSub>
+            <m:sSubPr>
+              <m:ctrlPr>
+                <w:rPr>
+                  <w:rFonts w:ascii="Cambria Math" w:eastAsiaTheme="minorEastAsia" w:hAnsi="Cambria Math"/>
+                  <w:i/>
+                </w:rPr>
+              </m:ctrlPr>
+            </m:sSubPr>
+            <m:e>
+              <m:r>
+                <w:rPr>
+                  <w:rFonts w:ascii="Cambria Math" w:eastAsiaTheme="minorEastAsia" w:hAnsi="Cambria Math"/>
+                </w:rPr>
+                <m:t>I</m:t>
+              </m:r>
+            </m:e>
+            <m:sub>
+              <m:r>
+                <w:rPr>
+                  <w:rFonts w:ascii="Cambria Math" w:eastAsiaTheme="minorEastAsia" w:hAnsi="Cambria Math"/>
+                </w:rPr>
+                <m:t>β</m:t>
+              </m:r>
+            </m:sub>
+          </m:sSub>
+          <m:r>
+            <w:rPr>
+              <w:rFonts w:ascii="Cambria Math" w:eastAsiaTheme="minorEastAsia" w:hAnsi="Cambria Math"/>
+            </w:rPr>
+            <m:t>=</m:t>
+          </m:r>
+          <m:f>
+            <m:fPr>
+              <m:ctrlPr>
+                <w:rPr>
+                  <w:rFonts w:ascii="Cambria Math" w:eastAsiaTheme="minorEastAsia" w:hAnsi="Cambria Math"/>
+                  <w:i/>
+                </w:rPr>
+              </m:ctrlPr>
+            </m:fPr>
+            <m:num>
+              <m:r>
+                <w:rPr>
+                  <w:rFonts w:ascii="Cambria Math" w:eastAsiaTheme="minorEastAsia" w:hAnsi="Cambria Math"/>
+                </w:rPr>
+                <m:t>2</m:t>
+              </m:r>
+            </m:num>
+            <m:den>
+              <m:r>
+                <w:rPr>
+                  <w:rFonts w:ascii="Cambria Math" w:eastAsiaTheme="minorEastAsia" w:hAnsi="Cambria Math"/>
+                </w:rPr>
+                <m:t>3</m:t>
+              </m:r>
+            </m:den>
+          </m:f>
+          <m:r>
+            <w:rPr>
+              <w:rFonts w:ascii="Cambria Math" w:eastAsiaTheme="minorEastAsia" w:hAnsi="Cambria Math"/>
+            </w:rPr>
+            <m:t>(</m:t>
+          </m:r>
+          <m:f>
+            <m:fPr>
+              <m:ctrlPr>
+                <w:rPr>
+                  <w:rFonts w:ascii="Cambria Math" w:eastAsiaTheme="minorEastAsia" w:hAnsi="Cambria Math"/>
+                  <w:i/>
+                </w:rPr>
+              </m:ctrlPr>
+            </m:fPr>
+            <m:num>
+              <m:rad>
+                <m:radPr>
+                  <m:degHide m:val="1"/>
+                  <m:ctrlPr>
+                    <w:rPr>
+                      <w:rFonts w:ascii="Cambria Math" w:eastAsiaTheme="minorEastAsia" w:hAnsi="Cambria Math"/>
+                      <w:i/>
+                    </w:rPr>
+                  </m:ctrlPr>
+                </m:radPr>
+                <m:deg/>
+                <m:e>
+                  <m:r>
+                    <w:rPr>
+                      <w:rFonts w:ascii="Cambria Math" w:eastAsiaTheme="minorEastAsia" w:hAnsi="Cambria Math"/>
+                    </w:rPr>
+                    <m:t>3</m:t>
+                  </m:r>
+                </m:e>
+              </m:rad>
+            </m:num>
+            <m:den>
+              <m:r>
+                <w:rPr>
+                  <w:rFonts w:ascii="Cambria Math" w:eastAsiaTheme="minorEastAsia" w:hAnsi="Cambria Math"/>
+                </w:rPr>
+                <m:t>2</m:t>
+              </m:r>
+            </m:den>
+          </m:f>
+          <m:sSub>
+            <m:sSubPr>
+              <m:ctrlPr>
+                <w:rPr>
+                  <w:rFonts w:ascii="Cambria Math" w:eastAsiaTheme="minorEastAsia" w:hAnsi="Cambria Math"/>
+                  <w:i/>
+                </w:rPr>
+              </m:ctrlPr>
+            </m:sSubPr>
+            <m:e>
+              <m:r>
+                <w:rPr>
+                  <w:rFonts w:ascii="Cambria Math" w:eastAsiaTheme="minorEastAsia" w:hAnsi="Cambria Math"/>
+                </w:rPr>
+                <m:t>I</m:t>
+              </m:r>
+            </m:e>
+            <m:sub>
+              <m:r>
+                <w:rPr>
+                  <w:rFonts w:ascii="Cambria Math" w:eastAsiaTheme="minorEastAsia" w:hAnsi="Cambria Math"/>
+                </w:rPr>
+                <m:t>b</m:t>
+              </m:r>
+            </m:sub>
+          </m:sSub>
+          <m:r>
+            <w:rPr>
+              <w:rFonts w:ascii="Cambria Math" w:eastAsiaTheme="minorEastAsia" w:hAnsi="Cambria Math"/>
+            </w:rPr>
+            <m:t>-</m:t>
+          </m:r>
+          <m:f>
+            <m:fPr>
+              <m:ctrlPr>
+                <w:rPr>
+                  <w:rFonts w:ascii="Cambria Math" w:eastAsiaTheme="minorEastAsia" w:hAnsi="Cambria Math"/>
+                  <w:i/>
+                </w:rPr>
+              </m:ctrlPr>
+            </m:fPr>
+            <m:num>
+              <m:rad>
+                <m:radPr>
+                  <m:degHide m:val="1"/>
+                  <m:ctrlPr>
+                    <w:rPr>
+                      <w:rFonts w:ascii="Cambria Math" w:eastAsiaTheme="minorEastAsia" w:hAnsi="Cambria Math"/>
+                      <w:i/>
+                    </w:rPr>
+                  </m:ctrlPr>
+                </m:radPr>
+                <m:deg/>
+                <m:e>
+                  <m:r>
+                    <w:rPr>
+                      <w:rFonts w:ascii="Cambria Math" w:eastAsiaTheme="minorEastAsia" w:hAnsi="Cambria Math"/>
+                    </w:rPr>
+                    <m:t>3</m:t>
+                  </m:r>
+                </m:e>
+              </m:rad>
+            </m:num>
+            <m:den>
+              <m:r>
+                <w:rPr>
+                  <w:rFonts w:ascii="Cambria Math" w:eastAsiaTheme="minorEastAsia" w:hAnsi="Cambria Math"/>
+                </w:rPr>
+                <m:t>2</m:t>
+              </m:r>
+            </m:den>
+          </m:f>
+          <m:sSub>
+            <m:sSubPr>
+              <m:ctrlPr>
+                <w:rPr>
+                  <w:rFonts w:ascii="Cambria Math" w:eastAsiaTheme="minorEastAsia" w:hAnsi="Cambria Math"/>
+                  <w:i/>
+                </w:rPr>
+              </m:ctrlPr>
+            </m:sSubPr>
+            <m:e>
+              <m:r>
+                <w:rPr>
+                  <w:rFonts w:ascii="Cambria Math" w:eastAsiaTheme="minorEastAsia" w:hAnsi="Cambria Math"/>
+                </w:rPr>
+                <m:t>I</m:t>
+              </m:r>
+            </m:e>
+            <m:sub>
+              <m:r>
+                <w:rPr>
+                  <w:rFonts w:ascii="Cambria Math" w:eastAsiaTheme="minorEastAsia" w:hAnsi="Cambria Math"/>
+                </w:rPr>
+                <m:t>c</m:t>
+              </m:r>
+            </m:sub>
+          </m:sSub>
+          <m:r>
+            <w:rPr>
+              <w:rFonts w:ascii="Cambria Math" w:eastAsiaTheme="minorEastAsia" w:hAnsi="Cambria Math"/>
+            </w:rPr>
+            <m:t>)</m:t>
+          </m:r>
+        </m:oMath>
+      </m:oMathPara>
+    </w:p>
+    <w:p>
+      <w:pPr>
+        <w:rPr>
+          <w:rFonts w:eastAsiaTheme="minorEastAsia"/>
+        </w:rPr>
+      </w:pPr>
+    </w:p>
+    <w:p>
+      <w:pPr>
+        <w:rPr>
+          <w:rFonts w:eastAsiaTheme="minorEastAsia"/>
+        </w:rPr>
+      </w:pPr>
+      <w:r>
+        <w:rPr>
+          <w:rFonts w:eastAsiaTheme="minorEastAsia"/>
+        </w:rPr>
+        <w:t>Park transformation</w:t>
+      </w:r>
+    </w:p>
+    <w:p>
+      <w:pPr>
+        <w:rPr>
+          <w:rFonts w:eastAsiaTheme="minorEastAsia"/>
+        </w:rPr>
+      </w:pPr>
+      <m:oMathPara>
+        <m:oMath>
+          <m:sSub>
+            <m:sSubPr>
+              <m:ctrlPr>
+                <w:rPr>
+                  <w:rFonts w:ascii="Cambria Math" w:eastAsiaTheme="minorEastAsia" w:hAnsi="Cambria Math"/>
+                  <w:i/>
+                </w:rPr>
+              </m:ctrlPr>
+            </m:sSubPr>
+            <m:e>
+              <m:r>
+                <w:rPr>
+                  <w:rFonts w:ascii="Cambria Math" w:eastAsiaTheme="minorEastAsia" w:hAnsi="Cambria Math"/>
+                </w:rPr>
+                <m:t>I</m:t>
+              </m:r>
+            </m:e>
+            <m:sub>
+              <m:r>
+                <w:rPr>
+                  <w:rFonts w:ascii="Cambria Math" w:eastAsiaTheme="minorEastAsia" w:hAnsi="Cambria Math"/>
+                </w:rPr>
+                <m:t>d</m:t>
+              </m:r>
+            </m:sub>
+          </m:sSub>
+          <m:r>
+            <w:rPr>
+              <w:rFonts w:ascii="Cambria Math" w:eastAsiaTheme="minorEastAsia" w:hAnsi="Cambria Math"/>
+            </w:rPr>
+            <m:t>=</m:t>
+          </m:r>
+          <m:sSub>
+            <m:sSubPr>
+              <m:ctrlPr>
+                <w:rPr>
+                  <w:rFonts w:ascii="Cambria Math" w:eastAsiaTheme="minorEastAsia" w:hAnsi="Cambria Math"/>
+                  <w:i/>
+                </w:rPr>
+              </m:ctrlPr>
+            </m:sSubPr>
+            <m:e>
+              <m:r>
+                <w:rPr>
+                  <w:rFonts w:ascii="Cambria Math" w:eastAsiaTheme="minorEastAsia" w:hAnsi="Cambria Math"/>
+                </w:rPr>
+                <m:t>I</m:t>
+              </m:r>
+            </m:e>
+            <m:sub>
+              <m:r>
+                <w:rPr>
+                  <w:rFonts w:ascii="Cambria Math" w:eastAsiaTheme="minorEastAsia" w:hAnsi="Cambria Math"/>
+                </w:rPr>
+                <m:t>α</m:t>
+              </m:r>
+            </m:sub>
+          </m:sSub>
+          <m:r>
+            <w:rPr>
+              <w:rFonts w:ascii="Cambria Math" w:eastAsiaTheme="minorEastAsia" w:hAnsi="Cambria Math"/>
+            </w:rPr>
+            <m:t>cosθ</m:t>
+          </m:r>
+          <m:r>
+            <w:rPr>
+              <w:rFonts w:ascii="Cambria Math" w:eastAsiaTheme="minorEastAsia" w:hAnsi="Cambria Math"/>
+            </w:rPr>
+            <m:t>+</m:t>
+          </m:r>
+          <m:sSub>
+            <m:sSubPr>
+              <m:ctrlPr>
+                <w:rPr>
+                  <w:rFonts w:ascii="Cambria Math" w:eastAsiaTheme="minorEastAsia" w:hAnsi="Cambria Math"/>
+                  <w:i/>
+                </w:rPr>
+              </m:ctrlPr>
+            </m:sSubPr>
+            <m:e>
+              <m:r>
+                <w:rPr>
+                  <w:rFonts w:ascii="Cambria Math" w:eastAsiaTheme="minorEastAsia" w:hAnsi="Cambria Math"/>
+                </w:rPr>
+                <m:t>I</m:t>
+              </m:r>
+            </m:e>
+            <m:sub>
+              <m:r>
+                <w:rPr>
+                  <w:rFonts w:ascii="Cambria Math" w:eastAsiaTheme="minorEastAsia" w:hAnsi="Cambria Math"/>
+                </w:rPr>
+                <m:t>β</m:t>
+              </m:r>
+            </m:sub>
+          </m:sSub>
+          <m:r>
+            <w:rPr>
+              <w:rFonts w:ascii="Cambria Math" w:eastAsiaTheme="minorEastAsia" w:hAnsi="Cambria Math"/>
+            </w:rPr>
+            <m:t>sin</m:t>
+          </m:r>
+          <m:r>
+            <w:rPr>
+              <w:rFonts w:ascii="Cambria Math" w:eastAsiaTheme="minorEastAsia" w:hAnsi="Cambria Math"/>
+            </w:rPr>
+            <m:t>θ</m:t>
+          </m:r>
+        </m:oMath>
+      </m:oMathPara>
+    </w:p>
+    <w:p>
+      <w:pPr>
+        <w:rPr>
+          <w:rFonts w:eastAsiaTheme="minorEastAsia"/>
+        </w:rPr>
+      </w:pPr>
+      <m:oMathPara>
+        <m:oMath>
+          <m:sSub>
+            <m:sSubPr>
+              <m:ctrlPr>
+                <w:rPr>
+                  <w:rFonts w:ascii="Cambria Math" w:eastAsiaTheme="minorEastAsia" w:hAnsi="Cambria Math"/>
+                  <w:i/>
+                </w:rPr>
+              </m:ctrlPr>
+            </m:sSubPr>
+            <m:e>
+              <m:r>
+                <w:rPr>
+                  <w:rFonts w:ascii="Cambria Math" w:eastAsiaTheme="minorEastAsia" w:hAnsi="Cambria Math"/>
+                </w:rPr>
+                <m:t>I</m:t>
+              </m:r>
+            </m:e>
+            <m:sub>
+              <m:r>
+                <w:rPr>
+                  <w:rFonts w:ascii="Cambria Math" w:eastAsiaTheme="minorEastAsia" w:hAnsi="Cambria Math"/>
+                </w:rPr>
+                <m:t>q</m:t>
+              </m:r>
+            </m:sub>
+          </m:sSub>
+          <m:r>
+            <w:rPr>
+              <w:rFonts w:ascii="Cambria Math" w:eastAsiaTheme="minorEastAsia" w:hAnsi="Cambria Math"/>
+            </w:rPr>
+            <m:t>=</m:t>
+          </m:r>
+          <m:sSub>
+            <m:sSubPr>
+              <m:ctrlPr>
+                <w:rPr>
+                  <w:rFonts w:ascii="Cambria Math" w:eastAsiaTheme="minorEastAsia" w:hAnsi="Cambria Math"/>
+                  <w:i/>
+                </w:rPr>
+              </m:ctrlPr>
+            </m:sSubPr>
+            <m:e>
+              <m:r>
+                <w:rPr>
+                  <w:rFonts w:ascii="Cambria Math" w:eastAsiaTheme="minorEastAsia" w:hAnsi="Cambria Math"/>
+                </w:rPr>
+                <m:t>-</m:t>
+              </m:r>
+              <m:r>
+                <w:rPr>
+                  <w:rFonts w:ascii="Cambria Math" w:eastAsiaTheme="minorEastAsia" w:hAnsi="Cambria Math"/>
+                </w:rPr>
+                <m:t>I</m:t>
+              </m:r>
+            </m:e>
+            <m:sub>
+              <m:r>
+                <w:rPr>
+                  <w:rFonts w:ascii="Cambria Math" w:eastAsiaTheme="minorEastAsia" w:hAnsi="Cambria Math"/>
+                </w:rPr>
+                <m:t>α</m:t>
+              </m:r>
+            </m:sub>
+          </m:sSub>
+          <m:r>
+            <w:rPr>
+              <w:rFonts w:ascii="Cambria Math" w:eastAsiaTheme="minorEastAsia" w:hAnsi="Cambria Math"/>
+            </w:rPr>
+            <m:t>sin</m:t>
+          </m:r>
+          <m:r>
+            <w:rPr>
+              <w:rFonts w:ascii="Cambria Math" w:eastAsiaTheme="minorEastAsia" w:hAnsi="Cambria Math"/>
+            </w:rPr>
+            <m:t>θ</m:t>
+          </m:r>
+          <m:r>
+            <w:rPr>
+              <w:rFonts w:ascii="Cambria Math" w:eastAsiaTheme="minorEastAsia" w:hAnsi="Cambria Math"/>
+            </w:rPr>
+            <m:t>+</m:t>
+          </m:r>
+          <m:sSub>
+            <m:sSubPr>
+              <m:ctrlPr>
+                <w:rPr>
+                  <w:rFonts w:ascii="Cambria Math" w:eastAsiaTheme="minorEastAsia" w:hAnsi="Cambria Math"/>
+                  <w:i/>
+                </w:rPr>
+              </m:ctrlPr>
+            </m:sSubPr>
+            <m:e>
+              <m:r>
+                <w:rPr>
+                  <w:rFonts w:ascii="Cambria Math" w:eastAsiaTheme="minorEastAsia" w:hAnsi="Cambria Math"/>
+                </w:rPr>
+                <m:t>I</m:t>
+              </m:r>
+            </m:e>
+            <m:sub>
+              <m:r>
+                <w:rPr>
+                  <w:rFonts w:ascii="Cambria Math" w:eastAsiaTheme="minorEastAsia" w:hAnsi="Cambria Math"/>
+                </w:rPr>
+                <m:t>β</m:t>
+              </m:r>
+            </m:sub>
+          </m:sSub>
+          <m:r>
+            <w:rPr>
+              <w:rFonts w:ascii="Cambria Math" w:eastAsiaTheme="minorEastAsia" w:hAnsi="Cambria Math"/>
+            </w:rPr>
+            <m:t>cos</m:t>
+          </m:r>
+          <m:r>
+            <w:rPr>
+              <w:rFonts w:ascii="Cambria Math" w:eastAsiaTheme="minorEastAsia" w:hAnsi="Cambria Math"/>
+            </w:rPr>
+            <m:t>θ</m:t>
+          </m:r>
+        </m:oMath>
+      </m:oMathPara>
+    </w:p>
+    <w:p>
+      <w:pPr>
+        <w:rPr>
+          <w:rFonts w:eastAsiaTheme="minorEastAsia"/>
+        </w:rPr>
+      </w:pPr>
+    </w:p>
+    <w:p>
+      <w:pPr>
+        <w:rPr>
+          <w:rFonts w:eastAsiaTheme="minorEastAsia"/>
+        </w:rPr>
+      </w:pPr>
+      <w:r>
+        <w:rPr>
+          <w:rFonts w:eastAsiaTheme="minorEastAsia"/>
+        </w:rPr>
+        <w:t>Inverse Park Transformation</w:t>
+      </w:r>
+    </w:p>
+    <w:p>
+      <w:pPr>
+        <w:rPr>
+          <w:rFonts w:eastAsiaTheme="minorEastAsia"/>
+        </w:rPr>
+      </w:pPr>
+      <m:oMathPara>
+        <m:oMath>
+          <m:sSub>
+            <m:sSubPr>
+              <m:ctrlPr>
+                <w:rPr>
+                  <w:rFonts w:ascii="Cambria Math" w:eastAsiaTheme="minorEastAsia" w:hAnsi="Cambria Math"/>
+                  <w:i/>
+                </w:rPr>
+              </m:ctrlPr>
+            </m:sSubPr>
+            <m:e>
+              <m:r>
+                <w:rPr>
+                  <w:rFonts w:ascii="Cambria Math" w:eastAsiaTheme="minorEastAsia" w:hAnsi="Cambria Math"/>
+                </w:rPr>
+                <m:t>I</m:t>
+              </m:r>
+            </m:e>
+            <m:sub>
+              <m:r>
+                <w:rPr>
+                  <w:rFonts w:ascii="Cambria Math" w:eastAsiaTheme="minorEastAsia" w:hAnsi="Cambria Math"/>
+                </w:rPr>
+                <m:t>α</m:t>
+              </m:r>
+            </m:sub>
+          </m:sSub>
+          <m:r>
+            <w:rPr>
+              <w:rFonts w:ascii="Cambria Math" w:eastAsiaTheme="minorEastAsia" w:hAnsi="Cambria Math"/>
+            </w:rPr>
+            <m:t>=</m:t>
+          </m:r>
+          <m:sSub>
+            <m:sSubPr>
+              <m:ctrlPr>
+                <w:rPr>
+                  <w:rFonts w:ascii="Cambria Math" w:eastAsiaTheme="minorEastAsia" w:hAnsi="Cambria Math"/>
+                  <w:i/>
+                </w:rPr>
+              </m:ctrlPr>
+            </m:sSubPr>
+            <m:e>
+              <m:r>
+                <w:rPr>
+                  <w:rFonts w:ascii="Cambria Math" w:eastAsiaTheme="minorEastAsia" w:hAnsi="Cambria Math"/>
+                </w:rPr>
+                <m:t>I</m:t>
+              </m:r>
+            </m:e>
+            <m:sub>
+              <m:r>
+                <w:rPr>
+                  <w:rFonts w:ascii="Cambria Math" w:eastAsiaTheme="minorEastAsia" w:hAnsi="Cambria Math"/>
+                </w:rPr>
+                <m:t>d</m:t>
+              </m:r>
+            </m:sub>
+          </m:sSub>
+          <m:r>
+            <w:rPr>
+              <w:rFonts w:ascii="Cambria Math" w:eastAsiaTheme="minorEastAsia" w:hAnsi="Cambria Math"/>
+            </w:rPr>
+            <m:t>cosθ</m:t>
+          </m:r>
+          <m:r>
+            <w:rPr>
+              <w:rFonts w:ascii="Cambria Math" w:eastAsiaTheme="minorEastAsia" w:hAnsi="Cambria Math"/>
+            </w:rPr>
+            <m:t>-</m:t>
+          </m:r>
+          <m:sSub>
+            <m:sSubPr>
+              <m:ctrlPr>
+                <w:rPr>
+                  <w:rFonts w:ascii="Cambria Math" w:eastAsiaTheme="minorEastAsia" w:hAnsi="Cambria Math"/>
+                  <w:i/>
+                </w:rPr>
+              </m:ctrlPr>
+            </m:sSubPr>
+            <m:e>
+              <m:r>
+                <w:rPr>
+                  <w:rFonts w:ascii="Cambria Math" w:eastAsiaTheme="minorEastAsia" w:hAnsi="Cambria Math"/>
+                </w:rPr>
+                <m:t>I</m:t>
+              </m:r>
+            </m:e>
+            <m:sub>
+              <m:r>
+                <w:rPr>
+                  <w:rFonts w:ascii="Cambria Math" w:eastAsiaTheme="minorEastAsia" w:hAnsi="Cambria Math"/>
+                </w:rPr>
+                <m:t>q</m:t>
+              </m:r>
+            </m:sub>
+          </m:sSub>
+          <m:r>
+            <w:rPr>
+              <w:rFonts w:ascii="Cambria Math" w:eastAsiaTheme="minorEastAsia" w:hAnsi="Cambria Math"/>
+            </w:rPr>
+            <m:t>sinθ</m:t>
+          </m:r>
+        </m:oMath>
+      </m:oMathPara>
+    </w:p>
+    <w:p>
+      <w:pPr>
+        <w:rPr>
+          <w:rFonts w:eastAsiaTheme="minorEastAsia"/>
+        </w:rPr>
+      </w:pPr>
+      <m:oMathPara>
+        <m:oMath>
+          <m:sSub>
+            <m:sSubPr>
+              <m:ctrlPr>
+                <w:rPr>
+                  <w:rFonts w:ascii="Cambria Math" w:eastAsiaTheme="minorEastAsia" w:hAnsi="Cambria Math"/>
+                  <w:i/>
+                </w:rPr>
+              </m:ctrlPr>
+            </m:sSubPr>
+            <m:e>
+              <m:r>
+                <w:rPr>
+                  <w:rFonts w:ascii="Cambria Math" w:eastAsiaTheme="minorEastAsia" w:hAnsi="Cambria Math"/>
+                </w:rPr>
+                <m:t>I</m:t>
+              </m:r>
+            </m:e>
+            <m:sub>
+              <m:r>
+                <w:rPr>
+                  <w:rFonts w:ascii="Cambria Math" w:eastAsiaTheme="minorEastAsia" w:hAnsi="Cambria Math"/>
+                </w:rPr>
+                <m:t>β</m:t>
+              </m:r>
+            </m:sub>
+          </m:sSub>
+          <m:r>
+            <w:rPr>
+              <w:rFonts w:ascii="Cambria Math" w:eastAsiaTheme="minorEastAsia" w:hAnsi="Cambria Math"/>
+            </w:rPr>
+            <m:t>=</m:t>
+          </m:r>
+          <m:sSub>
+            <m:sSubPr>
+              <m:ctrlPr>
+                <w:rPr>
+                  <w:rFonts w:ascii="Cambria Math" w:eastAsiaTheme="minorEastAsia" w:hAnsi="Cambria Math"/>
+                  <w:i/>
+                </w:rPr>
+              </m:ctrlPr>
+            </m:sSubPr>
+            <m:e>
+              <m:r>
+                <w:rPr>
+                  <w:rFonts w:ascii="Cambria Math" w:eastAsiaTheme="minorEastAsia" w:hAnsi="Cambria Math"/>
+                </w:rPr>
+                <m:t>I</m:t>
+              </m:r>
+            </m:e>
+            <m:sub>
+              <m:r>
+                <w:rPr>
+                  <w:rFonts w:ascii="Cambria Math" w:eastAsiaTheme="minorEastAsia" w:hAnsi="Cambria Math"/>
+                </w:rPr>
+                <m:t>d</m:t>
+              </m:r>
+            </m:sub>
+          </m:sSub>
+          <m:r>
+            <w:rPr>
+              <w:rFonts w:ascii="Cambria Math" w:eastAsiaTheme="minorEastAsia" w:hAnsi="Cambria Math"/>
+            </w:rPr>
+            <m:t>sinθ+</m:t>
+          </m:r>
+          <m:sSub>
+            <m:sSubPr>
+              <m:ctrlPr>
+                <w:rPr>
+                  <w:rFonts w:ascii="Cambria Math" w:eastAsiaTheme="minorEastAsia" w:hAnsi="Cambria Math"/>
+                  <w:i/>
+                </w:rPr>
+              </m:ctrlPr>
+            </m:sSubPr>
+            <m:e>
+              <m:r>
+                <w:rPr>
+                  <w:rFonts w:ascii="Cambria Math" w:eastAsiaTheme="minorEastAsia" w:hAnsi="Cambria Math"/>
+                </w:rPr>
+                <m:t>I</m:t>
+              </m:r>
+            </m:e>
+            <m:sub>
+              <m:r>
+                <w:rPr>
+                  <w:rFonts w:ascii="Cambria Math" w:eastAsiaTheme="minorEastAsia" w:hAnsi="Cambria Math"/>
+                </w:rPr>
+                <m:t>q</m:t>
+              </m:r>
+            </m:sub>
+          </m:sSub>
+          <m:r>
+            <w:rPr>
+              <w:rFonts w:ascii="Cambria Math" w:eastAsiaTheme="minorEastAsia" w:hAnsi="Cambria Math"/>
+            </w:rPr>
+            <m:t>cosθ</m:t>
+          </m:r>
+        </m:oMath>
+      </m:oMathPara>
+    </w:p>
+    <w:p>
+      <w:pPr>
+        <w:rPr>
+          <w:rFonts w:eastAsiaTheme="minorEastAsia"/>
+        </w:rPr>
+      </w:pPr>
+    </w:p>
+    <w:p>
+      <w:pPr>
+        <w:rPr>
+          <w:rFonts w:eastAsiaTheme="minorEastAsia"/>
+        </w:rPr>
+      </w:pPr>
+      <w:r>
+        <w:rPr>
+          <w:rFonts w:eastAsiaTheme="minorEastAsia"/>
+        </w:rPr>
+        <w:t>Inverse Clarke Transformation</w:t>
+      </w:r>
+    </w:p>
+    <w:p>
+      <w:pPr>
+        <w:rPr>
+          <w:rFonts w:eastAsiaTheme="minorEastAsia"/>
+        </w:rPr>
+      </w:pPr>
+      <m:oMathPara>
+        <m:oMath>
+          <m:r>
+            <w:rPr>
+              <w:rFonts w:ascii="Cambria Math" w:eastAsiaTheme="minorEastAsia" w:hAnsi="Cambria Math"/>
+            </w:rPr>
+            <m:t>a=</m:t>
+          </m:r>
+          <m:r>
+            <w:rPr>
+              <w:rFonts w:ascii="Cambria Math" w:eastAsiaTheme="minorEastAsia" w:hAnsi="Cambria Math"/>
+            </w:rPr>
+            <m:t>α</m:t>
+          </m:r>
+        </m:oMath>
+      </m:oMathPara>
+    </w:p>
+    <w:p>
+      <w:pPr>
+        <w:rPr>
+          <w:rFonts w:eastAsiaTheme="minorEastAsia"/>
+        </w:rPr>
+      </w:pPr>
+      <m:oMathPara>
+        <m:oMath>
+          <m:r>
+            <w:rPr>
+              <w:rFonts w:ascii="Cambria Math" w:eastAsiaTheme="minorEastAsia" w:hAnsi="Cambria Math"/>
+            </w:rPr>
+            <m:t>b=-</m:t>
+          </m:r>
+          <m:f>
+            <m:fPr>
+              <m:ctrlPr>
+                <w:rPr>
+                  <w:rFonts w:ascii="Cambria Math" w:eastAsiaTheme="minorEastAsia" w:hAnsi="Cambria Math"/>
+                  <w:i/>
+                </w:rPr>
+              </m:ctrlPr>
+            </m:fPr>
+            <m:num>
+              <m:r>
+                <w:rPr>
+                  <w:rFonts w:ascii="Cambria Math" w:eastAsiaTheme="minorEastAsia" w:hAnsi="Cambria Math"/>
+                </w:rPr>
+                <m:t>1</m:t>
+              </m:r>
+            </m:num>
+            <m:den>
+              <m:r>
+                <w:rPr>
+                  <w:rFonts w:ascii="Cambria Math" w:eastAsiaTheme="minorEastAsia" w:hAnsi="Cambria Math"/>
+                </w:rPr>
+                <m:t>2</m:t>
+              </m:r>
+            </m:den>
+          </m:f>
+          <m:r>
+            <w:rPr>
+              <w:rFonts w:ascii="Cambria Math" w:eastAsiaTheme="minorEastAsia" w:hAnsi="Cambria Math"/>
+            </w:rPr>
+            <m:t>α</m:t>
+          </m:r>
+          <m:r>
+            <w:rPr>
+              <w:rFonts w:ascii="Cambria Math" w:eastAsiaTheme="minorEastAsia" w:hAnsi="Cambria Math"/>
+            </w:rPr>
+            <m:t>+</m:t>
+          </m:r>
+          <m:f>
+            <m:fPr>
+              <m:ctrlPr>
+                <w:rPr>
+                  <w:rFonts w:ascii="Cambria Math" w:eastAsiaTheme="minorEastAsia" w:hAnsi="Cambria Math"/>
+                  <w:i/>
+                </w:rPr>
+              </m:ctrlPr>
+            </m:fPr>
+            <m:num>
+              <m:rad>
+                <m:radPr>
+                  <m:degHide m:val="1"/>
+                  <m:ctrlPr>
+                    <w:rPr>
+                      <w:rFonts w:ascii="Cambria Math" w:eastAsiaTheme="minorEastAsia" w:hAnsi="Cambria Math"/>
+                      <w:i/>
+                    </w:rPr>
+                  </m:ctrlPr>
+                </m:radPr>
+                <m:deg/>
+                <m:e>
+                  <m:r>
+                    <w:rPr>
+                      <w:rFonts w:ascii="Cambria Math" w:eastAsiaTheme="minorEastAsia" w:hAnsi="Cambria Math"/>
+                    </w:rPr>
+                    <m:t>3</m:t>
+                  </m:r>
+                </m:e>
+              </m:rad>
+            </m:num>
+            <m:den>
+              <m:r>
+                <w:rPr>
+                  <w:rFonts w:ascii="Cambria Math" w:eastAsiaTheme="minorEastAsia" w:hAnsi="Cambria Math"/>
+                </w:rPr>
+                <m:t>2</m:t>
+              </m:r>
+            </m:den>
+          </m:f>
+          <m:r>
+            <w:rPr>
+              <w:rFonts w:ascii="Cambria Math" w:eastAsiaTheme="minorEastAsia" w:hAnsi="Cambria Math"/>
+            </w:rPr>
+            <m:t>β</m:t>
+          </m:r>
+        </m:oMath>
+      </m:oMathPara>
+    </w:p>
+    <w:p>
+      <w:pPr>
+        <w:rPr>
+          <w:rFonts w:eastAsiaTheme="minorEastAsia"/>
+        </w:rPr>
+      </w:pPr>
+      <m:oMathPara>
+        <m:oMath>
+          <m:r>
+            <w:rPr>
+              <w:rFonts w:ascii="Cambria Math" w:eastAsiaTheme="minorEastAsia" w:hAnsi="Cambria Math"/>
+            </w:rPr>
+            <m:t>c=-</m:t>
+          </m:r>
+          <m:f>
+            <m:fPr>
+              <m:ctrlPr>
+                <w:rPr>
+                  <w:rFonts w:ascii="Cambria Math" w:eastAsiaTheme="minorEastAsia" w:hAnsi="Cambria Math"/>
+                  <w:i/>
+                </w:rPr>
+              </m:ctrlPr>
+            </m:fPr>
+            <m:num>
+              <m:r>
+                <w:rPr>
+                  <w:rFonts w:ascii="Cambria Math" w:eastAsiaTheme="minorEastAsia" w:hAnsi="Cambria Math"/>
+                </w:rPr>
+                <m:t>1</m:t>
+              </m:r>
+            </m:num>
+            <m:den>
+              <m:r>
+                <w:rPr>
+                  <w:rFonts w:ascii="Cambria Math" w:eastAsiaTheme="minorEastAsia" w:hAnsi="Cambria Math"/>
+                </w:rPr>
+                <m:t>2</m:t>
+              </m:r>
+            </m:den>
+          </m:f>
+          <m:r>
+            <w:rPr>
+              <w:rFonts w:ascii="Cambria Math" w:eastAsiaTheme="minorEastAsia" w:hAnsi="Cambria Math"/>
+            </w:rPr>
+            <m:t>α</m:t>
+          </m:r>
+          <m:r>
+            <w:rPr>
+              <w:rFonts w:ascii="Cambria Math" w:eastAsiaTheme="minorEastAsia" w:hAnsi="Cambria Math"/>
+            </w:rPr>
+            <m:t>-</m:t>
+          </m:r>
+          <m:f>
+            <m:fPr>
+              <m:ctrlPr>
+                <w:rPr>
+                  <w:rFonts w:ascii="Cambria Math" w:eastAsiaTheme="minorEastAsia" w:hAnsi="Cambria Math"/>
+                  <w:i/>
+                </w:rPr>
+              </m:ctrlPr>
+            </m:fPr>
+            <m:num>
+              <m:rad>
+                <m:radPr>
+                  <m:degHide m:val="1"/>
+                  <m:ctrlPr>
+                    <w:rPr>
+                      <w:rFonts w:ascii="Cambria Math" w:eastAsiaTheme="minorEastAsia" w:hAnsi="Cambria Math"/>
+                      <w:i/>
+                    </w:rPr>
+                  </m:ctrlPr>
+                </m:radPr>
+                <m:deg/>
+                <m:e>
+                  <m:r>
+                    <w:rPr>
+                      <w:rFonts w:ascii="Cambria Math" w:eastAsiaTheme="minorEastAsia" w:hAnsi="Cambria Math"/>
+                    </w:rPr>
+                    <m:t>3</m:t>
+                  </m:r>
+                </m:e>
+              </m:rad>
+            </m:num>
+            <m:den>
+              <m:r>
+                <w:rPr>
+                  <w:rFonts w:ascii="Cambria Math" w:eastAsiaTheme="minorEastAsia" w:hAnsi="Cambria Math"/>
+                </w:rPr>
+                <m:t>2</m:t>
+              </m:r>
+            </m:den>
+          </m:f>
+          <m:r>
+            <w:rPr>
+              <w:rFonts w:ascii="Cambria Math" w:eastAsiaTheme="minorEastAsia" w:hAnsi="Cambria Math"/>
+            </w:rPr>
+            <m:t>β</m:t>
+          </m:r>
+        </m:oMath>
+      </m:oMathPara>
+    </w:p>
+    <w:p>
+      <w:pPr>
+        <w:rPr>
+          <w:rFonts w:eastAsiaTheme="minorEastAsia"/>
+        </w:rPr>
+      </w:pPr>
+    </w:p>
+    <w:p>
+      <w:pPr>
+        <w:rPr>
+          <w:rFonts w:eastAsiaTheme="minorEastAsia"/>
+        </w:rPr>
+      </w:pPr>
+      <w:r>
+        <w:rPr>
+          <w:rFonts w:eastAsiaTheme="minorEastAsia"/>
+        </w:rPr>
+        <w:t>SVPWM</w:t>
+      </w:r>
+    </w:p>
+    <w:p>
+      <w:pPr>
+        <w:rPr>
+          <w:rFonts w:eastAsiaTheme="minorEastAsia"/>
+        </w:rPr>
+      </w:pPr>
+      <m:oMathPara>
+        <m:oMath>
+          <m:sSub>
+            <m:sSubPr>
+              <m:ctrlPr>
+                <w:rPr>
+                  <w:rFonts w:ascii="Cambria Math" w:eastAsiaTheme="minorEastAsia" w:hAnsi="Cambria Math"/>
+                  <w:i/>
+                </w:rPr>
+              </m:ctrlPr>
+            </m:sSubPr>
+            <m:e>
+              <m:r>
+                <w:rPr>
+                  <w:rFonts w:ascii="Cambria Math" w:eastAsiaTheme="minorEastAsia" w:hAnsi="Cambria Math"/>
+                </w:rPr>
+                <m:t>V</m:t>
+              </m:r>
+            </m:e>
+            <m:sub>
+              <m:r>
+                <w:rPr>
+                  <w:rFonts w:ascii="Cambria Math" w:eastAsiaTheme="minorEastAsia" w:hAnsi="Cambria Math"/>
+                </w:rPr>
+                <m:t>ref</m:t>
+              </m:r>
+            </m:sub>
+          </m:sSub>
+          <m:r>
+            <w:rPr>
+              <w:rFonts w:ascii="Cambria Math" w:eastAsiaTheme="minorEastAsia" w:hAnsi="Cambria Math"/>
+            </w:rPr>
+            <m:t>=</m:t>
+          </m:r>
+          <m:rad>
+            <m:radPr>
+              <m:degHide m:val="1"/>
+              <m:ctrlPr>
+                <w:rPr>
+                  <w:rFonts w:ascii="Cambria Math" w:eastAsiaTheme="minorEastAsia" w:hAnsi="Cambria Math"/>
+                  <w:i/>
+                </w:rPr>
+              </m:ctrlPr>
+            </m:radPr>
+            <m:deg/>
+            <m:e>
+              <m:sSup>
+                <m:sSupPr>
+                  <m:ctrlPr>
+                    <w:rPr>
+                      <w:rFonts w:ascii="Cambria Math" w:eastAsiaTheme="minorEastAsia" w:hAnsi="Cambria Math"/>
+                      <w:i/>
+                    </w:rPr>
+                  </m:ctrlPr>
+                </m:sSupPr>
+                <m:e>
+                  <m:sSub>
+                    <m:sSubPr>
+                      <m:ctrlPr>
+                        <w:rPr>
+                          <w:rFonts w:ascii="Cambria Math" w:eastAsiaTheme="minorEastAsia" w:hAnsi="Cambria Math"/>
+                          <w:i/>
+                        </w:rPr>
+                      </m:ctrlPr>
+                    </m:sSubPr>
+                    <m:e>
+                      <m:r>
+                        <w:rPr>
+                          <w:rFonts w:ascii="Cambria Math" w:eastAsiaTheme="minorEastAsia" w:hAnsi="Cambria Math"/>
+                        </w:rPr>
+                        <m:t>V</m:t>
+                      </m:r>
+                    </m:e>
+                    <m:sub>
+                      <m:r>
+                        <w:rPr>
+                          <w:rFonts w:ascii="Cambria Math" w:eastAsiaTheme="minorEastAsia" w:hAnsi="Cambria Math"/>
+                        </w:rPr>
+                        <m:t>α</m:t>
+                      </m:r>
+                    </m:sub>
+                  </m:sSub>
+                </m:e>
+                <m:sup>
+                  <m:r>
+                    <w:rPr>
+                      <w:rFonts w:ascii="Cambria Math" w:eastAsiaTheme="minorEastAsia" w:hAnsi="Cambria Math"/>
+                    </w:rPr>
+                    <m:t>2</m:t>
+                  </m:r>
+                </m:sup>
+              </m:sSup>
+              <m:r>
+                <w:rPr>
+                  <w:rFonts w:ascii="Cambria Math" w:eastAsiaTheme="minorEastAsia" w:hAnsi="Cambria Math"/>
+                </w:rPr>
+                <m:t>+</m:t>
+              </m:r>
+              <m:sSup>
+                <m:sSupPr>
+                  <m:ctrlPr>
+                    <w:rPr>
+                      <w:rFonts w:ascii="Cambria Math" w:eastAsiaTheme="minorEastAsia" w:hAnsi="Cambria Math"/>
+                      <w:i/>
+                    </w:rPr>
+                  </m:ctrlPr>
+                </m:sSupPr>
+                <m:e>
+                  <m:sSub>
+                    <m:sSubPr>
+                      <m:ctrlPr>
+                        <w:rPr>
+                          <w:rFonts w:ascii="Cambria Math" w:eastAsiaTheme="minorEastAsia" w:hAnsi="Cambria Math"/>
+                          <w:i/>
+                        </w:rPr>
+                      </m:ctrlPr>
+                    </m:sSubPr>
+                    <m:e>
+                      <m:r>
+                        <w:rPr>
+                          <w:rFonts w:ascii="Cambria Math" w:eastAsiaTheme="minorEastAsia" w:hAnsi="Cambria Math"/>
+                        </w:rPr>
+                        <m:t>V</m:t>
+                      </m:r>
+                    </m:e>
+                    <m:sub>
+                      <m:r>
+                        <w:rPr>
+                          <w:rFonts w:ascii="Cambria Math" w:eastAsiaTheme="minorEastAsia" w:hAnsi="Cambria Math"/>
+                        </w:rPr>
+                        <m:t>β</m:t>
+                      </m:r>
+                    </m:sub>
+                  </m:sSub>
+                </m:e>
+                <m:sup>
+                  <m:r>
+                    <w:rPr>
+                      <w:rFonts w:ascii="Cambria Math" w:eastAsiaTheme="minorEastAsia" w:hAnsi="Cambria Math"/>
+                    </w:rPr>
+                    <m:t>2</m:t>
+                  </m:r>
+                </m:sup>
+              </m:sSup>
+            </m:e>
+          </m:rad>
+        </m:oMath>
+      </m:oMathPara>
+    </w:p>
+    <w:p>
+      <w:pPr>
+        <w:rPr>
+          <w:rFonts w:eastAsiaTheme="minorEastAsia"/>
+        </w:rPr>
+      </w:pPr>
+      <m:oMathPara>
+        <m:oMath>
+          <m:r>
+            <w:rPr>
+              <w:rFonts w:ascii="Cambria Math" w:eastAsiaTheme="minorEastAsia" w:hAnsi="Cambria Math"/>
+            </w:rPr>
+            <m:t>γ</m:t>
+          </m:r>
+          <m:r>
+            <w:rPr>
+              <w:rFonts w:ascii="Cambria Math" w:eastAsiaTheme="minorEastAsia" w:hAnsi="Cambria Math"/>
+            </w:rPr>
+            <m:t>=</m:t>
+          </m:r>
+          <m:func>
+            <m:funcPr>
+              <m:ctrlPr>
+                <w:rPr>
+                  <w:rFonts w:ascii="Cambria Math" w:eastAsiaTheme="minorEastAsia" w:hAnsi="Cambria Math"/>
+                  <w:i/>
+                </w:rPr>
+              </m:ctrlPr>
+            </m:funcPr>
+            <m:fName>
+              <m:sSup>
+                <m:sSupPr>
+                  <m:ctrlPr>
+                    <w:rPr>
+                      <w:rFonts w:ascii="Cambria Math" w:eastAsiaTheme="minorEastAsia" w:hAnsi="Cambria Math"/>
+                      <w:i/>
+                    </w:rPr>
+                  </m:ctrlPr>
+                </m:sSupPr>
+                <m:e>
+                  <m:r>
+                    <m:rPr>
+                      <m:sty m:val="p"/>
+                    </m:rPr>
+                    <w:rPr>
+                      <w:rFonts w:ascii="Cambria Math" w:hAnsi="Cambria Math"/>
+                    </w:rPr>
+                    <m:t>tan</m:t>
+                  </m:r>
+                </m:e>
+                <m:sup>
+                  <m:r>
+                    <w:rPr>
+                      <w:rFonts w:ascii="Cambria Math" w:hAnsi="Cambria Math"/>
+                    </w:rPr>
+                    <m:t>-1</m:t>
+                  </m:r>
+                </m:sup>
+              </m:sSup>
+            </m:fName>
+            <m:e>
+              <m:f>
+                <m:fPr>
+                  <m:ctrlPr>
+                    <w:rPr>
+                      <w:rFonts w:ascii="Cambria Math" w:eastAsiaTheme="minorEastAsia" w:hAnsi="Cambria Math"/>
+                      <w:i/>
+                    </w:rPr>
+                  </m:ctrlPr>
+                </m:fPr>
+                <m:num>
+                  <m:sSub>
+                    <m:sSubPr>
+                      <m:ctrlPr>
+                        <w:rPr>
+                          <w:rFonts w:ascii="Cambria Math" w:eastAsiaTheme="minorEastAsia" w:hAnsi="Cambria Math"/>
+                          <w:i/>
+                        </w:rPr>
+                      </m:ctrlPr>
+                    </m:sSubPr>
+                    <m:e>
+                      <m:r>
+                        <w:rPr>
+                          <w:rFonts w:ascii="Cambria Math" w:eastAsiaTheme="minorEastAsia" w:hAnsi="Cambria Math"/>
+                        </w:rPr>
+                        <m:t>V</m:t>
+                      </m:r>
+                    </m:e>
+                    <m:sub>
+                      <m:r>
+                        <w:rPr>
+                          <w:rFonts w:ascii="Cambria Math" w:eastAsiaTheme="minorEastAsia" w:hAnsi="Cambria Math"/>
+                        </w:rPr>
+                        <m:t>β</m:t>
+                      </m:r>
+                    </m:sub>
+                  </m:sSub>
+                </m:num>
+                <m:den>
+                  <m:sSub>
+                    <m:sSubPr>
+                      <m:ctrlPr>
+                        <w:rPr>
+                          <w:rFonts w:ascii="Cambria Math" w:eastAsiaTheme="minorEastAsia" w:hAnsi="Cambria Math"/>
+                          <w:i/>
+                        </w:rPr>
+                      </m:ctrlPr>
+                    </m:sSubPr>
+                    <m:e>
+                      <m:r>
+                        <w:rPr>
+                          <w:rFonts w:ascii="Cambria Math" w:eastAsiaTheme="minorEastAsia" w:hAnsi="Cambria Math"/>
+                        </w:rPr>
+                        <m:t>V</m:t>
+                      </m:r>
+                    </m:e>
+                    <m:sub>
+                      <m:r>
+                        <w:rPr>
+                          <w:rFonts w:ascii="Cambria Math" w:eastAsiaTheme="minorEastAsia" w:hAnsi="Cambria Math"/>
+                        </w:rPr>
+                        <m:t>α</m:t>
+                      </m:r>
+                    </m:sub>
+                  </m:sSub>
+                </m:den>
+              </m:f>
+            </m:e>
+          </m:func>
+        </m:oMath>
+      </m:oMathPara>
+    </w:p>
+    <w:p>
+      <w:pPr>
+        <w:rPr>
+          <w:rFonts w:eastAsiaTheme="minorEastAsia"/>
+        </w:rPr>
+      </w:pPr>
+    </w:p>
+    <w:p>
+      <w:pPr>
+        <w:rPr>
+          <w:rFonts w:eastAsiaTheme="minorEastAsia"/>
+        </w:rPr>
+      </w:pPr>
+    </w:p>
+    <w:p>
+      <w:pPr>
+        <w:rPr>
+          <w:rFonts w:eastAsiaTheme="minorEastAsia"/>
+        </w:rPr>
+      </w:pPr>
+    </w:p>
+    <w:p>
+      <w:pPr>
+        <w:rPr>
+          <w:rFonts w:eastAsiaTheme="minorEastAsia"/>
+        </w:rPr>
+      </w:pPr>
+    </w:p>
+    <w:p>
+      <w:pPr>
+        <w:rPr>
+          <w:rFonts w:eastAsiaTheme="minorEastAsia"/>
+        </w:rPr>
+      </w:pPr>
+      <w:r>
+        <w:rPr>
+          <w:rFonts w:eastAsiaTheme="minorEastAsia"/>
+        </w:rPr>
+        <w:lastRenderedPageBreak/>
+        <w:t>Timers T1, T2</w:t>
+      </w:r>
+    </w:p>
+    <w:p>
+      <w:pPr>
+        <w:rPr>
+          <w:rFonts w:eastAsiaTheme="minorEastAsia"/>
+        </w:rPr>
+      </w:pPr>
+      <m:oMathPara>
+        <m:oMath>
+          <m:sSub>
+            <m:sSubPr>
+              <m:ctrlPr>
+                <w:rPr>
+                  <w:rFonts w:ascii="Cambria Math" w:eastAsiaTheme="minorEastAsia" w:hAnsi="Cambria Math"/>
+                  <w:i/>
+                </w:rPr>
+              </m:ctrlPr>
+            </m:sSubPr>
+            <m:e>
+              <m:r>
+                <w:rPr>
+                  <w:rFonts w:ascii="Cambria Math" w:eastAsiaTheme="minorEastAsia" w:hAnsi="Cambria Math"/>
+                </w:rPr>
+                <m:t>T</m:t>
+              </m:r>
+            </m:e>
+            <m:sub>
+              <m:r>
+                <w:rPr>
+                  <w:rFonts w:ascii="Cambria Math" w:eastAsiaTheme="minorEastAsia" w:hAnsi="Cambria Math"/>
+                </w:rPr>
+                <m:t>1</m:t>
+              </m:r>
+            </m:sub>
+          </m:sSub>
+          <m:r>
+            <w:rPr>
+              <w:rFonts w:ascii="Cambria Math" w:eastAsiaTheme="minorEastAsia" w:hAnsi="Cambria Math"/>
+            </w:rPr>
+            <m:t>=</m:t>
+          </m:r>
+          <m:sSub>
+            <m:sSubPr>
+              <m:ctrlPr>
+                <w:rPr>
+                  <w:rFonts w:ascii="Cambria Math" w:eastAsiaTheme="minorEastAsia" w:hAnsi="Cambria Math"/>
+                  <w:i/>
+                </w:rPr>
+              </m:ctrlPr>
+            </m:sSubPr>
+            <m:e>
+              <m:r>
+                <w:rPr>
+                  <w:rFonts w:ascii="Cambria Math" w:eastAsiaTheme="minorEastAsia" w:hAnsi="Cambria Math"/>
+                </w:rPr>
+                <m:t>T</m:t>
+              </m:r>
+            </m:e>
+            <m:sub>
+              <m:r>
+                <w:rPr>
+                  <w:rFonts w:ascii="Cambria Math" w:eastAsiaTheme="minorEastAsia" w:hAnsi="Cambria Math"/>
+                </w:rPr>
+                <m:t>s</m:t>
+              </m:r>
+            </m:sub>
+          </m:sSub>
+          <m:r>
+            <w:rPr>
+              <w:rFonts w:ascii="Cambria Math" w:eastAsiaTheme="minorEastAsia" w:hAnsi="Cambria Math"/>
+            </w:rPr>
+            <m:t>×</m:t>
+          </m:r>
+          <m:rad>
+            <m:radPr>
+              <m:degHide m:val="1"/>
+              <m:ctrlPr>
+                <w:rPr>
+                  <w:rFonts w:ascii="Cambria Math" w:eastAsiaTheme="minorEastAsia" w:hAnsi="Cambria Math"/>
+                  <w:i/>
+                </w:rPr>
+              </m:ctrlPr>
+            </m:radPr>
+            <m:deg/>
+            <m:e>
+              <m:r>
+                <w:rPr>
+                  <w:rFonts w:ascii="Cambria Math" w:eastAsiaTheme="minorEastAsia" w:hAnsi="Cambria Math"/>
+                </w:rPr>
+                <m:t>3</m:t>
+              </m:r>
+            </m:e>
+          </m:rad>
+          <m:f>
+            <m:fPr>
+              <m:ctrlPr>
+                <w:rPr>
+                  <w:rFonts w:ascii="Cambria Math" w:eastAsiaTheme="minorEastAsia" w:hAnsi="Cambria Math"/>
+                  <w:i/>
+                </w:rPr>
+              </m:ctrlPr>
+            </m:fPr>
+            <m:num>
+              <m:sSub>
+                <m:sSubPr>
+                  <m:ctrlPr>
+                    <w:rPr>
+                      <w:rFonts w:ascii="Cambria Math" w:eastAsiaTheme="minorEastAsia" w:hAnsi="Cambria Math"/>
+                      <w:i/>
+                    </w:rPr>
+                  </m:ctrlPr>
+                </m:sSubPr>
+                <m:e>
+                  <m:r>
+                    <w:rPr>
+                      <w:rFonts w:ascii="Cambria Math" w:eastAsiaTheme="minorEastAsia" w:hAnsi="Cambria Math"/>
+                    </w:rPr>
+                    <m:t>V</m:t>
+                  </m:r>
+                </m:e>
+                <m:sub>
+                  <m:r>
+                    <w:rPr>
+                      <w:rFonts w:ascii="Cambria Math" w:eastAsiaTheme="minorEastAsia" w:hAnsi="Cambria Math"/>
+                    </w:rPr>
+                    <m:t>ref</m:t>
+                  </m:r>
+                </m:sub>
+              </m:sSub>
+            </m:num>
+            <m:den>
+              <m:sSub>
+                <m:sSubPr>
+                  <m:ctrlPr>
+                    <w:rPr>
+                      <w:rFonts w:ascii="Cambria Math" w:eastAsiaTheme="minorEastAsia" w:hAnsi="Cambria Math"/>
+                      <w:i/>
+                    </w:rPr>
+                  </m:ctrlPr>
+                </m:sSubPr>
+                <m:e>
+                  <m:r>
+                    <w:rPr>
+                      <w:rFonts w:ascii="Cambria Math" w:eastAsiaTheme="minorEastAsia" w:hAnsi="Cambria Math"/>
+                    </w:rPr>
+                    <m:t>V</m:t>
+                  </m:r>
+                </m:e>
+                <m:sub>
+                  <m:r>
+                    <w:rPr>
+                      <w:rFonts w:ascii="Cambria Math" w:eastAsiaTheme="minorEastAsia" w:hAnsi="Cambria Math"/>
+                    </w:rPr>
+                    <m:t>bus</m:t>
+                  </m:r>
+                </m:sub>
+              </m:sSub>
+            </m:den>
+          </m:f>
+          <m:r>
+            <w:rPr>
+              <w:rFonts w:ascii="Cambria Math" w:eastAsiaTheme="minorEastAsia" w:hAnsi="Cambria Math"/>
+            </w:rPr>
+            <m:t>×</m:t>
+          </m:r>
+          <m:func>
+            <m:funcPr>
+              <m:ctrlPr>
+                <w:rPr>
+                  <w:rFonts w:ascii="Cambria Math" w:eastAsiaTheme="minorEastAsia" w:hAnsi="Cambria Math"/>
+                  <w:i/>
+                </w:rPr>
+              </m:ctrlPr>
+            </m:funcPr>
+            <m:fName>
+              <m:r>
+                <m:rPr>
+                  <m:sty m:val="p"/>
+                </m:rPr>
+                <w:rPr>
+                  <w:rFonts w:ascii="Cambria Math" w:hAnsi="Cambria Math"/>
+                </w:rPr>
+                <m:t>sin</m:t>
+              </m:r>
+            </m:fName>
+            <m:e>
+              <m:r>
+                <w:rPr>
+                  <w:rFonts w:ascii="Cambria Math" w:eastAsiaTheme="minorEastAsia" w:hAnsi="Cambria Math"/>
+                </w:rPr>
+                <m:t>(</m:t>
+              </m:r>
+              <m:f>
+                <m:fPr>
+                  <m:ctrlPr>
+                    <w:rPr>
+                      <w:rFonts w:ascii="Cambria Math" w:eastAsiaTheme="minorEastAsia" w:hAnsi="Cambria Math"/>
+                      <w:i/>
+                    </w:rPr>
+                  </m:ctrlPr>
+                </m:fPr>
+                <m:num>
+                  <m:r>
+                    <w:rPr>
+                      <w:rFonts w:ascii="Cambria Math" w:eastAsiaTheme="minorEastAsia" w:hAnsi="Cambria Math"/>
+                    </w:rPr>
+                    <m:t>π</m:t>
+                  </m:r>
+                </m:num>
+                <m:den>
+                  <m:r>
+                    <w:rPr>
+                      <w:rFonts w:ascii="Cambria Math" w:eastAsiaTheme="minorEastAsia" w:hAnsi="Cambria Math"/>
+                    </w:rPr>
+                    <m:t>3</m:t>
+                  </m:r>
+                </m:den>
+              </m:f>
+              <m:r>
+                <w:rPr>
+                  <w:rFonts w:ascii="Cambria Math" w:eastAsiaTheme="minorEastAsia" w:hAnsi="Cambria Math"/>
+                </w:rPr>
+                <m:t>-γ)</m:t>
+              </m:r>
+            </m:e>
+          </m:func>
+        </m:oMath>
+      </m:oMathPara>
+    </w:p>
+    <w:p>
+      <w:pPr>
+        <w:rPr>
+          <w:rFonts w:eastAsiaTheme="minorEastAsia"/>
+        </w:rPr>
+      </w:pPr>
+      <m:oMathPara>
+        <m:oMath>
+          <m:sSub>
+            <m:sSubPr>
+              <m:ctrlPr>
+                <w:rPr>
+                  <w:rFonts w:ascii="Cambria Math" w:eastAsiaTheme="minorEastAsia" w:hAnsi="Cambria Math"/>
+                  <w:i/>
+                </w:rPr>
+              </m:ctrlPr>
+            </m:sSubPr>
+            <m:e>
+              <m:r>
+                <w:rPr>
+                  <w:rFonts w:ascii="Cambria Math" w:eastAsiaTheme="minorEastAsia" w:hAnsi="Cambria Math"/>
+                </w:rPr>
+                <m:t>T</m:t>
+              </m:r>
+            </m:e>
+            <m:sub>
+              <m:r>
+                <w:rPr>
+                  <w:rFonts w:ascii="Cambria Math" w:eastAsiaTheme="minorEastAsia" w:hAnsi="Cambria Math"/>
+                </w:rPr>
+                <m:t>2</m:t>
+              </m:r>
+            </m:sub>
+          </m:sSub>
+          <m:r>
+            <w:rPr>
+              <w:rFonts w:ascii="Cambria Math" w:eastAsiaTheme="minorEastAsia" w:hAnsi="Cambria Math"/>
+            </w:rPr>
+            <m:t>=</m:t>
+          </m:r>
+          <m:sSub>
+            <m:sSubPr>
+              <m:ctrlPr>
+                <w:rPr>
+                  <w:rFonts w:ascii="Cambria Math" w:eastAsiaTheme="minorEastAsia" w:hAnsi="Cambria Math"/>
+                  <w:i/>
+                </w:rPr>
+              </m:ctrlPr>
+            </m:sSubPr>
+            <m:e>
+              <m:r>
+                <w:rPr>
+                  <w:rFonts w:ascii="Cambria Math" w:eastAsiaTheme="minorEastAsia" w:hAnsi="Cambria Math"/>
+                </w:rPr>
+                <m:t>T</m:t>
+              </m:r>
+            </m:e>
+            <m:sub>
+              <m:r>
+                <w:rPr>
+                  <w:rFonts w:ascii="Cambria Math" w:eastAsiaTheme="minorEastAsia" w:hAnsi="Cambria Math"/>
+                </w:rPr>
+                <m:t>s</m:t>
+              </m:r>
+            </m:sub>
+          </m:sSub>
+          <m:r>
+            <w:rPr>
+              <w:rFonts w:ascii="Cambria Math" w:eastAsiaTheme="minorEastAsia" w:hAnsi="Cambria Math"/>
+            </w:rPr>
+            <m:t>×</m:t>
+          </m:r>
+          <m:rad>
+            <m:radPr>
+              <m:degHide m:val="1"/>
+              <m:ctrlPr>
+                <w:rPr>
+                  <w:rFonts w:ascii="Cambria Math" w:eastAsiaTheme="minorEastAsia" w:hAnsi="Cambria Math"/>
+                  <w:i/>
+                </w:rPr>
+              </m:ctrlPr>
+            </m:radPr>
+            <m:deg/>
+            <m:e>
+              <m:r>
+                <w:rPr>
+                  <w:rFonts w:ascii="Cambria Math" w:eastAsiaTheme="minorEastAsia" w:hAnsi="Cambria Math"/>
+                </w:rPr>
+                <m:t>3</m:t>
+              </m:r>
+            </m:e>
+          </m:rad>
+          <m:f>
+            <m:fPr>
+              <m:ctrlPr>
+                <w:rPr>
+                  <w:rFonts w:ascii="Cambria Math" w:eastAsiaTheme="minorEastAsia" w:hAnsi="Cambria Math"/>
+                  <w:i/>
+                </w:rPr>
+              </m:ctrlPr>
+            </m:fPr>
+            <m:num>
+              <m:sSub>
+                <m:sSubPr>
+                  <m:ctrlPr>
+                    <w:rPr>
+                      <w:rFonts w:ascii="Cambria Math" w:eastAsiaTheme="minorEastAsia" w:hAnsi="Cambria Math"/>
+                      <w:i/>
+                    </w:rPr>
+                  </m:ctrlPr>
+                </m:sSubPr>
+                <m:e>
+                  <m:r>
+                    <w:rPr>
+                      <w:rFonts w:ascii="Cambria Math" w:eastAsiaTheme="minorEastAsia" w:hAnsi="Cambria Math"/>
+                    </w:rPr>
+                    <m:t>V</m:t>
+                  </m:r>
+                </m:e>
+                <m:sub>
+                  <m:r>
+                    <w:rPr>
+                      <w:rFonts w:ascii="Cambria Math" w:eastAsiaTheme="minorEastAsia" w:hAnsi="Cambria Math"/>
+                    </w:rPr>
+                    <m:t>ref</m:t>
+                  </m:r>
+                </m:sub>
+              </m:sSub>
+            </m:num>
+            <m:den>
+              <m:sSub>
+                <m:sSubPr>
+                  <m:ctrlPr>
+                    <w:rPr>
+                      <w:rFonts w:ascii="Cambria Math" w:eastAsiaTheme="minorEastAsia" w:hAnsi="Cambria Math"/>
+                      <w:i/>
+                    </w:rPr>
+                  </m:ctrlPr>
+                </m:sSubPr>
+                <m:e>
+                  <m:r>
+                    <w:rPr>
+                      <w:rFonts w:ascii="Cambria Math" w:eastAsiaTheme="minorEastAsia" w:hAnsi="Cambria Math"/>
+                    </w:rPr>
+                    <m:t>V</m:t>
+                  </m:r>
+                </m:e>
+                <m:sub>
+                  <m:r>
+                    <w:rPr>
+                      <w:rFonts w:ascii="Cambria Math" w:eastAsiaTheme="minorEastAsia" w:hAnsi="Cambria Math"/>
+                    </w:rPr>
+                    <m:t>bus</m:t>
+                  </m:r>
+                </m:sub>
+              </m:sSub>
+            </m:den>
+          </m:f>
+          <m:r>
+            <w:rPr>
+              <w:rFonts w:ascii="Cambria Math" w:eastAsiaTheme="minorEastAsia" w:hAnsi="Cambria Math"/>
+            </w:rPr>
+            <m:t>×</m:t>
+          </m:r>
+          <m:func>
+            <m:funcPr>
+              <m:ctrlPr>
+                <w:rPr>
+                  <w:rFonts w:ascii="Cambria Math" w:eastAsiaTheme="minorEastAsia" w:hAnsi="Cambria Math"/>
+                  <w:i/>
+                </w:rPr>
+              </m:ctrlPr>
+            </m:funcPr>
+            <m:fName>
+              <m:r>
+                <m:rPr>
+                  <m:sty m:val="p"/>
+                </m:rPr>
+                <w:rPr>
+                  <w:rFonts w:ascii="Cambria Math" w:hAnsi="Cambria Math"/>
+                </w:rPr>
+                <m:t>sin</m:t>
+              </m:r>
+            </m:fName>
+            <m:e>
+              <m:r>
+                <w:rPr>
+                  <w:rFonts w:ascii="Cambria Math" w:eastAsiaTheme="minorEastAsia" w:hAnsi="Cambria Math"/>
+                </w:rPr>
+                <m:t>(γ)</m:t>
+              </m:r>
+            </m:e>
+          </m:func>
+        </m:oMath>
+      </m:oMathPara>
+    </w:p>
+    <w:p>
+      <w:pPr>
+        <w:rPr>
+          <w:rFonts w:eastAsiaTheme="minorEastAsia"/>
+        </w:rPr>
+      </w:pPr>
+    </w:p>
+    <w:p>
+      <w:pPr>
+        <w:rPr>
+          <w:rFonts w:eastAsiaTheme="minorEastAsia"/>
+        </w:rPr>
+      </w:pPr>
+      <w:r>
+        <w:rPr>
+          <w:rFonts w:eastAsiaTheme="minorEastAsia"/>
+        </w:rPr>
+        <w:t xml:space="preserve">Sector 1 </w:t>
+      </w:r>
+    </w:p>
+    <w:p>
+      <w:pPr>
+        <w:rPr>
+          <w:rFonts w:eastAsiaTheme="minorEastAsia"/>
+        </w:rPr>
+      </w:pPr>
+      <m:oMathPara>
+        <m:oMath>
+          <m:sSub>
+            <m:sSubPr>
+              <m:ctrlPr>
+                <w:rPr>
+                  <w:rFonts w:ascii="Cambria Math" w:eastAsiaTheme="minorEastAsia" w:hAnsi="Cambria Math"/>
+                  <w:i/>
+                </w:rPr>
+              </m:ctrlPr>
+            </m:sSubPr>
+            <m:e>
+              <m:r>
+                <w:rPr>
+                  <w:rFonts w:ascii="Cambria Math" w:eastAsiaTheme="minorEastAsia" w:hAnsi="Cambria Math"/>
+                </w:rPr>
+                <m:t>T</m:t>
+              </m:r>
+            </m:e>
+            <m:sub>
+              <m:r>
+                <w:rPr>
+                  <w:rFonts w:ascii="Cambria Math" w:eastAsiaTheme="minorEastAsia" w:hAnsi="Cambria Math"/>
+                </w:rPr>
+                <m:t>z</m:t>
+              </m:r>
+            </m:sub>
+          </m:sSub>
+          <m:r>
+            <w:rPr>
+              <w:rFonts w:ascii="Cambria Math" w:eastAsiaTheme="minorEastAsia" w:hAnsi="Cambria Math"/>
+            </w:rPr>
+            <m:t>=</m:t>
+          </m:r>
+          <m:f>
+            <m:fPr>
+              <m:ctrlPr>
+                <w:rPr>
+                  <w:rFonts w:ascii="Cambria Math" w:eastAsiaTheme="minorEastAsia" w:hAnsi="Cambria Math"/>
+                  <w:i/>
+                </w:rPr>
+              </m:ctrlPr>
+            </m:fPr>
+            <m:num>
+              <m:sSub>
+                <m:sSubPr>
+                  <m:ctrlPr>
+                    <w:rPr>
+                      <w:rFonts w:ascii="Cambria Math" w:eastAsiaTheme="minorEastAsia" w:hAnsi="Cambria Math"/>
+                      <w:i/>
+                    </w:rPr>
+                  </m:ctrlPr>
+                </m:sSubPr>
+                <m:e>
+                  <m:r>
+                    <w:rPr>
+                      <w:rFonts w:ascii="Cambria Math" w:eastAsiaTheme="minorEastAsia" w:hAnsi="Cambria Math"/>
+                    </w:rPr>
+                    <m:t>T</m:t>
+                  </m:r>
+                </m:e>
+                <m:sub>
+                  <m:r>
+                    <w:rPr>
+                      <w:rFonts w:ascii="Cambria Math" w:eastAsiaTheme="minorEastAsia" w:hAnsi="Cambria Math"/>
+                    </w:rPr>
+                    <m:t>0</m:t>
+                  </m:r>
+                </m:sub>
+              </m:sSub>
+            </m:num>
+            <m:den>
+              <m:r>
+                <w:rPr>
+                  <w:rFonts w:ascii="Cambria Math" w:eastAsiaTheme="minorEastAsia" w:hAnsi="Cambria Math"/>
+                </w:rPr>
+                <m:t>2</m:t>
+              </m:r>
+            </m:den>
+          </m:f>
+        </m:oMath>
+      </m:oMathPara>
+    </w:p>
+    <w:p>
+      <w:pPr>
+        <w:rPr>
+          <w:rFonts w:eastAsiaTheme="minorEastAsia"/>
+        </w:rPr>
+      </w:pPr>
+      <m:oMathPara>
+        <m:oMath>
+          <m:sSub>
+            <m:sSubPr>
+              <m:ctrlPr>
+                <w:rPr>
+                  <w:rFonts w:ascii="Cambria Math" w:eastAsiaTheme="minorEastAsia" w:hAnsi="Cambria Math"/>
+                  <w:i/>
+                </w:rPr>
+              </m:ctrlPr>
+            </m:sSubPr>
+            <m:e>
+              <m:r>
+                <w:rPr>
+                  <w:rFonts w:ascii="Cambria Math" w:eastAsiaTheme="minorEastAsia" w:hAnsi="Cambria Math"/>
+                </w:rPr>
+                <m:t>T</m:t>
+              </m:r>
+            </m:e>
+            <m:sub>
+              <m:r>
+                <w:rPr>
+                  <w:rFonts w:ascii="Cambria Math" w:eastAsiaTheme="minorEastAsia" w:hAnsi="Cambria Math"/>
+                </w:rPr>
+                <m:t>X</m:t>
+              </m:r>
+            </m:sub>
+          </m:sSub>
+          <m:r>
+            <w:rPr>
+              <w:rFonts w:ascii="Cambria Math" w:eastAsiaTheme="minorEastAsia" w:hAnsi="Cambria Math"/>
+            </w:rPr>
+            <m:t>=</m:t>
+          </m:r>
+          <m:sSub>
+            <m:sSubPr>
+              <m:ctrlPr>
+                <w:rPr>
+                  <w:rFonts w:ascii="Cambria Math" w:eastAsiaTheme="minorEastAsia" w:hAnsi="Cambria Math"/>
+                  <w:i/>
+                </w:rPr>
+              </m:ctrlPr>
+            </m:sSubPr>
+            <m:e>
+              <m:r>
+                <w:rPr>
+                  <w:rFonts w:ascii="Cambria Math" w:eastAsiaTheme="minorEastAsia" w:hAnsi="Cambria Math"/>
+                </w:rPr>
+                <m:t>T</m:t>
+              </m:r>
+            </m:e>
+            <m:sub>
+              <m:r>
+                <w:rPr>
+                  <w:rFonts w:ascii="Cambria Math" w:eastAsiaTheme="minorEastAsia" w:hAnsi="Cambria Math"/>
+                </w:rPr>
+                <m:t>1</m:t>
+              </m:r>
+            </m:sub>
+          </m:sSub>
+          <m:r>
+            <w:rPr>
+              <w:rFonts w:ascii="Cambria Math" w:eastAsiaTheme="minorEastAsia" w:hAnsi="Cambria Math"/>
+            </w:rPr>
+            <m:t>+</m:t>
+          </m:r>
+          <m:sSub>
+            <m:sSubPr>
+              <m:ctrlPr>
+                <w:rPr>
+                  <w:rFonts w:ascii="Cambria Math" w:eastAsiaTheme="minorEastAsia" w:hAnsi="Cambria Math"/>
+                  <w:i/>
+                </w:rPr>
+              </m:ctrlPr>
+            </m:sSubPr>
+            <m:e>
+              <m:r>
+                <w:rPr>
+                  <w:rFonts w:ascii="Cambria Math" w:eastAsiaTheme="minorEastAsia" w:hAnsi="Cambria Math"/>
+                </w:rPr>
+                <m:t>T</m:t>
+              </m:r>
+            </m:e>
+            <m:sub>
+              <m:r>
+                <w:rPr>
+                  <w:rFonts w:ascii="Cambria Math" w:eastAsiaTheme="minorEastAsia" w:hAnsi="Cambria Math"/>
+                </w:rPr>
+                <m:t>Z</m:t>
+              </m:r>
+            </m:sub>
+          </m:sSub>
+        </m:oMath>
+      </m:oMathPara>
+    </w:p>
+    <w:p>
+      <w:pPr>
+        <w:rPr>
+          <w:rFonts w:eastAsiaTheme="minorEastAsia"/>
+        </w:rPr>
+      </w:pPr>
+      <m:oMathPara>
+        <m:oMath>
+          <m:sSub>
+            <m:sSubPr>
+              <m:ctrlPr>
+                <w:rPr>
+                  <w:rFonts w:ascii="Cambria Math" w:eastAsiaTheme="minorEastAsia" w:hAnsi="Cambria Math"/>
+                  <w:i/>
+                </w:rPr>
+              </m:ctrlPr>
+            </m:sSubPr>
+            <m:e>
+              <m:r>
+                <w:rPr>
+                  <w:rFonts w:ascii="Cambria Math" w:eastAsiaTheme="minorEastAsia" w:hAnsi="Cambria Math"/>
+                </w:rPr>
+                <m:t>T</m:t>
+              </m:r>
+            </m:e>
+            <m:sub>
+              <m:r>
+                <w:rPr>
+                  <w:rFonts w:ascii="Cambria Math" w:eastAsiaTheme="minorEastAsia" w:hAnsi="Cambria Math"/>
+                </w:rPr>
+                <m:t>Y</m:t>
+              </m:r>
+            </m:sub>
+          </m:sSub>
+          <m:r>
+            <w:rPr>
+              <w:rFonts w:ascii="Cambria Math" w:eastAsiaTheme="minorEastAsia" w:hAnsi="Cambria Math"/>
+            </w:rPr>
+            <m:t>=</m:t>
+          </m:r>
+          <m:sSub>
+            <m:sSubPr>
+              <m:ctrlPr>
+                <w:rPr>
+                  <w:rFonts w:ascii="Cambria Math" w:eastAsiaTheme="minorEastAsia" w:hAnsi="Cambria Math"/>
+                  <w:i/>
+                </w:rPr>
+              </m:ctrlPr>
+            </m:sSubPr>
+            <m:e>
+              <m:r>
+                <w:rPr>
+                  <w:rFonts w:ascii="Cambria Math" w:eastAsiaTheme="minorEastAsia" w:hAnsi="Cambria Math"/>
+                </w:rPr>
+                <m:t>T</m:t>
+              </m:r>
+            </m:e>
+            <m:sub>
+              <m:r>
+                <w:rPr>
+                  <w:rFonts w:ascii="Cambria Math" w:eastAsiaTheme="minorEastAsia" w:hAnsi="Cambria Math"/>
+                </w:rPr>
+                <m:t>2</m:t>
+              </m:r>
+            </m:sub>
+          </m:sSub>
+          <m:r>
+            <w:rPr>
+              <w:rFonts w:ascii="Cambria Math" w:eastAsiaTheme="minorEastAsia" w:hAnsi="Cambria Math"/>
+            </w:rPr>
+            <m:t>+</m:t>
+          </m:r>
+          <m:sSub>
+            <m:sSubPr>
+              <m:ctrlPr>
+                <w:rPr>
+                  <w:rFonts w:ascii="Cambria Math" w:eastAsiaTheme="minorEastAsia" w:hAnsi="Cambria Math"/>
+                  <w:i/>
+                </w:rPr>
+              </m:ctrlPr>
+            </m:sSubPr>
+            <m:e>
+              <m:r>
+                <w:rPr>
+                  <w:rFonts w:ascii="Cambria Math" w:eastAsiaTheme="minorEastAsia" w:hAnsi="Cambria Math"/>
+                </w:rPr>
+                <m:t>T</m:t>
+              </m:r>
+            </m:e>
+            <m:sub>
+              <m:r>
+                <w:rPr>
+                  <w:rFonts w:ascii="Cambria Math" w:eastAsiaTheme="minorEastAsia" w:hAnsi="Cambria Math"/>
+                </w:rPr>
+                <m:t>Z</m:t>
+              </m:r>
+            </m:sub>
+          </m:sSub>
+        </m:oMath>
+      </m:oMathPara>
+    </w:p>
+    <w:p>
+      <w:pPr>
+        <w:rPr>
+          <w:rFonts w:eastAsiaTheme="minorEastAsia"/>
+        </w:rPr>
+      </w:pPr>
+      <m:oMathPara>
+        <m:oMath>
+          <m:sSub>
+            <m:sSubPr>
+              <m:ctrlPr>
+                <w:rPr>
+                  <w:rFonts w:ascii="Cambria Math" w:eastAsiaTheme="minorEastAsia" w:hAnsi="Cambria Math"/>
+                  <w:i/>
+                </w:rPr>
+              </m:ctrlPr>
+            </m:sSubPr>
+            <m:e>
+              <m:r>
+                <w:rPr>
+                  <w:rFonts w:ascii="Cambria Math" w:eastAsiaTheme="minorEastAsia" w:hAnsi="Cambria Math"/>
+                </w:rPr>
+                <m:t>T</m:t>
+              </m:r>
+            </m:e>
+            <m:sub>
+              <m:r>
+                <w:rPr>
+                  <w:rFonts w:ascii="Cambria Math" w:eastAsiaTheme="minorEastAsia" w:hAnsi="Cambria Math"/>
+                </w:rPr>
+                <m:t>W</m:t>
+              </m:r>
+            </m:sub>
+          </m:sSub>
+          <m:r>
+            <w:rPr>
+              <w:rFonts w:ascii="Cambria Math" w:eastAsiaTheme="minorEastAsia" w:hAnsi="Cambria Math"/>
+            </w:rPr>
+            <m:t>=</m:t>
+          </m:r>
+          <m:sSub>
+            <m:sSubPr>
+              <m:ctrlPr>
+                <w:rPr>
+                  <w:rFonts w:ascii="Cambria Math" w:eastAsiaTheme="minorEastAsia" w:hAnsi="Cambria Math"/>
+                  <w:i/>
+                </w:rPr>
+              </m:ctrlPr>
+            </m:sSubPr>
+            <m:e>
+              <m:r>
+                <w:rPr>
+                  <w:rFonts w:ascii="Cambria Math" w:eastAsiaTheme="minorEastAsia" w:hAnsi="Cambria Math"/>
+                </w:rPr>
+                <m:t>T</m:t>
+              </m:r>
+            </m:e>
+            <m:sub>
+              <m:r>
+                <w:rPr>
+                  <w:rFonts w:ascii="Cambria Math" w:eastAsiaTheme="minorEastAsia" w:hAnsi="Cambria Math"/>
+                </w:rPr>
+                <m:t>1</m:t>
+              </m:r>
+            </m:sub>
+          </m:sSub>
+          <m:r>
+            <w:rPr>
+              <w:rFonts w:ascii="Cambria Math" w:eastAsiaTheme="minorEastAsia" w:hAnsi="Cambria Math"/>
+            </w:rPr>
+            <m:t>+</m:t>
+          </m:r>
+          <m:sSub>
+            <m:sSubPr>
+              <m:ctrlPr>
+                <w:rPr>
+                  <w:rFonts w:ascii="Cambria Math" w:eastAsiaTheme="minorEastAsia" w:hAnsi="Cambria Math"/>
+                  <w:i/>
+                </w:rPr>
+              </m:ctrlPr>
+            </m:sSubPr>
+            <m:e>
+              <m:r>
+                <w:rPr>
+                  <w:rFonts w:ascii="Cambria Math" w:eastAsiaTheme="minorEastAsia" w:hAnsi="Cambria Math"/>
+                </w:rPr>
+                <m:t>T</m:t>
+              </m:r>
+            </m:e>
+            <m:sub>
+              <m:r>
+                <w:rPr>
+                  <w:rFonts w:ascii="Cambria Math" w:eastAsiaTheme="minorEastAsia" w:hAnsi="Cambria Math"/>
+                </w:rPr>
+                <m:t>2</m:t>
+              </m:r>
+            </m:sub>
+          </m:sSub>
+          <m:r>
+            <w:rPr>
+              <w:rFonts w:ascii="Cambria Math" w:eastAsiaTheme="minorEastAsia" w:hAnsi="Cambria Math"/>
+            </w:rPr>
+            <m:t>+</m:t>
+          </m:r>
+          <m:sSub>
+            <m:sSubPr>
+              <m:ctrlPr>
+                <w:rPr>
+                  <w:rFonts w:ascii="Cambria Math" w:eastAsiaTheme="minorEastAsia" w:hAnsi="Cambria Math"/>
+                  <w:i/>
+                </w:rPr>
+              </m:ctrlPr>
+            </m:sSubPr>
+            <m:e>
+              <m:r>
+                <w:rPr>
+                  <w:rFonts w:ascii="Cambria Math" w:eastAsiaTheme="minorEastAsia" w:hAnsi="Cambria Math"/>
+                </w:rPr>
+                <m:t>T</m:t>
+              </m:r>
+            </m:e>
+            <m:sub>
+              <m:r>
+                <w:rPr>
+                  <w:rFonts w:ascii="Cambria Math" w:eastAsiaTheme="minorEastAsia" w:hAnsi="Cambria Math"/>
+                </w:rPr>
+                <m:t>Z</m:t>
+              </m:r>
+            </m:sub>
+          </m:sSub>
+        </m:oMath>
+      </m:oMathPara>
+    </w:p>
+    <w:p>
+      <w:pPr>
+        <w:rPr>
+          <w:rFonts w:eastAsiaTheme="minorEastAsia"/>
+        </w:rPr>
+      </w:pPr>
+    </w:p>
+    <w:p>
+      <w:pPr>
+        <w:rPr>
+          <w:rFonts w:eastAsiaTheme="minorEastAsia"/>
+        </w:rPr>
+      </w:pPr>
+      <m:oMathPara>
+        <m:oMath>
+          <m:sSub>
+            <m:sSubPr>
+              <m:ctrlPr>
+                <w:rPr>
+                  <w:rFonts w:ascii="Cambria Math" w:eastAsiaTheme="minorEastAsia" w:hAnsi="Cambria Math"/>
+                  <w:i/>
+                </w:rPr>
+              </m:ctrlPr>
+            </m:sSubPr>
+            <m:e>
+              <m:r>
+                <w:rPr>
+                  <w:rFonts w:ascii="Cambria Math" w:eastAsiaTheme="minorEastAsia" w:hAnsi="Cambria Math"/>
+                </w:rPr>
+                <m:t>D</m:t>
+              </m:r>
+            </m:e>
+            <m:sub>
+              <m:r>
+                <w:rPr>
+                  <w:rFonts w:ascii="Cambria Math" w:eastAsiaTheme="minorEastAsia" w:hAnsi="Cambria Math"/>
+                </w:rPr>
+                <m:t>A</m:t>
+              </m:r>
+            </m:sub>
+          </m:sSub>
+          <m:r>
+            <w:rPr>
+              <w:rFonts w:ascii="Cambria Math" w:eastAsiaTheme="minorEastAsia" w:hAnsi="Cambria Math"/>
+            </w:rPr>
+            <m:t>=</m:t>
+          </m:r>
+          <m:f>
+            <m:fPr>
+              <m:ctrlPr>
+                <w:rPr>
+                  <w:rFonts w:ascii="Cambria Math" w:eastAsiaTheme="minorEastAsia" w:hAnsi="Cambria Math"/>
+                  <w:i/>
+                </w:rPr>
+              </m:ctrlPr>
+            </m:fPr>
+            <m:num>
+              <m:sSub>
+                <m:sSubPr>
+                  <m:ctrlPr>
+                    <w:rPr>
+                      <w:rFonts w:ascii="Cambria Math" w:eastAsiaTheme="minorEastAsia" w:hAnsi="Cambria Math"/>
+                      <w:i/>
+                    </w:rPr>
+                  </m:ctrlPr>
+                </m:sSubPr>
+                <m:e>
+                  <m:r>
+                    <w:rPr>
+                      <w:rFonts w:ascii="Cambria Math" w:eastAsiaTheme="minorEastAsia" w:hAnsi="Cambria Math"/>
+                    </w:rPr>
+                    <m:t>T</m:t>
+                  </m:r>
+                </m:e>
+                <m:sub>
+                  <m:r>
+                    <w:rPr>
+                      <w:rFonts w:ascii="Cambria Math" w:eastAsiaTheme="minorEastAsia" w:hAnsi="Cambria Math"/>
+                    </w:rPr>
+                    <m:t>A</m:t>
+                  </m:r>
+                </m:sub>
+              </m:sSub>
+            </m:num>
+            <m:den>
+              <m:sSub>
+                <m:sSubPr>
+                  <m:ctrlPr>
+                    <w:rPr>
+                      <w:rFonts w:ascii="Cambria Math" w:eastAsiaTheme="minorEastAsia" w:hAnsi="Cambria Math"/>
+                      <w:i/>
+                    </w:rPr>
+                  </m:ctrlPr>
+                </m:sSubPr>
+                <m:e>
+                  <m:r>
+                    <w:rPr>
+                      <w:rFonts w:ascii="Cambria Math" w:eastAsiaTheme="minorEastAsia" w:hAnsi="Cambria Math"/>
+                    </w:rPr>
+                    <m:t>T</m:t>
+                  </m:r>
+                </m:e>
+                <m:sub>
+                  <m:r>
+                    <w:rPr>
+                      <w:rFonts w:ascii="Cambria Math" w:eastAsiaTheme="minorEastAsia" w:hAnsi="Cambria Math"/>
+                    </w:rPr>
+                    <m:t>s</m:t>
+                  </m:r>
+                </m:sub>
+              </m:sSub>
+            </m:den>
+          </m:f>
+          <m:r>
+            <w:rPr>
+              <w:rFonts w:ascii="Cambria Math" w:eastAsiaTheme="minorEastAsia" w:hAnsi="Cambria Math"/>
+            </w:rPr>
+            <m:t xml:space="preserve">, </m:t>
+          </m:r>
+          <m:sSub>
+            <m:sSubPr>
+              <m:ctrlPr>
+                <w:rPr>
+                  <w:rFonts w:ascii="Cambria Math" w:eastAsiaTheme="minorEastAsia" w:hAnsi="Cambria Math"/>
+                  <w:i/>
+                </w:rPr>
+              </m:ctrlPr>
+            </m:sSubPr>
+            <m:e>
+              <m:r>
+                <w:rPr>
+                  <w:rFonts w:ascii="Cambria Math" w:eastAsiaTheme="minorEastAsia" w:hAnsi="Cambria Math"/>
+                </w:rPr>
+                <m:t>D</m:t>
+              </m:r>
+            </m:e>
+            <m:sub>
+              <m:r>
+                <w:rPr>
+                  <w:rFonts w:ascii="Cambria Math" w:eastAsiaTheme="minorEastAsia" w:hAnsi="Cambria Math"/>
+                </w:rPr>
+                <m:t>B</m:t>
+              </m:r>
+            </m:sub>
+          </m:sSub>
+          <m:r>
+            <w:rPr>
+              <w:rFonts w:ascii="Cambria Math" w:eastAsiaTheme="minorEastAsia" w:hAnsi="Cambria Math"/>
+            </w:rPr>
+            <m:t>=</m:t>
+          </m:r>
+          <m:f>
+            <m:fPr>
+              <m:ctrlPr>
+                <w:rPr>
+                  <w:rFonts w:ascii="Cambria Math" w:eastAsiaTheme="minorEastAsia" w:hAnsi="Cambria Math"/>
+                  <w:i/>
+                </w:rPr>
+              </m:ctrlPr>
+            </m:fPr>
+            <m:num>
+              <m:sSub>
+                <m:sSubPr>
+                  <m:ctrlPr>
+                    <w:rPr>
+                      <w:rFonts w:ascii="Cambria Math" w:eastAsiaTheme="minorEastAsia" w:hAnsi="Cambria Math"/>
+                      <w:i/>
+                    </w:rPr>
+                  </m:ctrlPr>
+                </m:sSubPr>
+                <m:e>
+                  <m:r>
+                    <w:rPr>
+                      <w:rFonts w:ascii="Cambria Math" w:eastAsiaTheme="minorEastAsia" w:hAnsi="Cambria Math"/>
+                    </w:rPr>
+                    <m:t>T</m:t>
+                  </m:r>
+                </m:e>
+                <m:sub>
+                  <m:r>
+                    <w:rPr>
+                      <w:rFonts w:ascii="Cambria Math" w:eastAsiaTheme="minorEastAsia" w:hAnsi="Cambria Math"/>
+                    </w:rPr>
+                    <m:t>B</m:t>
+                  </m:r>
+                </m:sub>
+              </m:sSub>
+            </m:num>
+            <m:den>
+              <m:sSub>
+                <m:sSubPr>
+                  <m:ctrlPr>
+                    <w:rPr>
+                      <w:rFonts w:ascii="Cambria Math" w:eastAsiaTheme="minorEastAsia" w:hAnsi="Cambria Math"/>
+                      <w:i/>
+                    </w:rPr>
+                  </m:ctrlPr>
+                </m:sSubPr>
+                <m:e>
+                  <m:r>
+                    <w:rPr>
+                      <w:rFonts w:ascii="Cambria Math" w:eastAsiaTheme="minorEastAsia" w:hAnsi="Cambria Math"/>
+                    </w:rPr>
+                    <m:t>T</m:t>
+                  </m:r>
+                </m:e>
+                <m:sub>
+                  <m:r>
+                    <w:rPr>
+                      <w:rFonts w:ascii="Cambria Math" w:eastAsiaTheme="minorEastAsia" w:hAnsi="Cambria Math"/>
+                    </w:rPr>
+                    <m:t>s</m:t>
+                  </m:r>
+                </m:sub>
+              </m:sSub>
+            </m:den>
+          </m:f>
+          <m:r>
+            <w:rPr>
+              <w:rFonts w:ascii="Cambria Math" w:eastAsiaTheme="minorEastAsia" w:hAnsi="Cambria Math"/>
+            </w:rPr>
+            <m:t xml:space="preserve">, </m:t>
+          </m:r>
+          <m:sSub>
+            <m:sSubPr>
+              <m:ctrlPr>
+                <w:rPr>
+                  <w:rFonts w:ascii="Cambria Math" w:eastAsiaTheme="minorEastAsia" w:hAnsi="Cambria Math"/>
+                  <w:i/>
+                </w:rPr>
+              </m:ctrlPr>
+            </m:sSubPr>
+            <m:e>
+              <m:r>
+                <w:rPr>
+                  <w:rFonts w:ascii="Cambria Math" w:eastAsiaTheme="minorEastAsia" w:hAnsi="Cambria Math"/>
+                </w:rPr>
+                <m:t>D</m:t>
+              </m:r>
+            </m:e>
+            <m:sub>
+              <m:r>
+                <w:rPr>
+                  <w:rFonts w:ascii="Cambria Math" w:eastAsiaTheme="minorEastAsia" w:hAnsi="Cambria Math"/>
+                </w:rPr>
+                <m:t>C</m:t>
+              </m:r>
+            </m:sub>
+          </m:sSub>
+          <m:r>
+            <w:rPr>
+              <w:rFonts w:ascii="Cambria Math" w:eastAsiaTheme="minorEastAsia" w:hAnsi="Cambria Math"/>
+            </w:rPr>
+            <m:t>=</m:t>
+          </m:r>
+          <m:f>
+            <m:fPr>
+              <m:ctrlPr>
+                <w:rPr>
+                  <w:rFonts w:ascii="Cambria Math" w:eastAsiaTheme="minorEastAsia" w:hAnsi="Cambria Math"/>
+                  <w:i/>
+                </w:rPr>
+              </m:ctrlPr>
+            </m:fPr>
+            <m:num>
+              <m:sSub>
+                <m:sSubPr>
+                  <m:ctrlPr>
+                    <w:rPr>
+                      <w:rFonts w:ascii="Cambria Math" w:eastAsiaTheme="minorEastAsia" w:hAnsi="Cambria Math"/>
+                      <w:i/>
+                    </w:rPr>
+                  </m:ctrlPr>
+                </m:sSubPr>
+                <m:e>
+                  <m:r>
+                    <w:rPr>
+                      <w:rFonts w:ascii="Cambria Math" w:eastAsiaTheme="minorEastAsia" w:hAnsi="Cambria Math"/>
+                    </w:rPr>
+                    <m:t>T</m:t>
+                  </m:r>
+                </m:e>
+                <m:sub>
+                  <m:r>
+                    <w:rPr>
+                      <w:rFonts w:ascii="Cambria Math" w:eastAsiaTheme="minorEastAsia" w:hAnsi="Cambria Math"/>
+                    </w:rPr>
+                    <m:t>C</m:t>
+                  </m:r>
+                </m:sub>
+              </m:sSub>
+            </m:num>
+            <m:den>
+              <m:sSub>
+                <m:sSubPr>
+                  <m:ctrlPr>
+                    <w:rPr>
+                      <w:rFonts w:ascii="Cambria Math" w:eastAsiaTheme="minorEastAsia" w:hAnsi="Cambria Math"/>
+                      <w:i/>
+                    </w:rPr>
+                  </m:ctrlPr>
+                </m:sSubPr>
+                <m:e>
+                  <m:r>
+                    <w:rPr>
+                      <w:rFonts w:ascii="Cambria Math" w:eastAsiaTheme="minorEastAsia" w:hAnsi="Cambria Math"/>
+                    </w:rPr>
+                    <m:t>T</m:t>
+                  </m:r>
+                </m:e>
+                <m:sub>
+                  <m:r>
+                    <w:rPr>
+                      <w:rFonts w:ascii="Cambria Math" w:eastAsiaTheme="minorEastAsia" w:hAnsi="Cambria Math"/>
+                    </w:rPr>
+                    <m:t>s</m:t>
+                  </m:r>
+                </m:sub>
+              </m:sSub>
+            </m:den>
+          </m:f>
+        </m:oMath>
+      </m:oMathPara>
+    </w:p>
+    <w:p>
+      <w:pPr>
+        <w:rPr>
+          <w:rFonts w:eastAsiaTheme="minorEastAsia"/>
+        </w:rPr>
+      </w:pPr>
+    </w:p>
+    <w:p>
+      <w:pPr>
+        <w:rPr>
+          <w:rFonts w:eastAsiaTheme="minorEastAsia"/>
+        </w:rPr>
+      </w:pPr>
+    </w:p>
+    <w:p>
+      <w:pPr>
+        <w:rPr>
+          <w:rFonts w:eastAsiaTheme="minorEastAsia"/>
+        </w:rPr>
+      </w:pPr>
+    </w:p>
+    <w:p/>
+    <w:p/>
+    <w:p/>
+    <w:p/>
+    <w:p/>
+    <w:p/>
+    <w:p>
+      <w:r>
+        <w:t>Motor Control Project</w:t>
+      </w:r>
+    </w:p>
+    <w:p>
+      <w:r>
+        <w:t>Updates</w:t>
+      </w:r>
+    </w:p>
+    <w:p>
+      <w:pPr>
+        <w:pStyle w:val="ListParagraph"/>
+        <w:numPr>
+          <w:ilvl w:val="0"/>
+          <w:numId w:val="1"/>
+        </w:numPr>
+      </w:pPr>
+      <w:r>
+        <w:t xml:space="preserve">Read </w:t>
+      </w:r>
+      <w:proofErr w:type="spellStart"/>
+      <w:r>
+        <w:t>Vbus</w:t>
+      </w:r>
+      <w:proofErr w:type="spellEnd"/>
+    </w:p>
+    <w:p>
+      <w:pPr>
+        <w:pStyle w:val="ListParagraph"/>
+        <w:numPr>
+          <w:ilvl w:val="0"/>
+          <w:numId w:val="1"/>
+        </w:numPr>
+      </w:pPr>
+      <w:r>
+        <w:t xml:space="preserve">Can read temperature individually, if I try to read both </w:t>
+      </w:r>
+      <w:proofErr w:type="spellStart"/>
+      <w:r>
+        <w:t>VBus</w:t>
+      </w:r>
+      <w:proofErr w:type="spellEnd"/>
+      <w:r>
+        <w:t xml:space="preserve"> and ESC temperature then ADC stops working with monitor and tune</w:t>
+      </w:r>
+    </w:p>
+    <w:p>
+      <w:pPr>
+        <w:pStyle w:val="ListParagraph"/>
+        <w:numPr>
+          <w:ilvl w:val="0"/>
+          <w:numId w:val="1"/>
+        </w:numPr>
+      </w:pPr>
+      <w:r>
+        <w:t>Fixed the above problem by changing the “Analog to Digital Converter” block from “trigger and read results” to “read results only”. I now manually trigger the ADC conversion using TIM. This solved that issue and I can multiple sensors in the same DMA line</w:t>
+      </w:r>
+    </w:p>
+    <w:p>
+      <w:pPr>
+        <w:pStyle w:val="ListParagraph"/>
+        <w:numPr>
+          <w:ilvl w:val="0"/>
+          <w:numId w:val="1"/>
+        </w:numPr>
+      </w:pPr>
+      <w:r>
+        <w:t xml:space="preserve">Added 50us task for FOC, had to change the model from </w:t>
+      </w:r>
+      <w:proofErr w:type="spellStart"/>
+      <w:r>
+        <w:t>FreeRTOS</w:t>
+      </w:r>
+      <w:proofErr w:type="spellEnd"/>
+      <w:r>
+        <w:t xml:space="preserve"> to </w:t>
+      </w:r>
+      <w:proofErr w:type="spellStart"/>
+      <w:r>
+        <w:t>Baremetal</w:t>
+      </w:r>
+      <w:proofErr w:type="spellEnd"/>
+    </w:p>
+    <w:p/>
+    <w:p>
+      <w:r>
+        <w:lastRenderedPageBreak/>
+        <w:t>25/09/26</w:t>
+      </w:r>
+    </w:p>
+    <w:p>
+      <w:pPr>
+        <w:pStyle w:val="ListParagraph"/>
+        <w:numPr>
+          <w:ilvl w:val="0"/>
+          <w:numId w:val="2"/>
+        </w:numPr>
+      </w:pPr>
+      <w:r>
+        <w:t xml:space="preserve">Successfully modelled Clarke, Park, inverse Park, and inverse Clarke transformations </w:t>
+      </w:r>
+      <w:proofErr w:type="gramStart"/>
+      <w:r>
+        <w:t>in order to</w:t>
+      </w:r>
+      <w:proofErr w:type="gramEnd"/>
+      <w:r>
+        <w:t xml:space="preserve"> convert from AC to DC control. </w:t>
+      </w:r>
     </w:p>
     <w:sectPr>
       <w:pgSz w:w="11906" w:h="16838"/>
@@ -100,6 +3022,219 @@
     </w:sectPr>
   </w:body>
 </w:document>
+</file>
+
+<file path=word/numbering.xml><?xml version="1.0" encoding="utf-8"?>
+<w:numbering xmlns:wpc="http://schemas.microsoft.com/office/word/2010/wordprocessingCanvas" xmlns:cx="http://schemas.microsoft.com/office/drawing/2014/chartex" xmlns:cx1="http://schemas.microsoft.com/office/drawing/2015/9/8/chartex" xmlns:cx2="http://schemas.microsoft.com/office/drawing/2015/10/21/chartex" xmlns:cx3="http://schemas.microsoft.com/office/drawing/2016/5/9/chartex" xmlns:cx4="http://schemas.microsoft.com/office/drawing/2016/5/10/chartex" xmlns:cx5="http://schemas.microsoft.com/office/drawing/2016/5/11/chartex" xmlns:cx6="http://schemas.microsoft.com/office/drawing/2016/5/12/chartex" xmlns:cx7="http://schemas.microsoft.com/office/drawing/2016/5/13/chartex" xmlns:cx8="http://schemas.microsoft.com/office/drawing/2016/5/14/chartex" xmlns:mc="http://schemas.openxmlformats.org/markup-compatibility/2006" xmlns:aink="http://schemas.microsoft.com/office/drawing/2016/ink" xmlns:am3d="http://schemas.microsoft.com/office/drawing/2017/model3d" xmlns:o="urn:schemas-microsoft-com:office:office" xmlns:oel="http://schemas.microsoft.com/office/2019/extlst" xmlns:r="http://schemas.openxmlformats.org/officeDocument/2006/relationships" xmlns:m="http://schemas.openxmlformats.org/officeDocument/2006/math" xmlns:v="urn:schemas-microsoft-com:vml" xmlns:wp14="http://schemas.microsoft.com/office/word/2010/wordprocessingDrawing" xmlns:wp="http://schemas.openxmlformats.org/drawingml/2006/wordprocessingDrawing" xmlns:w10="urn:schemas-microsoft-com:office:word" xmlns:w="http://schemas.openxmlformats.org/wordprocessingml/2006/main" xmlns:w14="http://schemas.microsoft.com/office/word/2010/wordml" xmlns:w15="http://schemas.microsoft.com/office/word/2012/wordml" xmlns:w16cex="http://schemas.microsoft.com/office/word/2018/wordml/cex" xmlns:w16cid="http://schemas.microsoft.com/office/word/2016/wordml/cid" xmlns:w16="http://schemas.microsoft.com/office/word/2018/wordml" xmlns:w16du="http://schemas.microsoft.com/office/word/2023/wordml/word16du" xmlns:w16sdtdh="http://schemas.microsoft.com/office/word/2020/wordml/sdtdatahash" xmlns:w16sdtfl="http://schemas.microsoft.com/office/word/2024/wordml/sdtformatlock" xmlns:w16se="http://schemas.microsoft.com/office/word/2015/wordml/symex" xmlns:wpg="http://schemas.microsoft.com/office/word/2010/wordprocessingGroup" xmlns:wpi="http://schemas.microsoft.com/office/word/2010/wordprocessingInk" xmlns:wne="http://schemas.microsoft.com/office/word/2006/wordml" xmlns:wps="http://schemas.microsoft.com/office/word/2010/wordprocessingShape" mc:Ignorable="w14 w15 w16se w16cid w16 w16cex w16sdtdh w16sdtfl w16du wp14">
+  <w:abstractNum w:abstractNumId="0" w15:restartNumberingAfterBreak="0">
+    <w:nsid w:val="2AEE32C3"/>
+    <w:multiLevelType w:val="hybridMultilevel"/>
+    <w:tmpl w:val="11380822"/>
+    <w:lvl w:ilvl="0" w:tplc="545CA14A">
+      <w:start w:val="1"/>
+      <w:numFmt w:val="bullet"/>
+      <w:lvlText w:val="-"/>
+      <w:lvlJc w:val="left"/>
+      <w:pPr>
+        <w:ind w:left="720" w:hanging="360"/>
+      </w:pPr>
+      <w:rPr>
+        <w:rFonts w:ascii="Aptos" w:eastAsiaTheme="minorHAnsi" w:hAnsi="Aptos" w:cstheme="minorBidi" w:hint="default"/>
+      </w:rPr>
+    </w:lvl>
+    <w:lvl w:ilvl="1" w:tplc="08090003" w:tentative="1">
+      <w:start w:val="1"/>
+      <w:numFmt w:val="bullet"/>
+      <w:lvlText w:val="o"/>
+      <w:lvlJc w:val="left"/>
+      <w:pPr>
+        <w:ind w:left="1440" w:hanging="360"/>
+      </w:pPr>
+      <w:rPr>
+        <w:rFonts w:ascii="Courier New" w:hAnsi="Courier New" w:cs="Courier New" w:hint="default"/>
+      </w:rPr>
+    </w:lvl>
+    <w:lvl w:ilvl="2" w:tplc="08090005" w:tentative="1">
+      <w:start w:val="1"/>
+      <w:numFmt w:val="bullet"/>
+      <w:lvlText w:val=""/>
+      <w:lvlJc w:val="left"/>
+      <w:pPr>
+        <w:ind w:left="2160" w:hanging="360"/>
+      </w:pPr>
+      <w:rPr>
+        <w:rFonts w:ascii="Wingdings" w:hAnsi="Wingdings" w:hint="default"/>
+      </w:rPr>
+    </w:lvl>
+    <w:lvl w:ilvl="3" w:tplc="08090001" w:tentative="1">
+      <w:start w:val="1"/>
+      <w:numFmt w:val="bullet"/>
+      <w:lvlText w:val=""/>
+      <w:lvlJc w:val="left"/>
+      <w:pPr>
+        <w:ind w:left="2880" w:hanging="360"/>
+      </w:pPr>
+      <w:rPr>
+        <w:rFonts w:ascii="Symbol" w:hAnsi="Symbol" w:hint="default"/>
+      </w:rPr>
+    </w:lvl>
+    <w:lvl w:ilvl="4" w:tplc="08090003" w:tentative="1">
+      <w:start w:val="1"/>
+      <w:numFmt w:val="bullet"/>
+      <w:lvlText w:val="o"/>
+      <w:lvlJc w:val="left"/>
+      <w:pPr>
+        <w:ind w:left="3600" w:hanging="360"/>
+      </w:pPr>
+      <w:rPr>
+        <w:rFonts w:ascii="Courier New" w:hAnsi="Courier New" w:cs="Courier New" w:hint="default"/>
+      </w:rPr>
+    </w:lvl>
+    <w:lvl w:ilvl="5" w:tplc="08090005" w:tentative="1">
+      <w:start w:val="1"/>
+      <w:numFmt w:val="bullet"/>
+      <w:lvlText w:val=""/>
+      <w:lvlJc w:val="left"/>
+      <w:pPr>
+        <w:ind w:left="4320" w:hanging="360"/>
+      </w:pPr>
+      <w:rPr>
+        <w:rFonts w:ascii="Wingdings" w:hAnsi="Wingdings" w:hint="default"/>
+      </w:rPr>
+    </w:lvl>
+    <w:lvl w:ilvl="6" w:tplc="08090001" w:tentative="1">
+      <w:start w:val="1"/>
+      <w:numFmt w:val="bullet"/>
+      <w:lvlText w:val=""/>
+      <w:lvlJc w:val="left"/>
+      <w:pPr>
+        <w:ind w:left="5040" w:hanging="360"/>
+      </w:pPr>
+      <w:rPr>
+        <w:rFonts w:ascii="Symbol" w:hAnsi="Symbol" w:hint="default"/>
+      </w:rPr>
+    </w:lvl>
+    <w:lvl w:ilvl="7" w:tplc="08090003" w:tentative="1">
+      <w:start w:val="1"/>
+      <w:numFmt w:val="bullet"/>
+      <w:lvlText w:val="o"/>
+      <w:lvlJc w:val="left"/>
+      <w:pPr>
+        <w:ind w:left="5760" w:hanging="360"/>
+      </w:pPr>
+      <w:rPr>
+        <w:rFonts w:ascii="Courier New" w:hAnsi="Courier New" w:cs="Courier New" w:hint="default"/>
+      </w:rPr>
+    </w:lvl>
+    <w:lvl w:ilvl="8" w:tplc="08090005" w:tentative="1">
+      <w:start w:val="1"/>
+      <w:numFmt w:val="bullet"/>
+      <w:lvlText w:val=""/>
+      <w:lvlJc w:val="left"/>
+      <w:pPr>
+        <w:ind w:left="6480" w:hanging="360"/>
+      </w:pPr>
+      <w:rPr>
+        <w:rFonts w:ascii="Wingdings" w:hAnsi="Wingdings" w:hint="default"/>
+      </w:rPr>
+    </w:lvl>
+  </w:abstractNum>
+  <w:abstractNum w:abstractNumId="1" w15:restartNumberingAfterBreak="0">
+    <w:nsid w:val="309F702B"/>
+    <w:multiLevelType w:val="hybridMultilevel"/>
+    <w:tmpl w:val="4DF630A8"/>
+    <w:lvl w:ilvl="0" w:tplc="0809000F">
+      <w:start w:val="1"/>
+      <w:numFmt w:val="decimal"/>
+      <w:lvlText w:val="%1."/>
+      <w:lvlJc w:val="left"/>
+      <w:pPr>
+        <w:ind w:left="720" w:hanging="360"/>
+      </w:pPr>
+      <w:rPr>
+        <w:rFonts w:hint="default"/>
+      </w:rPr>
+    </w:lvl>
+    <w:lvl w:ilvl="1" w:tplc="08090019" w:tentative="1">
+      <w:start w:val="1"/>
+      <w:numFmt w:val="lowerLetter"/>
+      <w:lvlText w:val="%2."/>
+      <w:lvlJc w:val="left"/>
+      <w:pPr>
+        <w:ind w:left="1440" w:hanging="360"/>
+      </w:pPr>
+    </w:lvl>
+    <w:lvl w:ilvl="2" w:tplc="0809001B" w:tentative="1">
+      <w:start w:val="1"/>
+      <w:numFmt w:val="lowerRoman"/>
+      <w:lvlText w:val="%3."/>
+      <w:lvlJc w:val="right"/>
+      <w:pPr>
+        <w:ind w:left="2160" w:hanging="180"/>
+      </w:pPr>
+    </w:lvl>
+    <w:lvl w:ilvl="3" w:tplc="0809000F" w:tentative="1">
+      <w:start w:val="1"/>
+      <w:numFmt w:val="decimal"/>
+      <w:lvlText w:val="%4."/>
+      <w:lvlJc w:val="left"/>
+      <w:pPr>
+        <w:ind w:left="2880" w:hanging="360"/>
+      </w:pPr>
+    </w:lvl>
+    <w:lvl w:ilvl="4" w:tplc="08090019" w:tentative="1">
+      <w:start w:val="1"/>
+      <w:numFmt w:val="lowerLetter"/>
+      <w:lvlText w:val="%5."/>
+      <w:lvlJc w:val="left"/>
+      <w:pPr>
+        <w:ind w:left="3600" w:hanging="360"/>
+      </w:pPr>
+    </w:lvl>
+    <w:lvl w:ilvl="5" w:tplc="0809001B" w:tentative="1">
+      <w:start w:val="1"/>
+      <w:numFmt w:val="lowerRoman"/>
+      <w:lvlText w:val="%6."/>
+      <w:lvlJc w:val="right"/>
+      <w:pPr>
+        <w:ind w:left="4320" w:hanging="180"/>
+      </w:pPr>
+    </w:lvl>
+    <w:lvl w:ilvl="6" w:tplc="0809000F" w:tentative="1">
+      <w:start w:val="1"/>
+      <w:numFmt w:val="decimal"/>
+      <w:lvlText w:val="%7."/>
+      <w:lvlJc w:val="left"/>
+      <w:pPr>
+        <w:ind w:left="5040" w:hanging="360"/>
+      </w:pPr>
+    </w:lvl>
+    <w:lvl w:ilvl="7" w:tplc="08090019" w:tentative="1">
+      <w:start w:val="1"/>
+      <w:numFmt w:val="lowerLetter"/>
+      <w:lvlText w:val="%8."/>
+      <w:lvlJc w:val="left"/>
+      <w:pPr>
+        <w:ind w:left="5760" w:hanging="360"/>
+      </w:pPr>
+    </w:lvl>
+    <w:lvl w:ilvl="8" w:tplc="0809001B" w:tentative="1">
+      <w:start w:val="1"/>
+      <w:numFmt w:val="lowerRoman"/>
+      <w:lvlText w:val="%9."/>
+      <w:lvlJc w:val="right"/>
+      <w:pPr>
+        <w:ind w:left="6480" w:hanging="180"/>
+      </w:pPr>
+    </w:lvl>
+  </w:abstractNum>
+  <w:num w:numId="1" w16cid:durableId="681712428">
+    <w:abstractNumId w:val="1"/>
+  </w:num>
+  <w:num w:numId="2" w16cid:durableId="964234818">
+    <w:abstractNumId w:val="0"/>
+  </w:num>
+</w:numbering>
 </file>
 
 <file path=word/styles.xml><?xml version="1.0" encoding="utf-8"?>
@@ -502,6 +3637,7 @@
   <w:style w:type="paragraph" w:default="1" w:styleId="Normal">
     <w:name w:val="Normal"/>
     <w:qFormat/>
+    <w:rsid w:val="009F2CAB"/>
   </w:style>
   <w:style w:type="paragraph" w:styleId="Heading1">
     <w:name w:val="heading 1"/>

</xml_diff>

<commit_message>
Implement Da, Db, and Dc + increase to 170 MHz clock freq
</commit_message>
<xml_diff>
--- a/Datasheet/Equations_SS.docx
+++ b/Datasheet/Equations_SS.docx
@@ -2558,13 +2558,6 @@
           <w:rFonts w:eastAsiaTheme="minorEastAsia"/>
         </w:rPr>
       </w:pPr>
-    </w:p>
-    <w:p>
-      <w:pPr>
-        <w:rPr>
-          <w:rFonts w:eastAsiaTheme="minorEastAsia"/>
-        </w:rPr>
-      </w:pPr>
       <m:oMathPara>
         <m:oMath>
           <m:sSub>
@@ -2877,25 +2870,38 @@
       </m:oMathPara>
     </w:p>
     <w:p>
-      <w:pPr>
-        <w:rPr>
-          <w:rFonts w:eastAsiaTheme="minorEastAsia"/>
-        </w:rPr>
-      </w:pPr>
-    </w:p>
-    <w:p>
-      <w:pPr>
-        <w:rPr>
-          <w:rFonts w:eastAsiaTheme="minorEastAsia"/>
-        </w:rPr>
-      </w:pPr>
-    </w:p>
-    <w:p>
-      <w:pPr>
-        <w:rPr>
-          <w:rFonts w:eastAsiaTheme="minorEastAsia"/>
-        </w:rPr>
-      </w:pPr>
+      <w:r>
+        <w:t>170 MHz</w:t>
+      </w:r>
+    </w:p>
+    <w:p>
+      <w:pPr>
+        <w:pStyle w:val="ListParagraph"/>
+        <w:numPr>
+          <w:ilvl w:val="0"/>
+          <w:numId w:val="3"/>
+        </w:numPr>
+      </w:pPr>
+      <w:r>
+        <w:t>TIM2</w:t>
+      </w:r>
+    </w:p>
+    <w:p>
+      <w:pPr>
+        <w:pStyle w:val="ListParagraph"/>
+        <w:numPr>
+          <w:ilvl w:val="0"/>
+          <w:numId w:val="3"/>
+        </w:numPr>
+      </w:pPr>
+      <w:r>
+        <w:t>TIM1 – ARR</w:t>
+      </w:r>
+    </w:p>
+    <w:p>
+      <w:r>
+        <w:t>Dead time = 500ns*(1/170MHz) ~ 85… = 85</w:t>
+      </w:r>
     </w:p>
     <w:p/>
     <w:p/>
@@ -2903,8 +2909,18 @@
     <w:p/>
     <w:p/>
     <w:p/>
+    <w:p/>
+    <w:p/>
+    <w:p/>
+    <w:p/>
+    <w:p/>
+    <w:p/>
+    <w:p/>
+    <w:p/>
+    <w:p/>
     <w:p>
       <w:r>
+        <w:lastRenderedPageBreak/>
         <w:t>Motor Control Project</w:t>
       </w:r>
     </w:p>
@@ -2990,7 +3006,6 @@
     <w:p/>
     <w:p>
       <w:r>
-        <w:lastRenderedPageBreak/>
         <w:t>25/09/26</w:t>
       </w:r>
     </w:p>
@@ -3014,6 +3029,46 @@
         <w:t xml:space="preserve"> convert from AC to DC control. </w:t>
       </w:r>
     </w:p>
+    <w:p>
+      <w:r>
+        <w:t xml:space="preserve">27/09/26 </w:t>
+      </w:r>
+    </w:p>
+    <w:p>
+      <w:pPr>
+        <w:pStyle w:val="ListParagraph"/>
+        <w:numPr>
+          <w:ilvl w:val="0"/>
+          <w:numId w:val="2"/>
+        </w:numPr>
+      </w:pPr>
+      <w:r>
+        <w:t xml:space="preserve">Implemented SVPWM which converts </w:t>
+      </w:r>
+      <w:proofErr w:type="spellStart"/>
+      <w:r>
+        <w:t>V_alpha</w:t>
+      </w:r>
+      <w:proofErr w:type="spellEnd"/>
+      <w:r>
+        <w:t xml:space="preserve">, </w:t>
+      </w:r>
+      <w:proofErr w:type="spellStart"/>
+      <w:r>
+        <w:t>V_Beta</w:t>
+      </w:r>
+      <w:proofErr w:type="spellEnd"/>
+      <w:r>
+        <w:t xml:space="preserve"> to Da, Db, Dc duty ratios to obtain the </w:t>
+      </w:r>
+      <w:proofErr w:type="spellStart"/>
+      <w:r>
+        <w:t>Vref</w:t>
+      </w:r>
+      <w:proofErr w:type="spellEnd"/>
+    </w:p>
+    <w:p/>
+    <w:p/>
     <w:sectPr>
       <w:pgSz w:w="11906" w:h="16838"/>
       <w:pgMar w:top="1440" w:right="1440" w:bottom="1440" w:left="1440" w:header="708" w:footer="708" w:gutter="0"/>
@@ -3228,11 +3283,127 @@
       </w:pPr>
     </w:lvl>
   </w:abstractNum>
+  <w:abstractNum w:abstractNumId="2" w15:restartNumberingAfterBreak="0">
+    <w:nsid w:val="32174A66"/>
+    <w:multiLevelType w:val="hybridMultilevel"/>
+    <w:tmpl w:val="69EA9980"/>
+    <w:lvl w:ilvl="0" w:tplc="09A2EBB0">
+      <w:start w:val="170"/>
+      <w:numFmt w:val="bullet"/>
+      <w:lvlText w:val="-"/>
+      <w:lvlJc w:val="left"/>
+      <w:pPr>
+        <w:ind w:left="720" w:hanging="360"/>
+      </w:pPr>
+      <w:rPr>
+        <w:rFonts w:ascii="Aptos" w:eastAsiaTheme="minorHAnsi" w:hAnsi="Aptos" w:cstheme="minorBidi" w:hint="default"/>
+      </w:rPr>
+    </w:lvl>
+    <w:lvl w:ilvl="1" w:tplc="08090003" w:tentative="1">
+      <w:start w:val="1"/>
+      <w:numFmt w:val="bullet"/>
+      <w:lvlText w:val="o"/>
+      <w:lvlJc w:val="left"/>
+      <w:pPr>
+        <w:ind w:left="1440" w:hanging="360"/>
+      </w:pPr>
+      <w:rPr>
+        <w:rFonts w:ascii="Courier New" w:hAnsi="Courier New" w:cs="Courier New" w:hint="default"/>
+      </w:rPr>
+    </w:lvl>
+    <w:lvl w:ilvl="2" w:tplc="08090005" w:tentative="1">
+      <w:start w:val="1"/>
+      <w:numFmt w:val="bullet"/>
+      <w:lvlText w:val=""/>
+      <w:lvlJc w:val="left"/>
+      <w:pPr>
+        <w:ind w:left="2160" w:hanging="360"/>
+      </w:pPr>
+      <w:rPr>
+        <w:rFonts w:ascii="Wingdings" w:hAnsi="Wingdings" w:hint="default"/>
+      </w:rPr>
+    </w:lvl>
+    <w:lvl w:ilvl="3" w:tplc="08090001" w:tentative="1">
+      <w:start w:val="1"/>
+      <w:numFmt w:val="bullet"/>
+      <w:lvlText w:val=""/>
+      <w:lvlJc w:val="left"/>
+      <w:pPr>
+        <w:ind w:left="2880" w:hanging="360"/>
+      </w:pPr>
+      <w:rPr>
+        <w:rFonts w:ascii="Symbol" w:hAnsi="Symbol" w:hint="default"/>
+      </w:rPr>
+    </w:lvl>
+    <w:lvl w:ilvl="4" w:tplc="08090003" w:tentative="1">
+      <w:start w:val="1"/>
+      <w:numFmt w:val="bullet"/>
+      <w:lvlText w:val="o"/>
+      <w:lvlJc w:val="left"/>
+      <w:pPr>
+        <w:ind w:left="3600" w:hanging="360"/>
+      </w:pPr>
+      <w:rPr>
+        <w:rFonts w:ascii="Courier New" w:hAnsi="Courier New" w:cs="Courier New" w:hint="default"/>
+      </w:rPr>
+    </w:lvl>
+    <w:lvl w:ilvl="5" w:tplc="08090005" w:tentative="1">
+      <w:start w:val="1"/>
+      <w:numFmt w:val="bullet"/>
+      <w:lvlText w:val=""/>
+      <w:lvlJc w:val="left"/>
+      <w:pPr>
+        <w:ind w:left="4320" w:hanging="360"/>
+      </w:pPr>
+      <w:rPr>
+        <w:rFonts w:ascii="Wingdings" w:hAnsi="Wingdings" w:hint="default"/>
+      </w:rPr>
+    </w:lvl>
+    <w:lvl w:ilvl="6" w:tplc="08090001" w:tentative="1">
+      <w:start w:val="1"/>
+      <w:numFmt w:val="bullet"/>
+      <w:lvlText w:val=""/>
+      <w:lvlJc w:val="left"/>
+      <w:pPr>
+        <w:ind w:left="5040" w:hanging="360"/>
+      </w:pPr>
+      <w:rPr>
+        <w:rFonts w:ascii="Symbol" w:hAnsi="Symbol" w:hint="default"/>
+      </w:rPr>
+    </w:lvl>
+    <w:lvl w:ilvl="7" w:tplc="08090003" w:tentative="1">
+      <w:start w:val="1"/>
+      <w:numFmt w:val="bullet"/>
+      <w:lvlText w:val="o"/>
+      <w:lvlJc w:val="left"/>
+      <w:pPr>
+        <w:ind w:left="5760" w:hanging="360"/>
+      </w:pPr>
+      <w:rPr>
+        <w:rFonts w:ascii="Courier New" w:hAnsi="Courier New" w:cs="Courier New" w:hint="default"/>
+      </w:rPr>
+    </w:lvl>
+    <w:lvl w:ilvl="8" w:tplc="08090005" w:tentative="1">
+      <w:start w:val="1"/>
+      <w:numFmt w:val="bullet"/>
+      <w:lvlText w:val=""/>
+      <w:lvlJc w:val="left"/>
+      <w:pPr>
+        <w:ind w:left="6480" w:hanging="360"/>
+      </w:pPr>
+      <w:rPr>
+        <w:rFonts w:ascii="Wingdings" w:hAnsi="Wingdings" w:hint="default"/>
+      </w:rPr>
+    </w:lvl>
+  </w:abstractNum>
   <w:num w:numId="1" w16cid:durableId="681712428">
     <w:abstractNumId w:val="1"/>
   </w:num>
   <w:num w:numId="2" w16cid:durableId="964234818">
     <w:abstractNumId w:val="0"/>
+  </w:num>
+  <w:num w:numId="3" w16cid:durableId="1017580037">
+    <w:abstractNumId w:val="2"/>
   </w:num>
 </w:numbering>
 </file>

</xml_diff>

<commit_message>
Improve 50us execution time by changing data type from double to single
</commit_message>
<xml_diff>
--- a/Datasheet/Equations_SS.docx
+++ b/Datasheet/Equations_SS.docx
@@ -12,16 +12,8 @@
         <w:rPr>
           <w:rFonts w:eastAsiaTheme="minorEastAsia"/>
         </w:rPr>
-        <w:t xml:space="preserve">RT </w:t>
+        <w:t>RT charactersitics</w:t>
       </w:r>
-      <w:proofErr w:type="spellStart"/>
-      <w:r>
-        <w:rPr>
-          <w:rFonts w:eastAsiaTheme="minorEastAsia"/>
-        </w:rPr>
-        <w:t>charactersitics</w:t>
-      </w:r>
-      <w:proofErr w:type="spellEnd"/>
     </w:p>
     <w:p>
       <w:pPr>
@@ -2938,13 +2930,8 @@
         </w:numPr>
       </w:pPr>
       <w:r>
-        <w:t xml:space="preserve">Read </w:t>
+        <w:t>Read Vbus</w:t>
       </w:r>
-      <w:proofErr w:type="spellStart"/>
-      <w:r>
-        <w:t>Vbus</w:t>
-      </w:r>
-      <w:proofErr w:type="spellEnd"/>
     </w:p>
     <w:p>
       <w:pPr>
@@ -2955,15 +2942,7 @@
         </w:numPr>
       </w:pPr>
       <w:r>
-        <w:t xml:space="preserve">Can read temperature individually, if I try to read both </w:t>
-      </w:r>
-      <w:proofErr w:type="spellStart"/>
-      <w:r>
-        <w:t>VBus</w:t>
-      </w:r>
-      <w:proofErr w:type="spellEnd"/>
-      <w:r>
-        <w:t xml:space="preserve"> and ESC temperature then ADC stops working with monitor and tune</w:t>
+        <w:t>Can read temperature individually, if I try to read both VBus and ESC temperature then ADC stops working with monitor and tune</w:t>
       </w:r>
     </w:p>
     <w:p>
@@ -2987,21 +2966,8 @@
         </w:numPr>
       </w:pPr>
       <w:r>
-        <w:t xml:space="preserve">Added 50us task for FOC, had to change the model from </w:t>
+        <w:t>Added 50us task for FOC, had to change the model from FreeRTOS to Baremetal</w:t>
       </w:r>
-      <w:proofErr w:type="spellStart"/>
-      <w:r>
-        <w:t>FreeRTOS</w:t>
-      </w:r>
-      <w:proofErr w:type="spellEnd"/>
-      <w:r>
-        <w:t xml:space="preserve"> to </w:t>
-      </w:r>
-      <w:proofErr w:type="spellStart"/>
-      <w:r>
-        <w:t>Baremetal</w:t>
-      </w:r>
-      <w:proofErr w:type="spellEnd"/>
     </w:p>
     <w:p/>
     <w:p>
@@ -3018,15 +2984,7 @@
         </w:numPr>
       </w:pPr>
       <w:r>
-        <w:t xml:space="preserve">Successfully modelled Clarke, Park, inverse Park, and inverse Clarke transformations </w:t>
-      </w:r>
-      <w:proofErr w:type="gramStart"/>
-      <w:r>
-        <w:t>in order to</w:t>
-      </w:r>
-      <w:proofErr w:type="gramEnd"/>
-      <w:r>
-        <w:t xml:space="preserve"> convert from AC to DC control. </w:t>
+        <w:t xml:space="preserve">Successfully modelled Clarke, Park, inverse Park, and inverse Clarke transformations in order to convert from AC to DC control. </w:t>
       </w:r>
     </w:p>
     <w:p>
@@ -3043,32 +3001,38 @@
         </w:numPr>
       </w:pPr>
       <w:r>
-        <w:t xml:space="preserve">Implemented SVPWM which converts </w:t>
+        <w:t>Implemented SVPWM which converts V_alpha, V_Beta to Da, Db, Dc duty ratios to obtain the Vref</w:t>
       </w:r>
-      <w:proofErr w:type="spellStart"/>
+    </w:p>
+    <w:p>
       <w:r>
-        <w:t>V_alpha</w:t>
+        <w:t>29/09/26</w:t>
       </w:r>
-      <w:proofErr w:type="spellEnd"/>
+    </w:p>
+    <w:p>
+      <w:pPr>
+        <w:pStyle w:val="ListParagraph"/>
+        <w:numPr>
+          <w:ilvl w:val="0"/>
+          <w:numId w:val="2"/>
+        </w:numPr>
+      </w:pPr>
       <w:r>
-        <w:t xml:space="preserve">, </w:t>
+        <w:t>Changed signal datatype from double to single since it was slowing down the 50us task</w:t>
       </w:r>
-      <w:proofErr w:type="spellStart"/>
+    </w:p>
+    <w:p>
+      <w:pPr>
+        <w:pStyle w:val="ListParagraph"/>
+        <w:numPr>
+          <w:ilvl w:val="1"/>
+          <w:numId w:val="2"/>
+        </w:numPr>
+      </w:pPr>
       <w:r>
-        <w:t>V_Beta</w:t>
+        <w:t>Single – 4 bytes, double 8 bytes. Almost double the RAM memory</w:t>
       </w:r>
-      <w:proofErr w:type="spellEnd"/>
-      <w:r>
-        <w:t xml:space="preserve"> to Da, Db, Dc duty ratios to obtain the </w:t>
-      </w:r>
-      <w:proofErr w:type="spellStart"/>
-      <w:r>
-        <w:t>Vref</w:t>
-      </w:r>
-      <w:proofErr w:type="spellEnd"/>
-    </w:p>
-    <w:p/>
-    <w:p/>
+    </w:p>
     <w:sectPr>
       <w:pgSz w:w="11906" w:h="16838"/>
       <w:pgMar w:top="1440" w:right="1440" w:bottom="1440" w:left="1440" w:header="708" w:footer="708" w:gutter="0"/>
@@ -3097,7 +3061,7 @@
         <w:rFonts w:ascii="Aptos" w:eastAsiaTheme="minorHAnsi" w:hAnsi="Aptos" w:cstheme="minorBidi" w:hint="default"/>
       </w:rPr>
     </w:lvl>
-    <w:lvl w:ilvl="1" w:tplc="08090003" w:tentative="1">
+    <w:lvl w:ilvl="1" w:tplc="08090003">
       <w:start w:val="1"/>
       <w:numFmt w:val="bullet"/>
       <w:lvlText w:val="o"/>

</xml_diff>

<commit_message>
Add custom code to enable opamps to measure U and V phase currents
</commit_message>
<xml_diff>
--- a/Datasheet/Equations_SS.docx
+++ b/Datasheet/Equations_SS.docx
@@ -662,13 +662,7 @@
             <w:rPr>
               <w:rFonts w:ascii="Cambria Math" w:eastAsiaTheme="minorEastAsia" w:hAnsi="Cambria Math"/>
             </w:rPr>
-            <m:t>cosθ</m:t>
-          </m:r>
-          <m:r>
-            <w:rPr>
-              <w:rFonts w:ascii="Cambria Math" w:eastAsiaTheme="minorEastAsia" w:hAnsi="Cambria Math"/>
-            </w:rPr>
-            <m:t>+</m:t>
+            <m:t>cosθ+</m:t>
           </m:r>
           <m:sSub>
             <m:sSubPr>
@@ -700,13 +694,7 @@
             <w:rPr>
               <w:rFonts w:ascii="Cambria Math" w:eastAsiaTheme="minorEastAsia" w:hAnsi="Cambria Math"/>
             </w:rPr>
-            <m:t>sin</m:t>
-          </m:r>
-          <m:r>
-            <w:rPr>
-              <w:rFonts w:ascii="Cambria Math" w:eastAsiaTheme="minorEastAsia" w:hAnsi="Cambria Math"/>
-            </w:rPr>
-            <m:t>θ</m:t>
+            <m:t>sinθ</m:t>
           </m:r>
         </m:oMath>
       </m:oMathPara>
@@ -765,13 +753,7 @@
                 <w:rPr>
                   <w:rFonts w:ascii="Cambria Math" w:eastAsiaTheme="minorEastAsia" w:hAnsi="Cambria Math"/>
                 </w:rPr>
-                <m:t>-</m:t>
-              </m:r>
-              <m:r>
-                <w:rPr>
-                  <w:rFonts w:ascii="Cambria Math" w:eastAsiaTheme="minorEastAsia" w:hAnsi="Cambria Math"/>
-                </w:rPr>
-                <m:t>I</m:t>
+                <m:t>-I</m:t>
               </m:r>
             </m:e>
             <m:sub>
@@ -787,19 +769,7 @@
             <w:rPr>
               <w:rFonts w:ascii="Cambria Math" w:eastAsiaTheme="minorEastAsia" w:hAnsi="Cambria Math"/>
             </w:rPr>
-            <m:t>sin</m:t>
-          </m:r>
-          <m:r>
-            <w:rPr>
-              <w:rFonts w:ascii="Cambria Math" w:eastAsiaTheme="minorEastAsia" w:hAnsi="Cambria Math"/>
-            </w:rPr>
-            <m:t>θ</m:t>
-          </m:r>
-          <m:r>
-            <w:rPr>
-              <w:rFonts w:ascii="Cambria Math" w:eastAsiaTheme="minorEastAsia" w:hAnsi="Cambria Math"/>
-            </w:rPr>
-            <m:t>+</m:t>
+            <m:t>sinθ+</m:t>
           </m:r>
           <m:sSub>
             <m:sSubPr>
@@ -831,13 +801,7 @@
             <w:rPr>
               <w:rFonts w:ascii="Cambria Math" w:eastAsiaTheme="minorEastAsia" w:hAnsi="Cambria Math"/>
             </w:rPr>
-            <m:t>cos</m:t>
-          </m:r>
-          <m:r>
-            <w:rPr>
-              <w:rFonts w:ascii="Cambria Math" w:eastAsiaTheme="minorEastAsia" w:hAnsi="Cambria Math"/>
-            </w:rPr>
-            <m:t>θ</m:t>
+            <m:t>cosθ</m:t>
           </m:r>
         </m:oMath>
       </m:oMathPara>
@@ -932,13 +896,7 @@
             <w:rPr>
               <w:rFonts w:ascii="Cambria Math" w:eastAsiaTheme="minorEastAsia" w:hAnsi="Cambria Math"/>
             </w:rPr>
-            <m:t>cosθ</m:t>
-          </m:r>
-          <m:r>
-            <w:rPr>
-              <w:rFonts w:ascii="Cambria Math" w:eastAsiaTheme="minorEastAsia" w:hAnsi="Cambria Math"/>
-            </w:rPr>
-            <m:t>-</m:t>
+            <m:t>cosθ-</m:t>
           </m:r>
           <m:sSub>
             <m:sSubPr>
@@ -1114,13 +1072,7 @@
             <w:rPr>
               <w:rFonts w:ascii="Cambria Math" w:eastAsiaTheme="minorEastAsia" w:hAnsi="Cambria Math"/>
             </w:rPr>
-            <m:t>a=</m:t>
-          </m:r>
-          <m:r>
-            <w:rPr>
-              <w:rFonts w:ascii="Cambria Math" w:eastAsiaTheme="minorEastAsia" w:hAnsi="Cambria Math"/>
-            </w:rPr>
-            <m:t>α</m:t>
+            <m:t>a=α</m:t>
           </m:r>
         </m:oMath>
       </m:oMathPara>
@@ -1169,13 +1121,7 @@
             <w:rPr>
               <w:rFonts w:ascii="Cambria Math" w:eastAsiaTheme="minorEastAsia" w:hAnsi="Cambria Math"/>
             </w:rPr>
-            <m:t>α</m:t>
-          </m:r>
-          <m:r>
-            <w:rPr>
-              <w:rFonts w:ascii="Cambria Math" w:eastAsiaTheme="minorEastAsia" w:hAnsi="Cambria Math"/>
-            </w:rPr>
-            <m:t>+</m:t>
+            <m:t>α+</m:t>
           </m:r>
           <m:f>
             <m:fPr>
@@ -1270,13 +1216,7 @@
             <w:rPr>
               <w:rFonts w:ascii="Cambria Math" w:eastAsiaTheme="minorEastAsia" w:hAnsi="Cambria Math"/>
             </w:rPr>
-            <m:t>α</m:t>
-          </m:r>
-          <m:r>
-            <w:rPr>
-              <w:rFonts w:ascii="Cambria Math" w:eastAsiaTheme="minorEastAsia" w:hAnsi="Cambria Math"/>
-            </w:rPr>
-            <m:t>-</m:t>
+            <m:t>α-</m:t>
           </m:r>
           <m:f>
             <m:fPr>
@@ -1514,13 +1454,7 @@
             <w:rPr>
               <w:rFonts w:ascii="Cambria Math" w:eastAsiaTheme="minorEastAsia" w:hAnsi="Cambria Math"/>
             </w:rPr>
-            <m:t>γ</m:t>
-          </m:r>
-          <m:r>
-            <w:rPr>
-              <w:rFonts w:ascii="Cambria Math" w:eastAsiaTheme="minorEastAsia" w:hAnsi="Cambria Math"/>
-            </w:rPr>
-            <m:t>=</m:t>
+            <m:t>γ=</m:t>
           </m:r>
           <m:func>
             <m:funcPr>
@@ -3033,6 +2967,99 @@
         <w:t>Single – 4 bytes, double 8 bytes. Almost double the RAM memory</w:t>
       </w:r>
     </w:p>
+    <w:p/>
+    <w:p>
+      <w:pPr>
+        <w:pStyle w:val="ListParagraph"/>
+        <w:numPr>
+          <w:ilvl w:val="0"/>
+          <w:numId w:val="2"/>
+        </w:numPr>
+      </w:pPr>
+      <w:r>
+        <w:t>Working on implementing task execution timer.</w:t>
+      </w:r>
+    </w:p>
+    <w:p>
+      <w:pPr>
+        <w:pStyle w:val="ListParagraph"/>
+        <w:numPr>
+          <w:ilvl w:val="1"/>
+          <w:numId w:val="2"/>
+        </w:numPr>
+      </w:pPr>
+      <w:r>
+        <w:t>Data watchpoint (DWT) can be used to measure how long a task takes to execute</w:t>
+      </w:r>
+    </w:p>
+    <w:p/>
+    <w:p>
+      <w:r>
+        <w:t>12/10/26</w:t>
+      </w:r>
+    </w:p>
+    <w:p>
+      <w:r>
+        <w:lastRenderedPageBreak/>
+        <w:drawing>
+          <wp:inline distT="0" distB="0" distL="0" distR="0" wp14:anchorId="40D8DB52" wp14:editId="5A62AB6F">
+            <wp:extent cx="3743352" cy="3590951"/>
+            <wp:effectExtent l="0" t="0" r="9525" b="9525"/>
+            <wp:docPr id="1035862554" name="Picture 1"/>
+            <wp:cNvGraphicFramePr>
+              <a:graphicFrameLocks xmlns:a="http://schemas.openxmlformats.org/drawingml/2006/main" noChangeAspect="1"/>
+            </wp:cNvGraphicFramePr>
+            <a:graphic xmlns:a="http://schemas.openxmlformats.org/drawingml/2006/main">
+              <a:graphicData uri="http://schemas.openxmlformats.org/drawingml/2006/picture">
+                <pic:pic xmlns:pic="http://schemas.openxmlformats.org/drawingml/2006/picture">
+                  <pic:nvPicPr>
+                    <pic:cNvPr id="1035862554" name=""/>
+                    <pic:cNvPicPr/>
+                  </pic:nvPicPr>
+                  <pic:blipFill>
+                    <a:blip r:embed="rId5"/>
+                    <a:stretch>
+                      <a:fillRect/>
+                    </a:stretch>
+                  </pic:blipFill>
+                  <pic:spPr>
+                    <a:xfrm>
+                      <a:off x="0" y="0"/>
+                      <a:ext cx="3743352" cy="3590951"/>
+                    </a:xfrm>
+                    <a:prstGeom prst="rect">
+                      <a:avLst/>
+                    </a:prstGeom>
+                  </pic:spPr>
+                </pic:pic>
+              </a:graphicData>
+            </a:graphic>
+          </wp:inline>
+        </w:drawing>
+      </w:r>
+    </w:p>
+    <w:p>
+      <w:r>
+        <w:t>Pin stacking to enable ADC1_IN3 on PA2</w:t>
+      </w:r>
+    </w:p>
+    <w:p/>
+    <w:p>
+      <w:pPr>
+        <w:pStyle w:val="ListParagraph"/>
+        <w:numPr>
+          <w:ilvl w:val="0"/>
+          <w:numId w:val="2"/>
+        </w:numPr>
+      </w:pPr>
+      <w:r>
+        <w:t>LL_OPAMP_Enable</w:t>
+      </w:r>
+      <w:r>
+        <w:t xml:space="preserve"> is not configured automatically in Simulink, although it configures the OPAMP1/2/3 it does not enable them – therefore need to add custom code to call the function to enable the configured pins</w:t>
+      </w:r>
+    </w:p>
+    <w:p/>
     <w:sectPr>
       <w:pgSz w:w="11906" w:h="16838"/>
       <w:pgMar w:top="1440" w:right="1440" w:bottom="1440" w:left="1440" w:header="708" w:footer="708" w:gutter="0"/>

</xml_diff>

<commit_message>
Measure Phase W current + configure PGA internal
</commit_message>
<xml_diff>
--- a/Datasheet/Equations_SS.docx
+++ b/Datasheet/Equations_SS.docx
@@ -12,8 +12,16 @@
         <w:rPr>
           <w:rFonts w:eastAsiaTheme="minorEastAsia"/>
         </w:rPr>
-        <w:t>RT charactersitics</w:t>
+        <w:t xml:space="preserve">RT </w:t>
       </w:r>
+      <w:proofErr w:type="spellStart"/>
+      <w:r>
+        <w:rPr>
+          <w:rFonts w:eastAsiaTheme="minorEastAsia"/>
+        </w:rPr>
+        <w:t>charactersitics</w:t>
+      </w:r>
+      <w:proofErr w:type="spellEnd"/>
     </w:p>
     <w:p>
       <w:pPr>
@@ -2831,6 +2839,41 @@
     </w:p>
     <w:p/>
     <w:p/>
+    <w:p>
+      <w:r>
+        <w:t>Current sensing</w:t>
+      </w:r>
+    </w:p>
+    <w:p>
+      <w:sdt>
+        <w:sdtPr>
+          <w:rPr>
+            <w:rFonts w:ascii="Cambria Math" w:hAnsi="Cambria Math"/>
+            <w:i/>
+          </w:rPr>
+          <w:id w:val="-1423095431"/>
+          <w:placeholder>
+            <w:docPart w:val="DefaultPlaceholder_2098659789"/>
+          </w:placeholder>
+          <w:temporary/>
+          <w:showingPlcHdr/>
+          <w:equation/>
+        </w:sdtPr>
+        <w:sdtContent>
+          <m:oMathPara>
+            <m:oMath>
+              <m:r>
+                <w:rPr>
+                  <w:rStyle w:val="PlaceholderText"/>
+                  <w:rFonts w:ascii="Cambria Math" w:hAnsi="Cambria Math"/>
+                </w:rPr>
+                <m:t>Type equation here.</m:t>
+              </m:r>
+            </m:oMath>
+          </m:oMathPara>
+        </w:sdtContent>
+      </w:sdt>
+    </w:p>
     <w:p/>
     <w:p/>
     <w:p/>
@@ -2842,8 +2885,6 @@
     <w:p/>
     <w:p/>
     <w:p/>
-    <w:p/>
-    <w:p/>
     <w:p>
       <w:r>
         <w:lastRenderedPageBreak/>
@@ -2864,8 +2905,13 @@
         </w:numPr>
       </w:pPr>
       <w:r>
-        <w:t>Read Vbus</w:t>
+        <w:t xml:space="preserve">Read </w:t>
       </w:r>
+      <w:proofErr w:type="spellStart"/>
+      <w:r>
+        <w:t>Vbus</w:t>
+      </w:r>
+      <w:proofErr w:type="spellEnd"/>
     </w:p>
     <w:p>
       <w:pPr>
@@ -2876,7 +2922,15 @@
         </w:numPr>
       </w:pPr>
       <w:r>
-        <w:t>Can read temperature individually, if I try to read both VBus and ESC temperature then ADC stops working with monitor and tune</w:t>
+        <w:t xml:space="preserve">Can read temperature individually, if I try to read both </w:t>
+      </w:r>
+      <w:proofErr w:type="spellStart"/>
+      <w:r>
+        <w:t>VBus</w:t>
+      </w:r>
+      <w:proofErr w:type="spellEnd"/>
+      <w:r>
+        <w:t xml:space="preserve"> and ESC temperature then ADC stops working with monitor and tune</w:t>
       </w:r>
     </w:p>
     <w:p>
@@ -2900,8 +2954,21 @@
         </w:numPr>
       </w:pPr>
       <w:r>
-        <w:t>Added 50us task for FOC, had to change the model from FreeRTOS to Baremetal</w:t>
+        <w:t xml:space="preserve">Added 50us task for FOC, had to change the model from </w:t>
       </w:r>
+      <w:proofErr w:type="spellStart"/>
+      <w:r>
+        <w:t>FreeRTOS</w:t>
+      </w:r>
+      <w:proofErr w:type="spellEnd"/>
+      <w:r>
+        <w:t xml:space="preserve"> to </w:t>
+      </w:r>
+      <w:proofErr w:type="spellStart"/>
+      <w:r>
+        <w:t>Baremetal</w:t>
+      </w:r>
+      <w:proofErr w:type="spellEnd"/>
     </w:p>
     <w:p/>
     <w:p>
@@ -2918,7 +2985,15 @@
         </w:numPr>
       </w:pPr>
       <w:r>
-        <w:t xml:space="preserve">Successfully modelled Clarke, Park, inverse Park, and inverse Clarke transformations in order to convert from AC to DC control. </w:t>
+        <w:t xml:space="preserve">Successfully modelled Clarke, Park, inverse Park, and inverse Clarke transformations </w:t>
+      </w:r>
+      <w:proofErr w:type="gramStart"/>
+      <w:r>
+        <w:t>in order to</w:t>
+      </w:r>
+      <w:proofErr w:type="gramEnd"/>
+      <w:r>
+        <w:t xml:space="preserve"> convert from AC to DC control. </w:t>
       </w:r>
     </w:p>
     <w:p>
@@ -2935,8 +3010,29 @@
         </w:numPr>
       </w:pPr>
       <w:r>
-        <w:t>Implemented SVPWM which converts V_alpha, V_Beta to Da, Db, Dc duty ratios to obtain the Vref</w:t>
+        <w:t xml:space="preserve">Implemented SVPWM which converts </w:t>
       </w:r>
+      <w:proofErr w:type="spellStart"/>
+      <w:r>
+        <w:t>V_alpha</w:t>
+      </w:r>
+      <w:proofErr w:type="spellEnd"/>
+      <w:r>
+        <w:t xml:space="preserve">, </w:t>
+      </w:r>
+      <w:proofErr w:type="spellStart"/>
+      <w:r>
+        <w:t>V_Beta</w:t>
+      </w:r>
+      <w:proofErr w:type="spellEnd"/>
+      <w:r>
+        <w:t xml:space="preserve"> to Da, Db, Dc duty ratios to obtain the </w:t>
+      </w:r>
+      <w:proofErr w:type="spellStart"/>
+      <w:r>
+        <w:t>Vref</w:t>
+      </w:r>
+      <w:proofErr w:type="spellEnd"/>
     </w:p>
     <w:p>
       <w:r>
@@ -3052,14 +3148,34 @@
           <w:numId w:val="2"/>
         </w:numPr>
       </w:pPr>
+      <w:proofErr w:type="spellStart"/>
       <w:r>
         <w:t>LL_OPAMP_Enable</w:t>
       </w:r>
+      <w:proofErr w:type="spellEnd"/>
       <w:r>
         <w:t xml:space="preserve"> is not configured automatically in Simulink, although it configures the OPAMP1/2/3 it does not enable them – therefore need to add custom code to call the function to enable the configured pins</w:t>
       </w:r>
     </w:p>
     <w:p/>
+    <w:p/>
+    <w:p>
+      <w:r>
+        <w:t>Issues</w:t>
+      </w:r>
+    </w:p>
+    <w:p>
+      <w:pPr>
+        <w:pStyle w:val="ListParagraph"/>
+        <w:numPr>
+          <w:ilvl w:val="0"/>
+          <w:numId w:val="4"/>
+        </w:numPr>
+      </w:pPr>
+      <w:r>
+        <w:t xml:space="preserve">External mode viewing can cause the chip to slow down. </w:t>
+      </w:r>
+    </w:p>
     <w:sectPr>
       <w:pgSz w:w="11906" w:h="16838"/>
       <w:pgMar w:top="1440" w:right="1440" w:bottom="1440" w:left="1440" w:header="708" w:footer="708" w:gutter="0"/>
@@ -3073,6 +3189,95 @@
 <file path=word/numbering.xml><?xml version="1.0" encoding="utf-8"?>
 <w:numbering xmlns:wpc="http://schemas.microsoft.com/office/word/2010/wordprocessingCanvas" xmlns:cx="http://schemas.microsoft.com/office/drawing/2014/chartex" xmlns:cx1="http://schemas.microsoft.com/office/drawing/2015/9/8/chartex" xmlns:cx2="http://schemas.microsoft.com/office/drawing/2015/10/21/chartex" xmlns:cx3="http://schemas.microsoft.com/office/drawing/2016/5/9/chartex" xmlns:cx4="http://schemas.microsoft.com/office/drawing/2016/5/10/chartex" xmlns:cx5="http://schemas.microsoft.com/office/drawing/2016/5/11/chartex" xmlns:cx6="http://schemas.microsoft.com/office/drawing/2016/5/12/chartex" xmlns:cx7="http://schemas.microsoft.com/office/drawing/2016/5/13/chartex" xmlns:cx8="http://schemas.microsoft.com/office/drawing/2016/5/14/chartex" xmlns:mc="http://schemas.openxmlformats.org/markup-compatibility/2006" xmlns:aink="http://schemas.microsoft.com/office/drawing/2016/ink" xmlns:am3d="http://schemas.microsoft.com/office/drawing/2017/model3d" xmlns:o="urn:schemas-microsoft-com:office:office" xmlns:oel="http://schemas.microsoft.com/office/2019/extlst" xmlns:r="http://schemas.openxmlformats.org/officeDocument/2006/relationships" xmlns:m="http://schemas.openxmlformats.org/officeDocument/2006/math" xmlns:v="urn:schemas-microsoft-com:vml" xmlns:wp14="http://schemas.microsoft.com/office/word/2010/wordprocessingDrawing" xmlns:wp="http://schemas.openxmlformats.org/drawingml/2006/wordprocessingDrawing" xmlns:w10="urn:schemas-microsoft-com:office:word" xmlns:w="http://schemas.openxmlformats.org/wordprocessingml/2006/main" xmlns:w14="http://schemas.microsoft.com/office/word/2010/wordml" xmlns:w15="http://schemas.microsoft.com/office/word/2012/wordml" xmlns:w16cex="http://schemas.microsoft.com/office/word/2018/wordml/cex" xmlns:w16cid="http://schemas.microsoft.com/office/word/2016/wordml/cid" xmlns:w16="http://schemas.microsoft.com/office/word/2018/wordml" xmlns:w16du="http://schemas.microsoft.com/office/word/2023/wordml/word16du" xmlns:w16sdtdh="http://schemas.microsoft.com/office/word/2020/wordml/sdtdatahash" xmlns:w16sdtfl="http://schemas.microsoft.com/office/word/2024/wordml/sdtformatlock" xmlns:w16se="http://schemas.microsoft.com/office/word/2015/wordml/symex" xmlns:wpg="http://schemas.microsoft.com/office/word/2010/wordprocessingGroup" xmlns:wpi="http://schemas.microsoft.com/office/word/2010/wordprocessingInk" xmlns:wne="http://schemas.microsoft.com/office/word/2006/wordml" xmlns:wps="http://schemas.microsoft.com/office/word/2010/wordprocessingShape" mc:Ignorable="w14 w15 w16se w16cid w16 w16cex w16sdtdh w16sdtfl w16du wp14">
   <w:abstractNum w:abstractNumId="0" w15:restartNumberingAfterBreak="0">
+    <w:nsid w:val="20157DBB"/>
+    <w:multiLevelType w:val="hybridMultilevel"/>
+    <w:tmpl w:val="0832A076"/>
+    <w:lvl w:ilvl="0" w:tplc="0809000F">
+      <w:start w:val="1"/>
+      <w:numFmt w:val="decimal"/>
+      <w:lvlText w:val="%1."/>
+      <w:lvlJc w:val="left"/>
+      <w:pPr>
+        <w:ind w:left="720" w:hanging="360"/>
+      </w:pPr>
+      <w:rPr>
+        <w:rFonts w:hint="default"/>
+      </w:rPr>
+    </w:lvl>
+    <w:lvl w:ilvl="1" w:tplc="08090019" w:tentative="1">
+      <w:start w:val="1"/>
+      <w:numFmt w:val="lowerLetter"/>
+      <w:lvlText w:val="%2."/>
+      <w:lvlJc w:val="left"/>
+      <w:pPr>
+        <w:ind w:left="1440" w:hanging="360"/>
+      </w:pPr>
+    </w:lvl>
+    <w:lvl w:ilvl="2" w:tplc="0809001B" w:tentative="1">
+      <w:start w:val="1"/>
+      <w:numFmt w:val="lowerRoman"/>
+      <w:lvlText w:val="%3."/>
+      <w:lvlJc w:val="right"/>
+      <w:pPr>
+        <w:ind w:left="2160" w:hanging="180"/>
+      </w:pPr>
+    </w:lvl>
+    <w:lvl w:ilvl="3" w:tplc="0809000F" w:tentative="1">
+      <w:start w:val="1"/>
+      <w:numFmt w:val="decimal"/>
+      <w:lvlText w:val="%4."/>
+      <w:lvlJc w:val="left"/>
+      <w:pPr>
+        <w:ind w:left="2880" w:hanging="360"/>
+      </w:pPr>
+    </w:lvl>
+    <w:lvl w:ilvl="4" w:tplc="08090019" w:tentative="1">
+      <w:start w:val="1"/>
+      <w:numFmt w:val="lowerLetter"/>
+      <w:lvlText w:val="%5."/>
+      <w:lvlJc w:val="left"/>
+      <w:pPr>
+        <w:ind w:left="3600" w:hanging="360"/>
+      </w:pPr>
+    </w:lvl>
+    <w:lvl w:ilvl="5" w:tplc="0809001B" w:tentative="1">
+      <w:start w:val="1"/>
+      <w:numFmt w:val="lowerRoman"/>
+      <w:lvlText w:val="%6."/>
+      <w:lvlJc w:val="right"/>
+      <w:pPr>
+        <w:ind w:left="4320" w:hanging="180"/>
+      </w:pPr>
+    </w:lvl>
+    <w:lvl w:ilvl="6" w:tplc="0809000F" w:tentative="1">
+      <w:start w:val="1"/>
+      <w:numFmt w:val="decimal"/>
+      <w:lvlText w:val="%7."/>
+      <w:lvlJc w:val="left"/>
+      <w:pPr>
+        <w:ind w:left="5040" w:hanging="360"/>
+      </w:pPr>
+    </w:lvl>
+    <w:lvl w:ilvl="7" w:tplc="08090019" w:tentative="1">
+      <w:start w:val="1"/>
+      <w:numFmt w:val="lowerLetter"/>
+      <w:lvlText w:val="%8."/>
+      <w:lvlJc w:val="left"/>
+      <w:pPr>
+        <w:ind w:left="5760" w:hanging="360"/>
+      </w:pPr>
+    </w:lvl>
+    <w:lvl w:ilvl="8" w:tplc="0809001B" w:tentative="1">
+      <w:start w:val="1"/>
+      <w:numFmt w:val="lowerRoman"/>
+      <w:lvlText w:val="%9."/>
+      <w:lvlJc w:val="right"/>
+      <w:pPr>
+        <w:ind w:left="6480" w:hanging="180"/>
+      </w:pPr>
+    </w:lvl>
+  </w:abstractNum>
+  <w:abstractNum w:abstractNumId="1" w15:restartNumberingAfterBreak="0">
     <w:nsid w:val="2AEE32C3"/>
     <w:multiLevelType w:val="hybridMultilevel"/>
     <w:tmpl w:val="11380822"/>
@@ -3185,7 +3390,7 @@
       </w:rPr>
     </w:lvl>
   </w:abstractNum>
-  <w:abstractNum w:abstractNumId="1" w15:restartNumberingAfterBreak="0">
+  <w:abstractNum w:abstractNumId="2" w15:restartNumberingAfterBreak="0">
     <w:nsid w:val="309F702B"/>
     <w:multiLevelType w:val="hybridMultilevel"/>
     <w:tmpl w:val="4DF630A8"/>
@@ -3274,7 +3479,7 @@
       </w:pPr>
     </w:lvl>
   </w:abstractNum>
-  <w:abstractNum w:abstractNumId="2" w15:restartNumberingAfterBreak="0">
+  <w:abstractNum w:abstractNumId="3" w15:restartNumberingAfterBreak="0">
     <w:nsid w:val="32174A66"/>
     <w:multiLevelType w:val="hybridMultilevel"/>
     <w:tmpl w:val="69EA9980"/>
@@ -3388,13 +3593,16 @@
     </w:lvl>
   </w:abstractNum>
   <w:num w:numId="1" w16cid:durableId="681712428">
+    <w:abstractNumId w:val="2"/>
+  </w:num>
+  <w:num w:numId="2" w16cid:durableId="964234818">
     <w:abstractNumId w:val="1"/>
   </w:num>
-  <w:num w:numId="2" w16cid:durableId="964234818">
+  <w:num w:numId="3" w16cid:durableId="1017580037">
+    <w:abstractNumId w:val="3"/>
+  </w:num>
+  <w:num w:numId="4" w16cid:durableId="1122264567">
     <w:abstractNumId w:val="0"/>
-  </w:num>
-  <w:num w:numId="3" w16cid:durableId="1017580037">
-    <w:abstractNumId w:val="2"/>
   </w:num>
 </w:numbering>
 </file>
@@ -4330,6 +4538,580 @@
 </w:styles>
 </file>
 
+<file path=word/glossary/document.xml><?xml version="1.0" encoding="utf-8"?>
+<w:glossaryDocument xmlns:wpc="http://schemas.microsoft.com/office/word/2010/wordprocessingCanvas" xmlns:cx="http://schemas.microsoft.com/office/drawing/2014/chartex" xmlns:cx1="http://schemas.microsoft.com/office/drawing/2015/9/8/chartex" xmlns:cx2="http://schemas.microsoft.com/office/drawing/2015/10/21/chartex" xmlns:cx3="http://schemas.microsoft.com/office/drawing/2016/5/9/chartex" xmlns:cx4="http://schemas.microsoft.com/office/drawing/2016/5/10/chartex" xmlns:cx5="http://schemas.microsoft.com/office/drawing/2016/5/11/chartex" xmlns:cx6="http://schemas.microsoft.com/office/drawing/2016/5/12/chartex" xmlns:cx7="http://schemas.microsoft.com/office/drawing/2016/5/13/chartex" xmlns:cx8="http://schemas.microsoft.com/office/drawing/2016/5/14/chartex" xmlns:mc="http://schemas.openxmlformats.org/markup-compatibility/2006" xmlns:aink="http://schemas.microsoft.com/office/drawing/2016/ink" xmlns:am3d="http://schemas.microsoft.com/office/drawing/2017/model3d" xmlns:o="urn:schemas-microsoft-com:office:office" xmlns:oel="http://schemas.microsoft.com/office/2019/extlst" xmlns:r="http://schemas.openxmlformats.org/officeDocument/2006/relationships" xmlns:m="http://schemas.openxmlformats.org/officeDocument/2006/math" xmlns:v="urn:schemas-microsoft-com:vml" xmlns:wp14="http://schemas.microsoft.com/office/word/2010/wordprocessingDrawing" xmlns:wp="http://schemas.openxmlformats.org/drawingml/2006/wordprocessingDrawing" xmlns:w10="urn:schemas-microsoft-com:office:word" xmlns:w="http://schemas.openxmlformats.org/wordprocessingml/2006/main" xmlns:w14="http://schemas.microsoft.com/office/word/2010/wordml" xmlns:w15="http://schemas.microsoft.com/office/word/2012/wordml" xmlns:w16cex="http://schemas.microsoft.com/office/word/2018/wordml/cex" xmlns:w16cid="http://schemas.microsoft.com/office/word/2016/wordml/cid" xmlns:w16="http://schemas.microsoft.com/office/word/2018/wordml" xmlns:w16du="http://schemas.microsoft.com/office/word/2023/wordml/word16du" xmlns:w16sdtdh="http://schemas.microsoft.com/office/word/2020/wordml/sdtdatahash" xmlns:w16sdtfl="http://schemas.microsoft.com/office/word/2024/wordml/sdtformatlock" xmlns:w16se="http://schemas.microsoft.com/office/word/2015/wordml/symex" xmlns:wpg="http://schemas.microsoft.com/office/word/2010/wordprocessingGroup" xmlns:wpi="http://schemas.microsoft.com/office/word/2010/wordprocessingInk" xmlns:wne="http://schemas.microsoft.com/office/word/2006/wordml" xmlns:wps="http://schemas.microsoft.com/office/word/2010/wordprocessingShape" mc:Ignorable="w14 w15 w16se w16cid w16 w16cex w16sdtdh w16sdtfl w16du wp14">
+  <w:docParts>
+    <w:docPart>
+      <w:docPartPr>
+        <w:name w:val="DefaultPlaceholder_2098659789"/>
+        <w:category>
+          <w:name w:val="General"/>
+          <w:gallery w:val="placeholder"/>
+        </w:category>
+        <w:types>
+          <w:type w:val="bbPlcHdr"/>
+        </w:types>
+        <w:behaviors>
+          <w:behavior w:val="content"/>
+        </w:behaviors>
+        <w:guid w:val="{6F2CD091-2851-4303-8CA9-8516E286FFEC}"/>
+      </w:docPartPr>
+      <w:docPartBody>
+        <w:p>
+          <w:r>
+            <w:rPr>
+              <w:rStyle w:val="PlaceholderText"/>
+            </w:rPr>
+            <w:t>Type equation here.</w:t>
+          </w:r>
+        </w:p>
+      </w:docPartBody>
+    </w:docPart>
+  </w:docParts>
+</w:glossaryDocument>
+</file>
+
+<file path=word/glossary/fontTable.xml><?xml version="1.0" encoding="utf-8"?>
+<w:fonts xmlns:mc="http://schemas.openxmlformats.org/markup-compatibility/2006" xmlns:r="http://schemas.openxmlformats.org/officeDocument/2006/relationships" xmlns:w="http://schemas.openxmlformats.org/wordprocessingml/2006/main" xmlns:w14="http://schemas.microsoft.com/office/word/2010/wordml" xmlns:w15="http://schemas.microsoft.com/office/word/2012/wordml" xmlns:w16cex="http://schemas.microsoft.com/office/word/2018/wordml/cex" xmlns:w16cid="http://schemas.microsoft.com/office/word/2016/wordml/cid" xmlns:w16="http://schemas.microsoft.com/office/word/2018/wordml" xmlns:w16du="http://schemas.microsoft.com/office/word/2023/wordml/word16du" xmlns:w16sdtdh="http://schemas.microsoft.com/office/word/2020/wordml/sdtdatahash" xmlns:w16sdtfl="http://schemas.microsoft.com/office/word/2024/wordml/sdtformatlock" xmlns:w16se="http://schemas.microsoft.com/office/word/2015/wordml/symex" mc:Ignorable="w14 w15 w16se w16cid w16 w16cex w16sdtdh w16sdtfl w16du">
+  <w:font w:name="Times New Roman">
+    <w:panose1 w:val="02020603050405020304"/>
+    <w:charset w:val="00"/>
+    <w:family w:val="roman"/>
+    <w:pitch w:val="variable"/>
+    <w:sig w:usb0="E0002EFF" w:usb1="C000785B" w:usb2="00000009" w:usb3="00000000" w:csb0="000001FF" w:csb1="00000000"/>
+  </w:font>
+  <w:font w:name="Aptos">
+    <w:charset w:val="00"/>
+    <w:family w:val="swiss"/>
+    <w:pitch w:val="variable"/>
+    <w:sig w:usb0="20000287" w:usb1="00000003" w:usb2="00000000" w:usb3="00000000" w:csb0="0000019F" w:csb1="00000000"/>
+  </w:font>
+  <w:font w:name="Courier New">
+    <w:panose1 w:val="02070309020205020404"/>
+    <w:charset w:val="00"/>
+    <w:family w:val="modern"/>
+    <w:pitch w:val="fixed"/>
+    <w:sig w:usb0="E0002EFF" w:usb1="C0007843" w:usb2="00000009" w:usb3="00000000" w:csb0="000001FF" w:csb1="00000000"/>
+  </w:font>
+  <w:font w:name="Wingdings">
+    <w:panose1 w:val="05000000000000000000"/>
+    <w:charset w:val="02"/>
+    <w:family w:val="auto"/>
+    <w:pitch w:val="variable"/>
+    <w:sig w:usb0="00000000" w:usb1="10000000" w:usb2="00000000" w:usb3="00000000" w:csb0="80000000" w:csb1="00000000"/>
+  </w:font>
+  <w:font w:name="Symbol">
+    <w:panose1 w:val="05050102010706020507"/>
+    <w:charset w:val="02"/>
+    <w:family w:val="roman"/>
+    <w:pitch w:val="variable"/>
+    <w:sig w:usb0="00000000" w:usb1="10000000" w:usb2="00000000" w:usb3="00000000" w:csb0="80000000" w:csb1="00000000"/>
+  </w:font>
+  <w:font w:name="Aptos Display">
+    <w:charset w:val="00"/>
+    <w:family w:val="swiss"/>
+    <w:pitch w:val="variable"/>
+    <w:sig w:usb0="20000287" w:usb1="00000003" w:usb2="00000000" w:usb3="00000000" w:csb0="0000019F" w:csb1="00000000"/>
+  </w:font>
+  <w:font w:name="Cambria Math">
+    <w:panose1 w:val="02040503050406030204"/>
+    <w:charset w:val="00"/>
+    <w:family w:val="roman"/>
+    <w:pitch w:val="variable"/>
+    <w:sig w:usb0="E00006FF" w:usb1="420024FF" w:usb2="02000000" w:usb3="00000000" w:csb0="0000019F" w:csb1="00000000"/>
+  </w:font>
+</w:fonts>
+</file>
+
+<file path=word/glossary/settings.xml><?xml version="1.0" encoding="utf-8"?>
+<w:settings xmlns:mc="http://schemas.openxmlformats.org/markup-compatibility/2006" xmlns:o="urn:schemas-microsoft-com:office:office" xmlns:r="http://schemas.openxmlformats.org/officeDocument/2006/relationships" xmlns:m="http://schemas.openxmlformats.org/officeDocument/2006/math" xmlns:v="urn:schemas-microsoft-com:vml" xmlns:w10="urn:schemas-microsoft-com:office:word" xmlns:w="http://schemas.openxmlformats.org/wordprocessingml/2006/main" xmlns:w14="http://schemas.microsoft.com/office/word/2010/wordml" xmlns:w15="http://schemas.microsoft.com/office/word/2012/wordml" xmlns:w16cex="http://schemas.microsoft.com/office/word/2018/wordml/cex" xmlns:w16cid="http://schemas.microsoft.com/office/word/2016/wordml/cid" xmlns:w16="http://schemas.microsoft.com/office/word/2018/wordml" xmlns:w16du="http://schemas.microsoft.com/office/word/2023/wordml/word16du" xmlns:w16sdtdh="http://schemas.microsoft.com/office/word/2020/wordml/sdtdatahash" xmlns:w16sdtfl="http://schemas.microsoft.com/office/word/2024/wordml/sdtformatlock" xmlns:w16se="http://schemas.microsoft.com/office/word/2015/wordml/symex" xmlns:sl="http://schemas.openxmlformats.org/schemaLibrary/2006/main" mc:Ignorable="w14 w15 w16se w16cid w16 w16cex w16sdtdh w16sdtfl w16du">
+  <w:view w:val="normal"/>
+  <w:defaultTabStop w:val="720"/>
+  <w:characterSpacingControl w:val="doNotCompress"/>
+  <w:compat>
+    <w:useFELayout/>
+    <w:compatSetting w:name="compatibilityMode" w:uri="http://schemas.microsoft.com/office/word" w:val="15"/>
+    <w:compatSetting w:name="overrideTableStyleFontSizeAndJustification" w:uri="http://schemas.microsoft.com/office/word" w:val="1"/>
+    <w:compatSetting w:name="enableOpenTypeFeatures" w:uri="http://schemas.microsoft.com/office/word" w:val="1"/>
+    <w:compatSetting w:name="doNotFlipMirrorIndents" w:uri="http://schemas.microsoft.com/office/word" w:val="1"/>
+    <w:compatSetting w:name="differentiateMultirowTableHeaders" w:uri="http://schemas.microsoft.com/office/word" w:val="1"/>
+    <w:compatSetting w:name="useWord2013TrackBottomHyphenation" w:uri="http://schemas.microsoft.com/office/word" w:val="0"/>
+  </w:compat>
+  <w:rsids>
+    <w:rsidRoot w:val="00733703"/>
+    <w:rsid w:val="00400C21"/>
+    <w:rsid w:val="00733703"/>
+    <w:rsid w:val="00FF782D"/>
+  </w:rsids>
+  <m:mathPr>
+    <m:mathFont m:val="Cambria Math"/>
+    <m:brkBin m:val="before"/>
+    <m:brkBinSub m:val="--"/>
+    <m:smallFrac m:val="0"/>
+    <m:dispDef/>
+    <m:lMargin m:val="0"/>
+    <m:rMargin m:val="0"/>
+    <m:defJc m:val="centerGroup"/>
+    <m:wrapIndent m:val="1440"/>
+    <m:intLim m:val="subSup"/>
+    <m:naryLim m:val="undOvr"/>
+  </m:mathPr>
+  <w:themeFontLang w:val="en-GB"/>
+  <w:clrSchemeMapping w:bg1="light1" w:t1="dark1" w:bg2="light2" w:t2="dark2" w:accent1="accent1" w:accent2="accent2" w:accent3="accent3" w:accent4="accent4" w:accent5="accent5" w:accent6="accent6" w:hyperlink="hyperlink" w:followedHyperlink="followedHyperlink"/>
+  <w:decimalSymbol w:val="."/>
+  <w:listSeparator w:val=","/>
+  <w15:chartTrackingRefBased/>
+</w:settings>
+</file>
+
+<file path=word/glossary/styles.xml><?xml version="1.0" encoding="utf-8"?>
+<w:styles xmlns:mc="http://schemas.openxmlformats.org/markup-compatibility/2006" xmlns:r="http://schemas.openxmlformats.org/officeDocument/2006/relationships" xmlns:w="http://schemas.openxmlformats.org/wordprocessingml/2006/main" xmlns:w14="http://schemas.microsoft.com/office/word/2010/wordml" xmlns:w15="http://schemas.microsoft.com/office/word/2012/wordml" xmlns:w16cex="http://schemas.microsoft.com/office/word/2018/wordml/cex" xmlns:w16cid="http://schemas.microsoft.com/office/word/2016/wordml/cid" xmlns:w16="http://schemas.microsoft.com/office/word/2018/wordml" xmlns:w16du="http://schemas.microsoft.com/office/word/2023/wordml/word16du" xmlns:w16sdtdh="http://schemas.microsoft.com/office/word/2020/wordml/sdtdatahash" xmlns:w16sdtfl="http://schemas.microsoft.com/office/word/2024/wordml/sdtformatlock" xmlns:w16se="http://schemas.microsoft.com/office/word/2015/wordml/symex" mc:Ignorable="w14 w15 w16se w16cid w16 w16cex w16sdtdh w16sdtfl w16du">
+  <w:docDefaults>
+    <w:rPrDefault>
+      <w:rPr>
+        <w:rFonts w:asciiTheme="minorHAnsi" w:eastAsiaTheme="minorEastAsia" w:hAnsiTheme="minorHAnsi" w:cstheme="minorBidi"/>
+        <w:kern w:val="2"/>
+        <w:sz w:val="24"/>
+        <w:szCs w:val="24"/>
+        <w:lang w:val="en-GB" w:eastAsia="en-GB" w:bidi="ar-SA"/>
+        <w14:ligatures w14:val="standardContextual"/>
+      </w:rPr>
+    </w:rPrDefault>
+    <w:pPrDefault>
+      <w:pPr>
+        <w:spacing w:after="160" w:line="278" w:lineRule="auto"/>
+      </w:pPr>
+    </w:pPrDefault>
+  </w:docDefaults>
+  <w:latentStyles w:defLockedState="0" w:defUIPriority="99" w:defSemiHidden="0" w:defUnhideWhenUsed="0" w:defQFormat="0" w:count="376">
+    <w:lsdException w:name="Normal" w:uiPriority="0" w:qFormat="1"/>
+    <w:lsdException w:name="heading 1" w:uiPriority="9" w:qFormat="1"/>
+    <w:lsdException w:name="heading 2" w:semiHidden="1" w:uiPriority="9" w:unhideWhenUsed="1" w:qFormat="1"/>
+    <w:lsdException w:name="heading 3" w:semiHidden="1" w:uiPriority="9" w:unhideWhenUsed="1" w:qFormat="1"/>
+    <w:lsdException w:name="heading 4" w:semiHidden="1" w:uiPriority="9" w:unhideWhenUsed="1" w:qFormat="1"/>
+    <w:lsdException w:name="heading 5" w:semiHidden="1" w:uiPriority="9" w:unhideWhenUsed="1" w:qFormat="1"/>
+    <w:lsdException w:name="heading 6" w:semiHidden="1" w:uiPriority="9" w:unhideWhenUsed="1" w:qFormat="1"/>
+    <w:lsdException w:name="heading 7" w:semiHidden="1" w:uiPriority="9" w:unhideWhenUsed="1" w:qFormat="1"/>
+    <w:lsdException w:name="heading 8" w:semiHidden="1" w:uiPriority="9" w:unhideWhenUsed="1" w:qFormat="1"/>
+    <w:lsdException w:name="heading 9" w:semiHidden="1" w:uiPriority="9" w:unhideWhenUsed="1" w:qFormat="1"/>
+    <w:lsdException w:name="index 1" w:semiHidden="1" w:unhideWhenUsed="1"/>
+    <w:lsdException w:name="index 2" w:semiHidden="1" w:unhideWhenUsed="1"/>
+    <w:lsdException w:name="index 3" w:semiHidden="1" w:unhideWhenUsed="1"/>
+    <w:lsdException w:name="index 4" w:semiHidden="1" w:unhideWhenUsed="1"/>
+    <w:lsdException w:name="index 5" w:semiHidden="1" w:unhideWhenUsed="1"/>
+    <w:lsdException w:name="index 6" w:semiHidden="1" w:unhideWhenUsed="1"/>
+    <w:lsdException w:name="index 7" w:semiHidden="1" w:unhideWhenUsed="1"/>
+    <w:lsdException w:name="index 8" w:semiHidden="1" w:unhideWhenUsed="1"/>
+    <w:lsdException w:name="index 9" w:semiHidden="1" w:unhideWhenUsed="1"/>
+    <w:lsdException w:name="toc 1" w:semiHidden="1" w:uiPriority="39" w:unhideWhenUsed="1"/>
+    <w:lsdException w:name="toc 2" w:semiHidden="1" w:uiPriority="39" w:unhideWhenUsed="1"/>
+    <w:lsdException w:name="toc 3" w:semiHidden="1" w:uiPriority="39" w:unhideWhenUsed="1"/>
+    <w:lsdException w:name="toc 4" w:semiHidden="1" w:uiPriority="39" w:unhideWhenUsed="1"/>
+    <w:lsdException w:name="toc 5" w:semiHidden="1" w:uiPriority="39" w:unhideWhenUsed="1"/>
+    <w:lsdException w:name="toc 6" w:semiHidden="1" w:uiPriority="39" w:unhideWhenUsed="1"/>
+    <w:lsdException w:name="toc 7" w:semiHidden="1" w:uiPriority="39" w:unhideWhenUsed="1"/>
+    <w:lsdException w:name="toc 8" w:semiHidden="1" w:uiPriority="39" w:unhideWhenUsed="1"/>
+    <w:lsdException w:name="toc 9" w:semiHidden="1" w:uiPriority="39" w:unhideWhenUsed="1"/>
+    <w:lsdException w:name="Normal Indent" w:semiHidden="1" w:unhideWhenUsed="1"/>
+    <w:lsdException w:name="footnote text" w:semiHidden="1" w:unhideWhenUsed="1"/>
+    <w:lsdException w:name="annotation text" w:semiHidden="1" w:unhideWhenUsed="1"/>
+    <w:lsdException w:name="header" w:semiHidden="1" w:unhideWhenUsed="1"/>
+    <w:lsdException w:name="footer" w:semiHidden="1" w:unhideWhenUsed="1"/>
+    <w:lsdException w:name="index heading" w:semiHidden="1" w:unhideWhenUsed="1"/>
+    <w:lsdException w:name="caption" w:semiHidden="1" w:uiPriority="35" w:unhideWhenUsed="1" w:qFormat="1"/>
+    <w:lsdException w:name="table of figures" w:semiHidden="1" w:unhideWhenUsed="1"/>
+    <w:lsdException w:name="envelope address" w:semiHidden="1" w:unhideWhenUsed="1"/>
+    <w:lsdException w:name="envelope return" w:semiHidden="1" w:unhideWhenUsed="1"/>
+    <w:lsdException w:name="footnote reference" w:semiHidden="1" w:unhideWhenUsed="1"/>
+    <w:lsdException w:name="annotation reference" w:semiHidden="1" w:unhideWhenUsed="1"/>
+    <w:lsdException w:name="line number" w:semiHidden="1" w:unhideWhenUsed="1"/>
+    <w:lsdException w:name="page number" w:semiHidden="1" w:unhideWhenUsed="1"/>
+    <w:lsdException w:name="endnote reference" w:semiHidden="1" w:unhideWhenUsed="1"/>
+    <w:lsdException w:name="endnote text" w:semiHidden="1" w:unhideWhenUsed="1"/>
+    <w:lsdException w:name="table of authorities" w:semiHidden="1" w:unhideWhenUsed="1"/>
+    <w:lsdException w:name="macro" w:semiHidden="1" w:unhideWhenUsed="1"/>
+    <w:lsdException w:name="toa heading" w:semiHidden="1" w:unhideWhenUsed="1"/>
+    <w:lsdException w:name="List" w:semiHidden="1" w:unhideWhenUsed="1"/>
+    <w:lsdException w:name="List Bullet" w:semiHidden="1" w:unhideWhenUsed="1"/>
+    <w:lsdException w:name="List Number" w:semiHidden="1" w:unhideWhenUsed="1"/>
+    <w:lsdException w:name="List 2" w:semiHidden="1" w:unhideWhenUsed="1"/>
+    <w:lsdException w:name="List 3" w:semiHidden="1" w:unhideWhenUsed="1"/>
+    <w:lsdException w:name="List 4" w:semiHidden="1" w:unhideWhenUsed="1"/>
+    <w:lsdException w:name="List 5" w:semiHidden="1" w:unhideWhenUsed="1"/>
+    <w:lsdException w:name="List Bullet 2" w:semiHidden="1" w:unhideWhenUsed="1"/>
+    <w:lsdException w:name="List Bullet 3" w:semiHidden="1" w:unhideWhenUsed="1"/>
+    <w:lsdException w:name="List Bullet 4" w:semiHidden="1" w:unhideWhenUsed="1"/>
+    <w:lsdException w:name="List Bullet 5" w:semiHidden="1" w:unhideWhenUsed="1"/>
+    <w:lsdException w:name="List Number 2" w:semiHidden="1" w:unhideWhenUsed="1"/>
+    <w:lsdException w:name="List Number 3" w:semiHidden="1" w:unhideWhenUsed="1"/>
+    <w:lsdException w:name="List Number 4" w:semiHidden="1" w:unhideWhenUsed="1"/>
+    <w:lsdException w:name="List Number 5" w:semiHidden="1" w:unhideWhenUsed="1"/>
+    <w:lsdException w:name="Title" w:uiPriority="10" w:qFormat="1"/>
+    <w:lsdException w:name="Closing" w:semiHidden="1" w:unhideWhenUsed="1"/>
+    <w:lsdException w:name="Signature" w:semiHidden="1" w:unhideWhenUsed="1"/>
+    <w:lsdException w:name="Default Paragraph Font" w:semiHidden="1" w:uiPriority="1" w:unhideWhenUsed="1"/>
+    <w:lsdException w:name="Body Text" w:semiHidden="1" w:unhideWhenUsed="1"/>
+    <w:lsdException w:name="Body Text Indent" w:semiHidden="1" w:unhideWhenUsed="1"/>
+    <w:lsdException w:name="List Continue" w:semiHidden="1" w:unhideWhenUsed="1"/>
+    <w:lsdException w:name="List Continue 2" w:semiHidden="1" w:unhideWhenUsed="1"/>
+    <w:lsdException w:name="List Continue 3" w:semiHidden="1" w:unhideWhenUsed="1"/>
+    <w:lsdException w:name="List Continue 4" w:semiHidden="1" w:unhideWhenUsed="1"/>
+    <w:lsdException w:name="List Continue 5" w:semiHidden="1" w:unhideWhenUsed="1"/>
+    <w:lsdException w:name="Message Header" w:semiHidden="1" w:unhideWhenUsed="1"/>
+    <w:lsdException w:name="Subtitle" w:uiPriority="11" w:qFormat="1"/>
+    <w:lsdException w:name="Salutation" w:semiHidden="1" w:unhideWhenUsed="1"/>
+    <w:lsdException w:name="Date" w:semiHidden="1" w:unhideWhenUsed="1"/>
+    <w:lsdException w:name="Body Text First Indent" w:semiHidden="1" w:unhideWhenUsed="1"/>
+    <w:lsdException w:name="Body Text First Indent 2" w:semiHidden="1" w:unhideWhenUsed="1"/>
+    <w:lsdException w:name="Note Heading" w:semiHidden="1" w:unhideWhenUsed="1"/>
+    <w:lsdException w:name="Body Text 2" w:semiHidden="1" w:unhideWhenUsed="1"/>
+    <w:lsdException w:name="Body Text 3" w:semiHidden="1" w:unhideWhenUsed="1"/>
+    <w:lsdException w:name="Body Text Indent 2" w:semiHidden="1" w:unhideWhenUsed="1"/>
+    <w:lsdException w:name="Body Text Indent 3" w:semiHidden="1" w:unhideWhenUsed="1"/>
+    <w:lsdException w:name="Block Text" w:semiHidden="1" w:unhideWhenUsed="1"/>
+    <w:lsdException w:name="Hyperlink" w:semiHidden="1" w:unhideWhenUsed="1"/>
+    <w:lsdException w:name="FollowedHyperlink" w:semiHidden="1" w:unhideWhenUsed="1"/>
+    <w:lsdException w:name="Strong" w:uiPriority="22" w:qFormat="1"/>
+    <w:lsdException w:name="Emphasis" w:uiPriority="20" w:qFormat="1"/>
+    <w:lsdException w:name="Document Map" w:semiHidden="1" w:unhideWhenUsed="1"/>
+    <w:lsdException w:name="Plain Text" w:semiHidden="1" w:unhideWhenUsed="1"/>
+    <w:lsdException w:name="E-mail Signature" w:semiHidden="1" w:unhideWhenUsed="1"/>
+    <w:lsdException w:name="HTML Top of Form" w:semiHidden="1" w:unhideWhenUsed="1"/>
+    <w:lsdException w:name="HTML Bottom of Form" w:semiHidden="1" w:unhideWhenUsed="1"/>
+    <w:lsdException w:name="Normal (Web)" w:semiHidden="1" w:unhideWhenUsed="1"/>
+    <w:lsdException w:name="HTML Acronym" w:semiHidden="1" w:unhideWhenUsed="1"/>
+    <w:lsdException w:name="HTML Address" w:semiHidden="1" w:unhideWhenUsed="1"/>
+    <w:lsdException w:name="HTML Cite" w:semiHidden="1" w:unhideWhenUsed="1"/>
+    <w:lsdException w:name="HTML Code" w:semiHidden="1" w:unhideWhenUsed="1"/>
+    <w:lsdException w:name="HTML Definition" w:semiHidden="1" w:unhideWhenUsed="1"/>
+    <w:lsdException w:name="HTML Keyboard" w:semiHidden="1" w:unhideWhenUsed="1"/>
+    <w:lsdException w:name="HTML Preformatted" w:semiHidden="1" w:unhideWhenUsed="1"/>
+    <w:lsdException w:name="HTML Sample" w:semiHidden="1" w:unhideWhenUsed="1"/>
+    <w:lsdException w:name="HTML Typewriter" w:semiHidden="1" w:unhideWhenUsed="1"/>
+    <w:lsdException w:name="HTML Variable" w:semiHidden="1" w:unhideWhenUsed="1"/>
+    <w:lsdException w:name="Normal Table" w:semiHidden="1" w:unhideWhenUsed="1"/>
+    <w:lsdException w:name="annotation subject" w:semiHidden="1" w:unhideWhenUsed="1"/>
+    <w:lsdException w:name="No List" w:semiHidden="1" w:unhideWhenUsed="1"/>
+    <w:lsdException w:name="Outline List 1" w:semiHidden="1" w:unhideWhenUsed="1"/>
+    <w:lsdException w:name="Outline List 2" w:semiHidden="1" w:unhideWhenUsed="1"/>
+    <w:lsdException w:name="Outline List 3" w:semiHidden="1" w:unhideWhenUsed="1"/>
+    <w:lsdException w:name="Table Simple 1" w:semiHidden="1" w:unhideWhenUsed="1"/>
+    <w:lsdException w:name="Table Simple 2" w:semiHidden="1" w:unhideWhenUsed="1"/>
+    <w:lsdException w:name="Table Simple 3" w:semiHidden="1" w:unhideWhenUsed="1"/>
+    <w:lsdException w:name="Table Classic 1" w:semiHidden="1" w:unhideWhenUsed="1"/>
+    <w:lsdException w:name="Table Classic 2" w:semiHidden="1" w:unhideWhenUsed="1"/>
+    <w:lsdException w:name="Table Classic 3" w:semiHidden="1" w:unhideWhenUsed="1"/>
+    <w:lsdException w:name="Table Classic 4" w:semiHidden="1" w:unhideWhenUsed="1"/>
+    <w:lsdException w:name="Table Colorful 1" w:semiHidden="1" w:unhideWhenUsed="1"/>
+    <w:lsdException w:name="Table Colorful 2" w:semiHidden="1" w:unhideWhenUsed="1"/>
+    <w:lsdException w:name="Table Colorful 3" w:semiHidden="1" w:unhideWhenUsed="1"/>
+    <w:lsdException w:name="Table Columns 1" w:semiHidden="1" w:unhideWhenUsed="1"/>
+    <w:lsdException w:name="Table Columns 2" w:semiHidden="1" w:unhideWhenUsed="1"/>
+    <w:lsdException w:name="Table Columns 3" w:semiHidden="1" w:unhideWhenUsed="1"/>
+    <w:lsdException w:name="Table Columns 4" w:semiHidden="1" w:unhideWhenUsed="1"/>
+    <w:lsdException w:name="Table Columns 5" w:semiHidden="1" w:unhideWhenUsed="1"/>
+    <w:lsdException w:name="Table Grid 1" w:semiHidden="1" w:unhideWhenUsed="1"/>
+    <w:lsdException w:name="Table Grid 2" w:semiHidden="1" w:unhideWhenUsed="1"/>
+    <w:lsdException w:name="Table Grid 3" w:semiHidden="1" w:unhideWhenUsed="1"/>
+    <w:lsdException w:name="Table Grid 4" w:semiHidden="1" w:unhideWhenUsed="1"/>
+    <w:lsdException w:name="Table Grid 5" w:semiHidden="1" w:unhideWhenUsed="1"/>
+    <w:lsdException w:name="Table Grid 6" w:semiHidden="1" w:unhideWhenUsed="1"/>
+    <w:lsdException w:name="Table Grid 7" w:semiHidden="1" w:unhideWhenUsed="1"/>
+    <w:lsdException w:name="Table Grid 8" w:semiHidden="1" w:unhideWhenUsed="1"/>
+    <w:lsdException w:name="Table List 1" w:semiHidden="1" w:unhideWhenUsed="1"/>
+    <w:lsdException w:name="Table List 2" w:semiHidden="1" w:unhideWhenUsed="1"/>
+    <w:lsdException w:name="Table List 3" w:semiHidden="1" w:unhideWhenUsed="1"/>
+    <w:lsdException w:name="Table List 4" w:semiHidden="1" w:unhideWhenUsed="1"/>
+    <w:lsdException w:name="Table List 5" w:semiHidden="1" w:unhideWhenUsed="1"/>
+    <w:lsdException w:name="Table List 6" w:semiHidden="1" w:unhideWhenUsed="1"/>
+    <w:lsdException w:name="Table List 7" w:semiHidden="1" w:unhideWhenUsed="1"/>
+    <w:lsdException w:name="Table List 8" w:semiHidden="1" w:unhideWhenUsed="1"/>
+    <w:lsdException w:name="Table 3D effects 1" w:semiHidden="1" w:unhideWhenUsed="1"/>
+    <w:lsdException w:name="Table 3D effects 2" w:semiHidden="1" w:unhideWhenUsed="1"/>
+    <w:lsdException w:name="Table 3D effects 3" w:semiHidden="1" w:unhideWhenUsed="1"/>
+    <w:lsdException w:name="Table Contemporary" w:semiHidden="1" w:unhideWhenUsed="1"/>
+    <w:lsdException w:name="Table Elegant" w:semiHidden="1" w:unhideWhenUsed="1"/>
+    <w:lsdException w:name="Table Professional" w:semiHidden="1" w:unhideWhenUsed="1"/>
+    <w:lsdException w:name="Table Subtle 1" w:semiHidden="1" w:unhideWhenUsed="1"/>
+    <w:lsdException w:name="Table Subtle 2" w:semiHidden="1" w:unhideWhenUsed="1"/>
+    <w:lsdException w:name="Table Web 1" w:semiHidden="1" w:unhideWhenUsed="1"/>
+    <w:lsdException w:name="Table Web 2" w:semiHidden="1" w:unhideWhenUsed="1"/>
+    <w:lsdException w:name="Table Web 3" w:semiHidden="1" w:unhideWhenUsed="1"/>
+    <w:lsdException w:name="Balloon Text" w:semiHidden="1" w:unhideWhenUsed="1"/>
+    <w:lsdException w:name="Table Grid" w:uiPriority="39"/>
+    <w:lsdException w:name="Table Theme" w:semiHidden="1" w:unhideWhenUsed="1"/>
+    <w:lsdException w:name="Placeholder Text" w:semiHidden="1"/>
+    <w:lsdException w:name="No Spacing" w:uiPriority="1" w:qFormat="1"/>
+    <w:lsdException w:name="Light Shading" w:uiPriority="60"/>
+    <w:lsdException w:name="Light List" w:uiPriority="61"/>
+    <w:lsdException w:name="Light Grid" w:uiPriority="62"/>
+    <w:lsdException w:name="Medium Shading 1" w:uiPriority="63"/>
+    <w:lsdException w:name="Medium Shading 2" w:uiPriority="64"/>
+    <w:lsdException w:name="Medium List 1" w:uiPriority="65"/>
+    <w:lsdException w:name="Medium List 2" w:uiPriority="66"/>
+    <w:lsdException w:name="Medium Grid 1" w:uiPriority="67"/>
+    <w:lsdException w:name="Medium Grid 2" w:uiPriority="68"/>
+    <w:lsdException w:name="Medium Grid 3" w:uiPriority="69"/>
+    <w:lsdException w:name="Dark List" w:uiPriority="70"/>
+    <w:lsdException w:name="Colorful Shading" w:uiPriority="71"/>
+    <w:lsdException w:name="Colorful List" w:uiPriority="72"/>
+    <w:lsdException w:name="Colorful Grid" w:uiPriority="73"/>
+    <w:lsdException w:name="Light Shading Accent 1" w:uiPriority="60"/>
+    <w:lsdException w:name="Light List Accent 1" w:uiPriority="61"/>
+    <w:lsdException w:name="Light Grid Accent 1" w:uiPriority="62"/>
+    <w:lsdException w:name="Medium Shading 1 Accent 1" w:uiPriority="63"/>
+    <w:lsdException w:name="Medium Shading 2 Accent 1" w:uiPriority="64"/>
+    <w:lsdException w:name="Medium List 1 Accent 1" w:uiPriority="65"/>
+    <w:lsdException w:name="Revision" w:semiHidden="1"/>
+    <w:lsdException w:name="List Paragraph" w:uiPriority="34" w:qFormat="1"/>
+    <w:lsdException w:name="Quote" w:uiPriority="29" w:qFormat="1"/>
+    <w:lsdException w:name="Intense Quote" w:uiPriority="30" w:qFormat="1"/>
+    <w:lsdException w:name="Medium List 2 Accent 1" w:uiPriority="66"/>
+    <w:lsdException w:name="Medium Grid 1 Accent 1" w:uiPriority="67"/>
+    <w:lsdException w:name="Medium Grid 2 Accent 1" w:uiPriority="68"/>
+    <w:lsdException w:name="Medium Grid 3 Accent 1" w:uiPriority="69"/>
+    <w:lsdException w:name="Dark List Accent 1" w:uiPriority="70"/>
+    <w:lsdException w:name="Colorful Shading Accent 1" w:uiPriority="71"/>
+    <w:lsdException w:name="Colorful List Accent 1" w:uiPriority="72"/>
+    <w:lsdException w:name="Colorful Grid Accent 1" w:uiPriority="73"/>
+    <w:lsdException w:name="Light Shading Accent 2" w:uiPriority="60"/>
+    <w:lsdException w:name="Light List Accent 2" w:uiPriority="61"/>
+    <w:lsdException w:name="Light Grid Accent 2" w:uiPriority="62"/>
+    <w:lsdException w:name="Medium Shading 1 Accent 2" w:uiPriority="63"/>
+    <w:lsdException w:name="Medium Shading 2 Accent 2" w:uiPriority="64"/>
+    <w:lsdException w:name="Medium List 1 Accent 2" w:uiPriority="65"/>
+    <w:lsdException w:name="Medium List 2 Accent 2" w:uiPriority="66"/>
+    <w:lsdException w:name="Medium Grid 1 Accent 2" w:uiPriority="67"/>
+    <w:lsdException w:name="Medium Grid 2 Accent 2" w:uiPriority="68"/>
+    <w:lsdException w:name="Medium Grid 3 Accent 2" w:uiPriority="69"/>
+    <w:lsdException w:name="Dark List Accent 2" w:uiPriority="70"/>
+    <w:lsdException w:name="Colorful Shading Accent 2" w:uiPriority="71"/>
+    <w:lsdException w:name="Colorful List Accent 2" w:uiPriority="72"/>
+    <w:lsdException w:name="Colorful Grid Accent 2" w:uiPriority="73"/>
+    <w:lsdException w:name="Light Shading Accent 3" w:uiPriority="60"/>
+    <w:lsdException w:name="Light List Accent 3" w:uiPriority="61"/>
+    <w:lsdException w:name="Light Grid Accent 3" w:uiPriority="62"/>
+    <w:lsdException w:name="Medium Shading 1 Accent 3" w:uiPriority="63"/>
+    <w:lsdException w:name="Medium Shading 2 Accent 3" w:uiPriority="64"/>
+    <w:lsdException w:name="Medium List 1 Accent 3" w:uiPriority="65"/>
+    <w:lsdException w:name="Medium List 2 Accent 3" w:uiPriority="66"/>
+    <w:lsdException w:name="Medium Grid 1 Accent 3" w:uiPriority="67"/>
+    <w:lsdException w:name="Medium Grid 2 Accent 3" w:uiPriority="68"/>
+    <w:lsdException w:name="Medium Grid 3 Accent 3" w:uiPriority="69"/>
+    <w:lsdException w:name="Dark List Accent 3" w:uiPriority="70"/>
+    <w:lsdException w:name="Colorful Shading Accent 3" w:uiPriority="71"/>
+    <w:lsdException w:name="Colorful List Accent 3" w:uiPriority="72"/>
+    <w:lsdException w:name="Colorful Grid Accent 3" w:uiPriority="73"/>
+    <w:lsdException w:name="Light Shading Accent 4" w:uiPriority="60"/>
+    <w:lsdException w:name="Light List Accent 4" w:uiPriority="61"/>
+    <w:lsdException w:name="Light Grid Accent 4" w:uiPriority="62"/>
+    <w:lsdException w:name="Medium Shading 1 Accent 4" w:uiPriority="63"/>
+    <w:lsdException w:name="Medium Shading 2 Accent 4" w:uiPriority="64"/>
+    <w:lsdException w:name="Medium List 1 Accent 4" w:uiPriority="65"/>
+    <w:lsdException w:name="Medium List 2 Accent 4" w:uiPriority="66"/>
+    <w:lsdException w:name="Medium Grid 1 Accent 4" w:uiPriority="67"/>
+    <w:lsdException w:name="Medium Grid 2 Accent 4" w:uiPriority="68"/>
+    <w:lsdException w:name="Medium Grid 3 Accent 4" w:uiPriority="69"/>
+    <w:lsdException w:name="Dark List Accent 4" w:uiPriority="70"/>
+    <w:lsdException w:name="Colorful Shading Accent 4" w:uiPriority="71"/>
+    <w:lsdException w:name="Colorful List Accent 4" w:uiPriority="72"/>
+    <w:lsdException w:name="Colorful Grid Accent 4" w:uiPriority="73"/>
+    <w:lsdException w:name="Light Shading Accent 5" w:uiPriority="60"/>
+    <w:lsdException w:name="Light List Accent 5" w:uiPriority="61"/>
+    <w:lsdException w:name="Light Grid Accent 5" w:uiPriority="62"/>
+    <w:lsdException w:name="Medium Shading 1 Accent 5" w:uiPriority="63"/>
+    <w:lsdException w:name="Medium Shading 2 Accent 5" w:uiPriority="64"/>
+    <w:lsdException w:name="Medium List 1 Accent 5" w:uiPriority="65"/>
+    <w:lsdException w:name="Medium List 2 Accent 5" w:uiPriority="66"/>
+    <w:lsdException w:name="Medium Grid 1 Accent 5" w:uiPriority="67"/>
+    <w:lsdException w:name="Medium Grid 2 Accent 5" w:uiPriority="68"/>
+    <w:lsdException w:name="Medium Grid 3 Accent 5" w:uiPriority="69"/>
+    <w:lsdException w:name="Dark List Accent 5" w:uiPriority="70"/>
+    <w:lsdException w:name="Colorful Shading Accent 5" w:uiPriority="71"/>
+    <w:lsdException w:name="Colorful List Accent 5" w:uiPriority="72"/>
+    <w:lsdException w:name="Colorful Grid Accent 5" w:uiPriority="73"/>
+    <w:lsdException w:name="Light Shading Accent 6" w:uiPriority="60"/>
+    <w:lsdException w:name="Light List Accent 6" w:uiPriority="61"/>
+    <w:lsdException w:name="Light Grid Accent 6" w:uiPriority="62"/>
+    <w:lsdException w:name="Medium Shading 1 Accent 6" w:uiPriority="63"/>
+    <w:lsdException w:name="Medium Shading 2 Accent 6" w:uiPriority="64"/>
+    <w:lsdException w:name="Medium List 1 Accent 6" w:uiPriority="65"/>
+    <w:lsdException w:name="Medium List 2 Accent 6" w:uiPriority="66"/>
+    <w:lsdException w:name="Medium Grid 1 Accent 6" w:uiPriority="67"/>
+    <w:lsdException w:name="Medium Grid 2 Accent 6" w:uiPriority="68"/>
+    <w:lsdException w:name="Medium Grid 3 Accent 6" w:uiPriority="69"/>
+    <w:lsdException w:name="Dark List Accent 6" w:uiPriority="70"/>
+    <w:lsdException w:name="Colorful Shading Accent 6" w:uiPriority="71"/>
+    <w:lsdException w:name="Colorful List Accent 6" w:uiPriority="72"/>
+    <w:lsdException w:name="Colorful Grid Accent 6" w:uiPriority="73"/>
+    <w:lsdException w:name="Subtle Emphasis" w:uiPriority="19" w:qFormat="1"/>
+    <w:lsdException w:name="Intense Emphasis" w:uiPriority="21" w:qFormat="1"/>
+    <w:lsdException w:name="Subtle Reference" w:uiPriority="31" w:qFormat="1"/>
+    <w:lsdException w:name="Intense Reference" w:uiPriority="32" w:qFormat="1"/>
+    <w:lsdException w:name="Book Title" w:uiPriority="33" w:qFormat="1"/>
+    <w:lsdException w:name="Bibliography" w:semiHidden="1" w:uiPriority="37" w:unhideWhenUsed="1"/>
+    <w:lsdException w:name="TOC Heading" w:semiHidden="1" w:uiPriority="39" w:unhideWhenUsed="1" w:qFormat="1"/>
+    <w:lsdException w:name="Plain Table 1" w:uiPriority="41"/>
+    <w:lsdException w:name="Plain Table 2" w:uiPriority="42"/>
+    <w:lsdException w:name="Plain Table 3" w:uiPriority="43"/>
+    <w:lsdException w:name="Plain Table 4" w:uiPriority="44"/>
+    <w:lsdException w:name="Plain Table 5" w:uiPriority="45"/>
+    <w:lsdException w:name="Grid Table Light" w:uiPriority="40"/>
+    <w:lsdException w:name="Grid Table 1 Light" w:uiPriority="46"/>
+    <w:lsdException w:name="Grid Table 2" w:uiPriority="47"/>
+    <w:lsdException w:name="Grid Table 3" w:uiPriority="48"/>
+    <w:lsdException w:name="Grid Table 4" w:uiPriority="49"/>
+    <w:lsdException w:name="Grid Table 5 Dark" w:uiPriority="50"/>
+    <w:lsdException w:name="Grid Table 6 Colorful" w:uiPriority="51"/>
+    <w:lsdException w:name="Grid Table 7 Colorful" w:uiPriority="52"/>
+    <w:lsdException w:name="Grid Table 1 Light Accent 1" w:uiPriority="46"/>
+    <w:lsdException w:name="Grid Table 2 Accent 1" w:uiPriority="47"/>
+    <w:lsdException w:name="Grid Table 3 Accent 1" w:uiPriority="48"/>
+    <w:lsdException w:name="Grid Table 4 Accent 1" w:uiPriority="49"/>
+    <w:lsdException w:name="Grid Table 5 Dark Accent 1" w:uiPriority="50"/>
+    <w:lsdException w:name="Grid Table 6 Colorful Accent 1" w:uiPriority="51"/>
+    <w:lsdException w:name="Grid Table 7 Colorful Accent 1" w:uiPriority="52"/>
+    <w:lsdException w:name="Grid Table 1 Light Accent 2" w:uiPriority="46"/>
+    <w:lsdException w:name="Grid Table 2 Accent 2" w:uiPriority="47"/>
+    <w:lsdException w:name="Grid Table 3 Accent 2" w:uiPriority="48"/>
+    <w:lsdException w:name="Grid Table 4 Accent 2" w:uiPriority="49"/>
+    <w:lsdException w:name="Grid Table 5 Dark Accent 2" w:uiPriority="50"/>
+    <w:lsdException w:name="Grid Table 6 Colorful Accent 2" w:uiPriority="51"/>
+    <w:lsdException w:name="Grid Table 7 Colorful Accent 2" w:uiPriority="52"/>
+    <w:lsdException w:name="Grid Table 1 Light Accent 3" w:uiPriority="46"/>
+    <w:lsdException w:name="Grid Table 2 Accent 3" w:uiPriority="47"/>
+    <w:lsdException w:name="Grid Table 3 Accent 3" w:uiPriority="48"/>
+    <w:lsdException w:name="Grid Table 4 Accent 3" w:uiPriority="49"/>
+    <w:lsdException w:name="Grid Table 5 Dark Accent 3" w:uiPriority="50"/>
+    <w:lsdException w:name="Grid Table 6 Colorful Accent 3" w:uiPriority="51"/>
+    <w:lsdException w:name="Grid Table 7 Colorful Accent 3" w:uiPriority="52"/>
+    <w:lsdException w:name="Grid Table 1 Light Accent 4" w:uiPriority="46"/>
+    <w:lsdException w:name="Grid Table 2 Accent 4" w:uiPriority="47"/>
+    <w:lsdException w:name="Grid Table 3 Accent 4" w:uiPriority="48"/>
+    <w:lsdException w:name="Grid Table 4 Accent 4" w:uiPriority="49"/>
+    <w:lsdException w:name="Grid Table 5 Dark Accent 4" w:uiPriority="50"/>
+    <w:lsdException w:name="Grid Table 6 Colorful Accent 4" w:uiPriority="51"/>
+    <w:lsdException w:name="Grid Table 7 Colorful Accent 4" w:uiPriority="52"/>
+    <w:lsdException w:name="Grid Table 1 Light Accent 5" w:uiPriority="46"/>
+    <w:lsdException w:name="Grid Table 2 Accent 5" w:uiPriority="47"/>
+    <w:lsdException w:name="Grid Table 3 Accent 5" w:uiPriority="48"/>
+    <w:lsdException w:name="Grid Table 4 Accent 5" w:uiPriority="49"/>
+    <w:lsdException w:name="Grid Table 5 Dark Accent 5" w:uiPriority="50"/>
+    <w:lsdException w:name="Grid Table 6 Colorful Accent 5" w:uiPriority="51"/>
+    <w:lsdException w:name="Grid Table 7 Colorful Accent 5" w:uiPriority="52"/>
+    <w:lsdException w:name="Grid Table 1 Light Accent 6" w:uiPriority="46"/>
+    <w:lsdException w:name="Grid Table 2 Accent 6" w:uiPriority="47"/>
+    <w:lsdException w:name="Grid Table 3 Accent 6" w:uiPriority="48"/>
+    <w:lsdException w:name="Grid Table 4 Accent 6" w:uiPriority="49"/>
+    <w:lsdException w:name="Grid Table 5 Dark Accent 6" w:uiPriority="50"/>
+    <w:lsdException w:name="Grid Table 6 Colorful Accent 6" w:uiPriority="51"/>
+    <w:lsdException w:name="Grid Table 7 Colorful Accent 6" w:uiPriority="52"/>
+    <w:lsdException w:name="List Table 1 Light" w:uiPriority="46"/>
+    <w:lsdException w:name="List Table 2" w:uiPriority="47"/>
+    <w:lsdException w:name="List Table 3" w:uiPriority="48"/>
+    <w:lsdException w:name="List Table 4" w:uiPriority="49"/>
+    <w:lsdException w:name="List Table 5 Dark" w:uiPriority="50"/>
+    <w:lsdException w:name="List Table 6 Colorful" w:uiPriority="51"/>
+    <w:lsdException w:name="List Table 7 Colorful" w:uiPriority="52"/>
+    <w:lsdException w:name="List Table 1 Light Accent 1" w:uiPriority="46"/>
+    <w:lsdException w:name="List Table 2 Accent 1" w:uiPriority="47"/>
+    <w:lsdException w:name="List Table 3 Accent 1" w:uiPriority="48"/>
+    <w:lsdException w:name="List Table 4 Accent 1" w:uiPriority="49"/>
+    <w:lsdException w:name="List Table 5 Dark Accent 1" w:uiPriority="50"/>
+    <w:lsdException w:name="List Table 6 Colorful Accent 1" w:uiPriority="51"/>
+    <w:lsdException w:name="List Table 7 Colorful Accent 1" w:uiPriority="52"/>
+    <w:lsdException w:name="List Table 1 Light Accent 2" w:uiPriority="46"/>
+    <w:lsdException w:name="List Table 2 Accent 2" w:uiPriority="47"/>
+    <w:lsdException w:name="List Table 3 Accent 2" w:uiPriority="48"/>
+    <w:lsdException w:name="List Table 4 Accent 2" w:uiPriority="49"/>
+    <w:lsdException w:name="List Table 5 Dark Accent 2" w:uiPriority="50"/>
+    <w:lsdException w:name="List Table 6 Colorful Accent 2" w:uiPriority="51"/>
+    <w:lsdException w:name="List Table 7 Colorful Accent 2" w:uiPriority="52"/>
+    <w:lsdException w:name="List Table 1 Light Accent 3" w:uiPriority="46"/>
+    <w:lsdException w:name="List Table 2 Accent 3" w:uiPriority="47"/>
+    <w:lsdException w:name="List Table 3 Accent 3" w:uiPriority="48"/>
+    <w:lsdException w:name="List Table 4 Accent 3" w:uiPriority="49"/>
+    <w:lsdException w:name="List Table 5 Dark Accent 3" w:uiPriority="50"/>
+    <w:lsdException w:name="List Table 6 Colorful Accent 3" w:uiPriority="51"/>
+    <w:lsdException w:name="List Table 7 Colorful Accent 3" w:uiPriority="52"/>
+    <w:lsdException w:name="List Table 1 Light Accent 4" w:uiPriority="46"/>
+    <w:lsdException w:name="List Table 2 Accent 4" w:uiPriority="47"/>
+    <w:lsdException w:name="List Table 3 Accent 4" w:uiPriority="48"/>
+    <w:lsdException w:name="List Table 4 Accent 4" w:uiPriority="49"/>
+    <w:lsdException w:name="List Table 5 Dark Accent 4" w:uiPriority="50"/>
+    <w:lsdException w:name="List Table 6 Colorful Accent 4" w:uiPriority="51"/>
+    <w:lsdException w:name="List Table 7 Colorful Accent 4" w:uiPriority="52"/>
+    <w:lsdException w:name="List Table 1 Light Accent 5" w:uiPriority="46"/>
+    <w:lsdException w:name="List Table 2 Accent 5" w:uiPriority="47"/>
+    <w:lsdException w:name="List Table 3 Accent 5" w:uiPriority="48"/>
+    <w:lsdException w:name="List Table 4 Accent 5" w:uiPriority="49"/>
+    <w:lsdException w:name="List Table 5 Dark Accent 5" w:uiPriority="50"/>
+    <w:lsdException w:name="List Table 6 Colorful Accent 5" w:uiPriority="51"/>
+    <w:lsdException w:name="List Table 7 Colorful Accent 5" w:uiPriority="52"/>
+    <w:lsdException w:name="List Table 1 Light Accent 6" w:uiPriority="46"/>
+    <w:lsdException w:name="List Table 2 Accent 6" w:uiPriority="47"/>
+    <w:lsdException w:name="List Table 3 Accent 6" w:uiPriority="48"/>
+    <w:lsdException w:name="List Table 4 Accent 6" w:uiPriority="49"/>
+    <w:lsdException w:name="List Table 5 Dark Accent 6" w:uiPriority="50"/>
+    <w:lsdException w:name="List Table 6 Colorful Accent 6" w:uiPriority="51"/>
+    <w:lsdException w:name="List Table 7 Colorful Accent 6" w:uiPriority="52"/>
+    <w:lsdException w:name="Mention" w:semiHidden="1" w:unhideWhenUsed="1"/>
+    <w:lsdException w:name="Smart Hyperlink" w:semiHidden="1" w:unhideWhenUsed="1"/>
+    <w:lsdException w:name="Hashtag" w:semiHidden="1" w:unhideWhenUsed="1"/>
+    <w:lsdException w:name="Unresolved Mention" w:semiHidden="1" w:unhideWhenUsed="1"/>
+    <w:lsdException w:name="Smart Link" w:semiHidden="1" w:unhideWhenUsed="1"/>
+  </w:latentStyles>
+  <w:style w:type="paragraph" w:default="1" w:styleId="Normal">
+    <w:name w:val="Normal"/>
+    <w:qFormat/>
+  </w:style>
+  <w:style w:type="character" w:default="1" w:styleId="DefaultParagraphFont">
+    <w:name w:val="Default Paragraph Font"/>
+    <w:uiPriority w:val="1"/>
+    <w:semiHidden/>
+    <w:unhideWhenUsed/>
+  </w:style>
+  <w:style w:type="table" w:default="1" w:styleId="TableNormal">
+    <w:name w:val="Normal Table"/>
+    <w:uiPriority w:val="99"/>
+    <w:semiHidden/>
+    <w:unhideWhenUsed/>
+    <w:tblPr>
+      <w:tblInd w:w="0" w:type="dxa"/>
+      <w:tblCellMar>
+        <w:top w:w="0" w:type="dxa"/>
+        <w:left w:w="108" w:type="dxa"/>
+        <w:bottom w:w="0" w:type="dxa"/>
+        <w:right w:w="108" w:type="dxa"/>
+      </w:tblCellMar>
+    </w:tblPr>
+  </w:style>
+  <w:style w:type="numbering" w:default="1" w:styleId="NoList">
+    <w:name w:val="No List"/>
+    <w:uiPriority w:val="99"/>
+    <w:semiHidden/>
+    <w:unhideWhenUsed/>
+  </w:style>
+  <w:style w:type="character" w:styleId="PlaceholderText">
+    <w:name w:val="Placeholder Text"/>
+    <w:basedOn w:val="DefaultParagraphFont"/>
+    <w:uiPriority w:val="99"/>
+    <w:semiHidden/>
+    <w:rsid w:val="00733703"/>
+    <w:rPr>
+      <w:color w:val="666666"/>
+    </w:rPr>
+  </w:style>
+</w:styles>
+</file>
+
+<file path=word/glossary/webSettings.xml><?xml version="1.0" encoding="utf-8"?>
+<w:webSettings xmlns:mc="http://schemas.openxmlformats.org/markup-compatibility/2006" xmlns:r="http://schemas.openxmlformats.org/officeDocument/2006/relationships" xmlns:w="http://schemas.openxmlformats.org/wordprocessingml/2006/main" xmlns:w14="http://schemas.microsoft.com/office/word/2010/wordml" xmlns:w15="http://schemas.microsoft.com/office/word/2012/wordml" xmlns:w16cex="http://schemas.microsoft.com/office/word/2018/wordml/cex" xmlns:w16cid="http://schemas.microsoft.com/office/word/2016/wordml/cid" xmlns:w16="http://schemas.microsoft.com/office/word/2018/wordml" xmlns:w16du="http://schemas.microsoft.com/office/word/2023/wordml/word16du" xmlns:w16sdtdh="http://schemas.microsoft.com/office/word/2020/wordml/sdtdatahash" xmlns:w16sdtfl="http://schemas.microsoft.com/office/word/2024/wordml/sdtformatlock" xmlns:w16se="http://schemas.microsoft.com/office/word/2015/wordml/symex" mc:Ignorable="w14 w15 w16se w16cid w16 w16cex w16sdtdh w16sdtfl w16du">
+  <w:optimizeForBrowser/>
+  <w:allowPNG/>
+</w:webSettings>
+</file>
+
 <file path=word/theme/theme1.xml><?xml version="1.0" encoding="utf-8"?>
 <a:theme xmlns:a="http://schemas.openxmlformats.org/drawingml/2006/main" name="Office Theme">
   <a:themeElements>

</xml_diff>

<commit_message>
Debugging noisy phase currents
</commit_message>
<xml_diff>
--- a/Datasheet/Equations_SS.docx
+++ b/Datasheet/Equations_SS.docx
@@ -2985,15 +2985,7 @@
         </w:numPr>
       </w:pPr>
       <w:r>
-        <w:t xml:space="preserve">Successfully modelled Clarke, Park, inverse Park, and inverse Clarke transformations </w:t>
-      </w:r>
-      <w:proofErr w:type="gramStart"/>
-      <w:r>
-        <w:t>in order to</w:t>
-      </w:r>
-      <w:proofErr w:type="gramEnd"/>
-      <w:r>
-        <w:t xml:space="preserve"> convert from AC to DC control. </w:t>
+        <w:t xml:space="preserve">Successfully modelled Clarke, Park, inverse Park, and inverse Clarke transformations in order to convert from AC to DC control. </w:t>
       </w:r>
     </w:p>
     <w:p>
@@ -3155,6 +3147,105 @@
       <w:proofErr w:type="spellEnd"/>
       <w:r>
         <w:t xml:space="preserve"> is not configured automatically in Simulink, although it configures the OPAMP1/2/3 it does not enable them – therefore need to add custom code to call the function to enable the configured pins</w:t>
+      </w:r>
+    </w:p>
+    <w:p/>
+    <w:p>
+      <w:r>
+        <w:lastRenderedPageBreak/>
+        <w:drawing>
+          <wp:inline distT="0" distB="0" distL="0" distR="0" wp14:anchorId="1955F135" wp14:editId="549ED7D8">
+            <wp:extent cx="5731510" cy="4302125"/>
+            <wp:effectExtent l="0" t="0" r="2540" b="3175"/>
+            <wp:docPr id="768668841" name="Picture 1"/>
+            <wp:cNvGraphicFramePr>
+              <a:graphicFrameLocks xmlns:a="http://schemas.openxmlformats.org/drawingml/2006/main" noChangeAspect="1"/>
+            </wp:cNvGraphicFramePr>
+            <a:graphic xmlns:a="http://schemas.openxmlformats.org/drawingml/2006/main">
+              <a:graphicData uri="http://schemas.openxmlformats.org/drawingml/2006/picture">
+                <pic:pic xmlns:pic="http://schemas.openxmlformats.org/drawingml/2006/picture">
+                  <pic:nvPicPr>
+                    <pic:cNvPr id="768668841" name=""/>
+                    <pic:cNvPicPr/>
+                  </pic:nvPicPr>
+                  <pic:blipFill>
+                    <a:blip r:embed="rId6"/>
+                    <a:stretch>
+                      <a:fillRect/>
+                    </a:stretch>
+                  </pic:blipFill>
+                  <pic:spPr>
+                    <a:xfrm>
+                      <a:off x="0" y="0"/>
+                      <a:ext cx="5731510" cy="4302125"/>
+                    </a:xfrm>
+                    <a:prstGeom prst="rect">
+                      <a:avLst/>
+                    </a:prstGeom>
+                  </pic:spPr>
+                </pic:pic>
+              </a:graphicData>
+            </a:graphic>
+          </wp:inline>
+        </w:drawing>
+      </w:r>
+    </w:p>
+    <w:p>
+      <w:r>
+        <w:t xml:space="preserve">ADC1 and ADC2 phase current can cause this noisy readings at times – not sure </w:t>
+      </w:r>
+      <w:proofErr w:type="spellStart"/>
+      <w:r>
+        <w:t>whats</w:t>
+      </w:r>
+      <w:proofErr w:type="spellEnd"/>
+      <w:r>
+        <w:t xml:space="preserve"> causing it</w:t>
+      </w:r>
+    </w:p>
+    <w:p>
+      <w:r>
+        <w:lastRenderedPageBreak/>
+        <w:drawing>
+          <wp:inline distT="0" distB="0" distL="0" distR="0" wp14:anchorId="7FD2E233" wp14:editId="4CB24D07">
+            <wp:extent cx="5731510" cy="4677410"/>
+            <wp:effectExtent l="0" t="0" r="2540" b="8890"/>
+            <wp:docPr id="613174513" name="Picture 1"/>
+            <wp:cNvGraphicFramePr>
+              <a:graphicFrameLocks xmlns:a="http://schemas.openxmlformats.org/drawingml/2006/main" noChangeAspect="1"/>
+            </wp:cNvGraphicFramePr>
+            <a:graphic xmlns:a="http://schemas.openxmlformats.org/drawingml/2006/main">
+              <a:graphicData uri="http://schemas.openxmlformats.org/drawingml/2006/picture">
+                <pic:pic xmlns:pic="http://schemas.openxmlformats.org/drawingml/2006/picture">
+                  <pic:nvPicPr>
+                    <pic:cNvPr id="613174513" name=""/>
+                    <pic:cNvPicPr/>
+                  </pic:nvPicPr>
+                  <pic:blipFill>
+                    <a:blip r:embed="rId7"/>
+                    <a:stretch>
+                      <a:fillRect/>
+                    </a:stretch>
+                  </pic:blipFill>
+                  <pic:spPr>
+                    <a:xfrm>
+                      <a:off x="0" y="0"/>
+                      <a:ext cx="5731510" cy="4677410"/>
+                    </a:xfrm>
+                    <a:prstGeom prst="rect">
+                      <a:avLst/>
+                    </a:prstGeom>
+                  </pic:spPr>
+                </pic:pic>
+              </a:graphicData>
+            </a:graphic>
+          </wp:inline>
+        </w:drawing>
+      </w:r>
+    </w:p>
+    <w:p>
+      <w:r>
+        <w:t xml:space="preserve">Improved with Status feature but Phase U from ADC1 can still get this noisy measurement </w:t>
       </w:r>
     </w:p>
     <w:p/>
@@ -4639,7 +4730,7 @@
   </w:compat>
   <w:rsids>
     <w:rsidRoot w:val="00733703"/>
-    <w:rsid w:val="00400C21"/>
+    <w:rsid w:val="00492C65"/>
     <w:rsid w:val="00733703"/>
     <w:rsid w:val="00FF782D"/>
   </w:rsids>

</xml_diff>

<commit_message>
Clean up model and add execution time signals
</commit_message>
<xml_diff>
--- a/Datasheet/Equations_SS.docx
+++ b/Datasheet/Equations_SS.docx
@@ -2863,6 +2863,9 @@
           <m:oMathPara>
             <m:oMath>
               <m:r>
+                <m:rPr>
+                  <m:sty m:val="p"/>
+                </m:rPr>
                 <w:rPr>
                   <w:rStyle w:val="PlaceholderText"/>
                   <w:rFonts w:ascii="Cambria Math" w:hAnsi="Cambria Math"/>
@@ -2985,7 +2988,15 @@
         </w:numPr>
       </w:pPr>
       <w:r>
-        <w:t xml:space="preserve">Successfully modelled Clarke, Park, inverse Park, and inverse Clarke transformations in order to convert from AC to DC control. </w:t>
+        <w:t xml:space="preserve">Successfully modelled Clarke, Park, inverse Park, and inverse Clarke transformations </w:t>
+      </w:r>
+      <w:proofErr w:type="gramStart"/>
+      <w:r>
+        <w:t>in order to</w:t>
+      </w:r>
+      <w:proofErr w:type="gramEnd"/>
+      <w:r>
+        <w:t xml:space="preserve"> convert from AC to DC control. </w:t>
       </w:r>
     </w:p>
     <w:p>
@@ -3088,6 +3099,9 @@
     </w:p>
     <w:p>
       <w:r>
+        <w:rPr>
+          <w:noProof/>
+        </w:rPr>
         <w:lastRenderedPageBreak/>
         <w:drawing>
           <wp:inline distT="0" distB="0" distL="0" distR="0" wp14:anchorId="40D8DB52" wp14:editId="5A62AB6F">
@@ -3152,6 +3166,9 @@
     <w:p/>
     <w:p>
       <w:r>
+        <w:rPr>
+          <w:noProof/>
+        </w:rPr>
         <w:lastRenderedPageBreak/>
         <w:drawing>
           <wp:inline distT="0" distB="0" distL="0" distR="0" wp14:anchorId="1955F135" wp14:editId="549ED7D8">
@@ -3192,7 +3209,15 @@
     </w:p>
     <w:p>
       <w:r>
-        <w:t xml:space="preserve">ADC1 and ADC2 phase current can cause this noisy readings at times – not sure </w:t>
+        <w:t xml:space="preserve">ADC1 and ADC2 phase current can cause </w:t>
+      </w:r>
+      <w:proofErr w:type="gramStart"/>
+      <w:r>
+        <w:t>this noisy readings</w:t>
+      </w:r>
+      <w:proofErr w:type="gramEnd"/>
+      <w:r>
+        <w:t xml:space="preserve"> at times – not sure </w:t>
       </w:r>
       <w:proofErr w:type="spellStart"/>
       <w:r>
@@ -3205,6 +3230,9 @@
     </w:p>
     <w:p>
       <w:r>
+        <w:rPr>
+          <w:noProof/>
+        </w:rPr>
         <w:lastRenderedPageBreak/>
         <w:drawing>
           <wp:inline distT="0" distB="0" distL="0" distR="0" wp14:anchorId="7FD2E233" wp14:editId="4CB24D07">
@@ -3250,8 +3278,20 @@
     </w:p>
     <w:p/>
     <w:p/>
-    <w:p>
-      <w:r>
+    <w:p/>
+    <w:p/>
+    <w:p/>
+    <w:p/>
+    <w:p/>
+    <w:p/>
+    <w:p/>
+    <w:p/>
+    <w:p/>
+    <w:p/>
+    <w:p/>
+    <w:p>
+      <w:r>
+        <w:lastRenderedPageBreak/>
         <w:t>Issues</w:t>
       </w:r>
     </w:p>
@@ -3265,6 +3305,50 @@
       </w:pPr>
       <w:r>
         <w:t xml:space="preserve">External mode viewing can cause the chip to slow down. </w:t>
+      </w:r>
+    </w:p>
+    <w:p>
+      <w:pPr>
+        <w:pStyle w:val="ListParagraph"/>
+        <w:numPr>
+          <w:ilvl w:val="1"/>
+          <w:numId w:val="4"/>
+        </w:numPr>
+      </w:pPr>
+      <w:r>
+        <w:t>FIX – Use STM32CubeMonitor</w:t>
+      </w:r>
+    </w:p>
+    <w:p>
+      <w:pPr>
+        <w:pStyle w:val="ListParagraph"/>
+        <w:numPr>
+          <w:ilvl w:val="0"/>
+          <w:numId w:val="4"/>
+        </w:numPr>
+      </w:pPr>
+      <w:r>
+        <w:t>Random readings of phase currents within 50us task</w:t>
+      </w:r>
+    </w:p>
+    <w:p>
+      <w:pPr>
+        <w:pStyle w:val="ListParagraph"/>
+        <w:numPr>
+          <w:ilvl w:val="1"/>
+          <w:numId w:val="4"/>
+        </w:numPr>
+      </w:pPr>
+      <w:r>
+        <w:t xml:space="preserve">FIX – TIM1 wasn’t synchronised with the 50us task so at times the ADC wasn’t ready when we </w:t>
+      </w:r>
+      <w:proofErr w:type="gramStart"/>
+      <w:r>
+        <w:t>reading</w:t>
+      </w:r>
+      <w:proofErr w:type="gramEnd"/>
+      <w:r>
+        <w:t xml:space="preserve"> the results, therefore USED ISR using the same TIMER which that read phase currents and that reduced fixed the issue</w:t>
       </w:r>
     </w:p>
     <w:sectPr>
@@ -3295,7 +3379,7 @@
         <w:rFonts w:hint="default"/>
       </w:rPr>
     </w:lvl>
-    <w:lvl w:ilvl="1" w:tplc="08090019" w:tentative="1">
+    <w:lvl w:ilvl="1" w:tplc="08090019">
       <w:start w:val="1"/>
       <w:numFmt w:val="lowerLetter"/>
       <w:lvlText w:val="%2."/>
@@ -4730,7 +4814,10 @@
   </w:compat>
   <w:rsids>
     <w:rsidRoot w:val="00733703"/>
+    <w:rsid w:val="001C1749"/>
     <w:rsid w:val="00492C65"/>
+    <w:rsid w:val="0055779F"/>
+    <w:rsid w:val="006B46FD"/>
     <w:rsid w:val="00733703"/>
     <w:rsid w:val="00FF782D"/>
   </w:rsids>

</xml_diff>

<commit_message>
Add motor safety checks
</commit_message>
<xml_diff>
--- a/Datasheet/Equations_SS.docx
+++ b/Datasheet/Equations_SS.docx
@@ -12,16 +12,8 @@
         <w:rPr>
           <w:rFonts w:eastAsiaTheme="minorEastAsia"/>
         </w:rPr>
-        <w:t xml:space="preserve">RT </w:t>
+        <w:t>RT charactersitics</w:t>
       </w:r>
-      <w:proofErr w:type="spellStart"/>
-      <w:r>
-        <w:rPr>
-          <w:rFonts w:eastAsiaTheme="minorEastAsia"/>
-        </w:rPr>
-        <w:t>charactersitics</w:t>
-      </w:r>
-      <w:proofErr w:type="spellEnd"/>
     </w:p>
     <w:p>
       <w:pPr>
@@ -2908,13 +2900,8 @@
         </w:numPr>
       </w:pPr>
       <w:r>
-        <w:t xml:space="preserve">Read </w:t>
+        <w:t>Read Vbus</w:t>
       </w:r>
-      <w:proofErr w:type="spellStart"/>
-      <w:r>
-        <w:t>Vbus</w:t>
-      </w:r>
-      <w:proofErr w:type="spellEnd"/>
     </w:p>
     <w:p>
       <w:pPr>
@@ -2925,15 +2912,7 @@
         </w:numPr>
       </w:pPr>
       <w:r>
-        <w:t xml:space="preserve">Can read temperature individually, if I try to read both </w:t>
-      </w:r>
-      <w:proofErr w:type="spellStart"/>
-      <w:r>
-        <w:t>VBus</w:t>
-      </w:r>
-      <w:proofErr w:type="spellEnd"/>
-      <w:r>
-        <w:t xml:space="preserve"> and ESC temperature then ADC stops working with monitor and tune</w:t>
+        <w:t>Can read temperature individually, if I try to read both VBus and ESC temperature then ADC stops working with monitor and tune</w:t>
       </w:r>
     </w:p>
     <w:p>
@@ -2957,21 +2936,8 @@
         </w:numPr>
       </w:pPr>
       <w:r>
-        <w:t xml:space="preserve">Added 50us task for FOC, had to change the model from </w:t>
+        <w:t>Added 50us task for FOC, had to change the model from FreeRTOS to Baremetal</w:t>
       </w:r>
-      <w:proofErr w:type="spellStart"/>
-      <w:r>
-        <w:t>FreeRTOS</w:t>
-      </w:r>
-      <w:proofErr w:type="spellEnd"/>
-      <w:r>
-        <w:t xml:space="preserve"> to </w:t>
-      </w:r>
-      <w:proofErr w:type="spellStart"/>
-      <w:r>
-        <w:t>Baremetal</w:t>
-      </w:r>
-      <w:proofErr w:type="spellEnd"/>
     </w:p>
     <w:p/>
     <w:p>
@@ -2988,15 +2954,7 @@
         </w:numPr>
       </w:pPr>
       <w:r>
-        <w:t xml:space="preserve">Successfully modelled Clarke, Park, inverse Park, and inverse Clarke transformations </w:t>
-      </w:r>
-      <w:proofErr w:type="gramStart"/>
-      <w:r>
-        <w:t>in order to</w:t>
-      </w:r>
-      <w:proofErr w:type="gramEnd"/>
-      <w:r>
-        <w:t xml:space="preserve"> convert from AC to DC control. </w:t>
+        <w:t xml:space="preserve">Successfully modelled Clarke, Park, inverse Park, and inverse Clarke transformations in order to convert from AC to DC control. </w:t>
       </w:r>
     </w:p>
     <w:p>
@@ -3013,29 +2971,8 @@
         </w:numPr>
       </w:pPr>
       <w:r>
-        <w:t xml:space="preserve">Implemented SVPWM which converts </w:t>
+        <w:t>Implemented SVPWM which converts V_alpha, V_Beta to Da, Db, Dc duty ratios to obtain the Vref</w:t>
       </w:r>
-      <w:proofErr w:type="spellStart"/>
-      <w:r>
-        <w:t>V_alpha</w:t>
-      </w:r>
-      <w:proofErr w:type="spellEnd"/>
-      <w:r>
-        <w:t xml:space="preserve">, </w:t>
-      </w:r>
-      <w:proofErr w:type="spellStart"/>
-      <w:r>
-        <w:t>V_Beta</w:t>
-      </w:r>
-      <w:proofErr w:type="spellEnd"/>
-      <w:r>
-        <w:t xml:space="preserve"> to Da, Db, Dc duty ratios to obtain the </w:t>
-      </w:r>
-      <w:proofErr w:type="spellStart"/>
-      <w:r>
-        <w:t>Vref</w:t>
-      </w:r>
-      <w:proofErr w:type="spellEnd"/>
     </w:p>
     <w:p>
       <w:r>
@@ -3154,11 +3091,9 @@
           <w:numId w:val="2"/>
         </w:numPr>
       </w:pPr>
-      <w:proofErr w:type="spellStart"/>
       <w:r>
         <w:t>LL_OPAMP_Enable</w:t>
       </w:r>
-      <w:proofErr w:type="spellEnd"/>
       <w:r>
         <w:t xml:space="preserve"> is not configured automatically in Simulink, although it configures the OPAMP1/2/3 it does not enable them – therefore need to add custom code to call the function to enable the configured pins</w:t>
       </w:r>
@@ -3209,23 +3144,7 @@
     </w:p>
     <w:p>
       <w:r>
-        <w:t xml:space="preserve">ADC1 and ADC2 phase current can cause </w:t>
-      </w:r>
-      <w:proofErr w:type="gramStart"/>
-      <w:r>
-        <w:t>this noisy readings</w:t>
-      </w:r>
-      <w:proofErr w:type="gramEnd"/>
-      <w:r>
-        <w:t xml:space="preserve"> at times – not sure </w:t>
-      </w:r>
-      <w:proofErr w:type="spellStart"/>
-      <w:r>
-        <w:t>whats</w:t>
-      </w:r>
-      <w:proofErr w:type="spellEnd"/>
-      <w:r>
-        <w:t xml:space="preserve"> causing it</w:t>
+        <w:t>ADC1 and ADC2 phase current can cause this noisy readings at times – not sure whats causing it</w:t>
       </w:r>
     </w:p>
     <w:p>
@@ -3277,6 +3196,43 @@
       </w:r>
     </w:p>
     <w:p/>
+    <w:p>
+      <w:r>
+        <w:t>18/10/26</w:t>
+      </w:r>
+    </w:p>
+    <w:p>
+      <w:pPr>
+        <w:pStyle w:val="ListParagraph"/>
+        <w:numPr>
+          <w:ilvl w:val="0"/>
+          <w:numId w:val="2"/>
+        </w:numPr>
+      </w:pPr>
+      <w:r>
+        <w:t xml:space="preserve">Overcurrent protection </w:t>
+      </w:r>
+    </w:p>
+    <w:p>
+      <w:pPr>
+        <w:pStyle w:val="ListParagraph"/>
+        <w:numPr>
+          <w:ilvl w:val="0"/>
+          <w:numId w:val="2"/>
+        </w:numPr>
+      </w:pPr>
+      <w:r>
+        <w:t xml:space="preserve">2 ways to stop motor – hardware integrated using comparators </w:t>
+      </w:r>
+    </w:p>
+    <w:p>
+      <w:pPr>
+        <w:ind w:left="360"/>
+      </w:pPr>
+      <w:r>
+        <w:t xml:space="preserve">                                                     -  Use software to enable/disable MOE (Main Output Enable)</w:t>
+      </w:r>
+    </w:p>
     <w:p/>
     <w:p/>
     <w:p/>
@@ -3291,7 +3247,6 @@
     <w:p/>
     <w:p>
       <w:r>
-        <w:lastRenderedPageBreak/>
         <w:t>Issues</w:t>
       </w:r>
     </w:p>
@@ -3340,15 +3295,7 @@
         </w:numPr>
       </w:pPr>
       <w:r>
-        <w:t xml:space="preserve">FIX – TIM1 wasn’t synchronised with the 50us task so at times the ADC wasn’t ready when we </w:t>
-      </w:r>
-      <w:proofErr w:type="gramStart"/>
-      <w:r>
-        <w:t>reading</w:t>
-      </w:r>
-      <w:proofErr w:type="gramEnd"/>
-      <w:r>
-        <w:t xml:space="preserve"> the results, therefore USED ISR using the same TIMER which that read phase currents and that reduced fixed the issue</w:t>
+        <w:t>FIX – TIM1 wasn’t synchronised with the 50us task so at times the ADC wasn’t ready when we reading the results, therefore USED ISR using the same TIMER which that read phase currents and that reduced fixed the issue</w:t>
       </w:r>
     </w:p>
     <w:sectPr>
@@ -3480,7 +3427,7 @@
         <w:rFonts w:ascii="Courier New" w:hAnsi="Courier New" w:cs="Courier New" w:hint="default"/>
       </w:rPr>
     </w:lvl>
-    <w:lvl w:ilvl="2" w:tplc="08090005" w:tentative="1">
+    <w:lvl w:ilvl="2" w:tplc="08090005">
       <w:start w:val="1"/>
       <w:numFmt w:val="bullet"/>
       <w:lvlText w:val=""/>
@@ -3492,7 +3439,7 @@
         <w:rFonts w:ascii="Wingdings" w:hAnsi="Wingdings" w:hint="default"/>
       </w:rPr>
     </w:lvl>
-    <w:lvl w:ilvl="3" w:tplc="08090001" w:tentative="1">
+    <w:lvl w:ilvl="3" w:tplc="08090001">
       <w:start w:val="1"/>
       <w:numFmt w:val="bullet"/>
       <w:lvlText w:val=""/>
@@ -4817,8 +4764,8 @@
     <w:rsid w:val="001C1749"/>
     <w:rsid w:val="00492C65"/>
     <w:rsid w:val="0055779F"/>
-    <w:rsid w:val="006B46FD"/>
     <w:rsid w:val="00733703"/>
+    <w:rsid w:val="00BB2575"/>
     <w:rsid w:val="00FF782D"/>
   </w:rsids>
   <m:mathPr>

</xml_diff>

<commit_message>
Optimise SVPWM generation (Change from sector based to min max based)
</commit_message>
<xml_diff>
--- a/Datasheet/Equations_SS.docx
+++ b/Datasheet/Equations_SS.docx
@@ -3234,6 +3234,21 @@
       </w:r>
     </w:p>
     <w:p/>
+    <w:p>
+      <w:r>
+        <w:t>20/10/26</w:t>
+      </w:r>
+    </w:p>
+    <w:p>
+      <w:r>
+        <w:t>Optimise SVPWM</w:t>
+      </w:r>
+    </w:p>
+    <w:p>
+      <w:r>
+        <w:t>Convert Sector-based SVPWM to Min-Max SVPWM</w:t>
+      </w:r>
+    </w:p>
     <w:p/>
     <w:p/>
     <w:p/>
@@ -3245,6 +3260,7 @@
     <w:p/>
     <w:p/>
     <w:p/>
+    <w:p/>
     <w:p>
       <w:r>
         <w:t>Issues</w:t>
@@ -3296,6 +3312,30 @@
       </w:pPr>
       <w:r>
         <w:t>FIX – TIM1 wasn’t synchronised with the 50us task so at times the ADC wasn’t ready when we reading the results, therefore USED ISR using the same TIMER which that read phase currents and that reduced fixed the issue</w:t>
+      </w:r>
+    </w:p>
+    <w:p>
+      <w:pPr>
+        <w:pStyle w:val="ListParagraph"/>
+        <w:numPr>
+          <w:ilvl w:val="0"/>
+          <w:numId w:val="4"/>
+        </w:numPr>
+      </w:pPr>
+      <w:r>
+        <w:t>STM32CubeMonitor won’t write parameters</w:t>
+      </w:r>
+    </w:p>
+    <w:p>
+      <w:pPr>
+        <w:pStyle w:val="ListParagraph"/>
+        <w:numPr>
+          <w:ilvl w:val="1"/>
+          <w:numId w:val="4"/>
+        </w:numPr>
+      </w:pPr>
+      <w:r>
+        <w:t xml:space="preserve">FIX – Reload the .elf file for both the signals and parameters </w:t>
       </w:r>
     </w:p>
     <w:sectPr>
@@ -4765,7 +4805,7 @@
     <w:rsid w:val="00492C65"/>
     <w:rsid w:val="0055779F"/>
     <w:rsid w:val="00733703"/>
-    <w:rsid w:val="00BB2575"/>
+    <w:rsid w:val="00D74BF0"/>
     <w:rsid w:val="00FF782D"/>
   </w:rsids>
   <m:mathPr>

</xml_diff>

<commit_message>
V0 Calibrate phase current offset + first openloop voltage run
</commit_message>
<xml_diff>
--- a/Datasheet/Equations_SS.docx
+++ b/Datasheet/Equations_SS.docx
@@ -2837,37 +2837,897 @@
       </w:r>
     </w:p>
     <w:p>
-      <w:sdt>
-        <w:sdtPr>
-          <w:rPr>
-            <w:rFonts w:ascii="Cambria Math" w:hAnsi="Cambria Math"/>
-            <w:i/>
-          </w:rPr>
-          <w:id w:val="-1423095431"/>
-          <w:placeholder>
-            <w:docPart w:val="DefaultPlaceholder_2098659789"/>
-          </w:placeholder>
-          <w:temporary/>
-          <w:showingPlcHdr/>
-          <w:equation/>
-        </w:sdtPr>
-        <w:sdtContent>
-          <m:oMathPara>
-            <m:oMath>
-              <m:r>
-                <m:rPr>
-                  <m:sty m:val="p"/>
-                </m:rPr>
-                <w:rPr>
-                  <w:rStyle w:val="PlaceholderText"/>
+      <m:oMathPara>
+        <m:oMath>
+          <m:r>
+            <w:rPr>
+              <w:rFonts w:ascii="Cambria Math" w:hAnsi="Cambria Math"/>
+            </w:rPr>
+            <m:t>need to put the whole eqn here</m:t>
+          </m:r>
+        </m:oMath>
+      </m:oMathPara>
+    </w:p>
+    <w:p/>
+    <w:p/>
+    <w:p>
+      <w:r>
+        <w:t>Min Max SVPWM</w:t>
+      </w:r>
+    </w:p>
+    <w:p>
+      <w:pPr>
+        <w:pStyle w:val="ListParagraph"/>
+        <w:numPr>
+          <w:ilvl w:val="0"/>
+          <w:numId w:val="3"/>
+        </w:numPr>
+      </w:pPr>
+      <w:r>
+        <w:t>Inverse Clark Transformation from above</w:t>
+      </w:r>
+    </w:p>
+    <w:p>
+      <w:pPr>
+        <w:ind w:left="360"/>
+      </w:pPr>
+    </w:p>
+    <w:p>
+      <w:pPr>
+        <w:ind w:left="360"/>
+      </w:pPr>
+      <m:oMathPara>
+        <m:oMath>
+          <m:sSub>
+            <m:sSubPr>
+              <m:ctrlPr>
+                <w:rPr>
                   <w:rFonts w:ascii="Cambria Math" w:hAnsi="Cambria Math"/>
-                </w:rPr>
-                <m:t>Type equation here.</m:t>
-              </m:r>
-            </m:oMath>
-          </m:oMathPara>
-        </w:sdtContent>
-      </w:sdt>
+                  <w:i/>
+                </w:rPr>
+              </m:ctrlPr>
+            </m:sSubPr>
+            <m:e>
+              <m:r>
+                <w:rPr>
+                  <w:rFonts w:ascii="Cambria Math" w:hAnsi="Cambria Math"/>
+                </w:rPr>
+                <m:t>V</m:t>
+              </m:r>
+            </m:e>
+            <m:sub>
+              <m:r>
+                <w:rPr>
+                  <w:rFonts w:ascii="Cambria Math" w:hAnsi="Cambria Math"/>
+                </w:rPr>
+                <m:t>offset</m:t>
+              </m:r>
+            </m:sub>
+          </m:sSub>
+          <m:r>
+            <w:rPr>
+              <w:rFonts w:ascii="Cambria Math" w:hAnsi="Cambria Math"/>
+            </w:rPr>
+            <m:t>=-</m:t>
+          </m:r>
+          <m:f>
+            <m:fPr>
+              <m:ctrlPr>
+                <w:rPr>
+                  <w:rFonts w:ascii="Cambria Math" w:hAnsi="Cambria Math"/>
+                  <w:i/>
+                </w:rPr>
+              </m:ctrlPr>
+            </m:fPr>
+            <m:num>
+              <m:r>
+                <w:rPr>
+                  <w:rFonts w:ascii="Cambria Math" w:hAnsi="Cambria Math"/>
+                </w:rPr>
+                <m:t>Max</m:t>
+              </m:r>
+              <m:d>
+                <m:dPr>
+                  <m:ctrlPr>
+                    <w:rPr>
+                      <w:rFonts w:ascii="Cambria Math" w:hAnsi="Cambria Math"/>
+                      <w:i/>
+                    </w:rPr>
+                  </m:ctrlPr>
+                </m:dPr>
+                <m:e>
+                  <m:sSub>
+                    <m:sSubPr>
+                      <m:ctrlPr>
+                        <w:rPr>
+                          <w:rFonts w:ascii="Cambria Math" w:hAnsi="Cambria Math"/>
+                          <w:i/>
+                        </w:rPr>
+                      </m:ctrlPr>
+                    </m:sSubPr>
+                    <m:e>
+                      <m:r>
+                        <w:rPr>
+                          <w:rFonts w:ascii="Cambria Math" w:hAnsi="Cambria Math"/>
+                        </w:rPr>
+                        <m:t>V</m:t>
+                      </m:r>
+                    </m:e>
+                    <m:sub>
+                      <m:r>
+                        <w:rPr>
+                          <w:rFonts w:ascii="Cambria Math" w:hAnsi="Cambria Math"/>
+                        </w:rPr>
+                        <m:t>a</m:t>
+                      </m:r>
+                    </m:sub>
+                  </m:sSub>
+                  <m:r>
+                    <w:rPr>
+                      <w:rFonts w:ascii="Cambria Math" w:hAnsi="Cambria Math"/>
+                    </w:rPr>
+                    <m:t>,</m:t>
+                  </m:r>
+                  <m:sSub>
+                    <m:sSubPr>
+                      <m:ctrlPr>
+                        <w:rPr>
+                          <w:rFonts w:ascii="Cambria Math" w:hAnsi="Cambria Math"/>
+                          <w:i/>
+                        </w:rPr>
+                      </m:ctrlPr>
+                    </m:sSubPr>
+                    <m:e>
+                      <m:r>
+                        <w:rPr>
+                          <w:rFonts w:ascii="Cambria Math" w:hAnsi="Cambria Math"/>
+                        </w:rPr>
+                        <m:t>V</m:t>
+                      </m:r>
+                    </m:e>
+                    <m:sub>
+                      <m:r>
+                        <w:rPr>
+                          <w:rFonts w:ascii="Cambria Math" w:hAnsi="Cambria Math"/>
+                        </w:rPr>
+                        <m:t>b</m:t>
+                      </m:r>
+                    </m:sub>
+                  </m:sSub>
+                  <m:r>
+                    <w:rPr>
+                      <w:rFonts w:ascii="Cambria Math" w:hAnsi="Cambria Math"/>
+                    </w:rPr>
+                    <m:t xml:space="preserve">, </m:t>
+                  </m:r>
+                  <m:sSub>
+                    <m:sSubPr>
+                      <m:ctrlPr>
+                        <w:rPr>
+                          <w:rFonts w:ascii="Cambria Math" w:hAnsi="Cambria Math"/>
+                          <w:i/>
+                        </w:rPr>
+                      </m:ctrlPr>
+                    </m:sSubPr>
+                    <m:e>
+                      <m:r>
+                        <w:rPr>
+                          <w:rFonts w:ascii="Cambria Math" w:hAnsi="Cambria Math"/>
+                        </w:rPr>
+                        <m:t>V</m:t>
+                      </m:r>
+                    </m:e>
+                    <m:sub>
+                      <m:r>
+                        <w:rPr>
+                          <w:rFonts w:ascii="Cambria Math" w:hAnsi="Cambria Math"/>
+                        </w:rPr>
+                        <m:t>c</m:t>
+                      </m:r>
+                    </m:sub>
+                  </m:sSub>
+                </m:e>
+              </m:d>
+              <m:r>
+                <w:rPr>
+                  <w:rFonts w:ascii="Cambria Math" w:hAnsi="Cambria Math"/>
+                </w:rPr>
+                <m:t>+Min</m:t>
+              </m:r>
+              <m:d>
+                <m:dPr>
+                  <m:ctrlPr>
+                    <w:rPr>
+                      <w:rFonts w:ascii="Cambria Math" w:hAnsi="Cambria Math"/>
+                      <w:i/>
+                    </w:rPr>
+                  </m:ctrlPr>
+                </m:dPr>
+                <m:e>
+                  <m:sSub>
+                    <m:sSubPr>
+                      <m:ctrlPr>
+                        <w:rPr>
+                          <w:rFonts w:ascii="Cambria Math" w:hAnsi="Cambria Math"/>
+                          <w:i/>
+                        </w:rPr>
+                      </m:ctrlPr>
+                    </m:sSubPr>
+                    <m:e>
+                      <m:r>
+                        <w:rPr>
+                          <w:rFonts w:ascii="Cambria Math" w:hAnsi="Cambria Math"/>
+                        </w:rPr>
+                        <m:t>V</m:t>
+                      </m:r>
+                    </m:e>
+                    <m:sub>
+                      <m:r>
+                        <w:rPr>
+                          <w:rFonts w:ascii="Cambria Math" w:hAnsi="Cambria Math"/>
+                        </w:rPr>
+                        <m:t>a</m:t>
+                      </m:r>
+                    </m:sub>
+                  </m:sSub>
+                  <m:r>
+                    <w:rPr>
+                      <w:rFonts w:ascii="Cambria Math" w:hAnsi="Cambria Math"/>
+                    </w:rPr>
+                    <m:t>,</m:t>
+                  </m:r>
+                  <m:sSub>
+                    <m:sSubPr>
+                      <m:ctrlPr>
+                        <w:rPr>
+                          <w:rFonts w:ascii="Cambria Math" w:hAnsi="Cambria Math"/>
+                          <w:i/>
+                        </w:rPr>
+                      </m:ctrlPr>
+                    </m:sSubPr>
+                    <m:e>
+                      <m:r>
+                        <w:rPr>
+                          <w:rFonts w:ascii="Cambria Math" w:hAnsi="Cambria Math"/>
+                        </w:rPr>
+                        <m:t>V</m:t>
+                      </m:r>
+                    </m:e>
+                    <m:sub>
+                      <m:r>
+                        <w:rPr>
+                          <w:rFonts w:ascii="Cambria Math" w:hAnsi="Cambria Math"/>
+                        </w:rPr>
+                        <m:t>b</m:t>
+                      </m:r>
+                    </m:sub>
+                  </m:sSub>
+                  <m:r>
+                    <w:rPr>
+                      <w:rFonts w:ascii="Cambria Math" w:hAnsi="Cambria Math"/>
+                    </w:rPr>
+                    <m:t xml:space="preserve">, </m:t>
+                  </m:r>
+                  <m:sSub>
+                    <m:sSubPr>
+                      <m:ctrlPr>
+                        <w:rPr>
+                          <w:rFonts w:ascii="Cambria Math" w:hAnsi="Cambria Math"/>
+                          <w:i/>
+                        </w:rPr>
+                      </m:ctrlPr>
+                    </m:sSubPr>
+                    <m:e>
+                      <m:r>
+                        <w:rPr>
+                          <w:rFonts w:ascii="Cambria Math" w:hAnsi="Cambria Math"/>
+                        </w:rPr>
+                        <m:t>V</m:t>
+                      </m:r>
+                    </m:e>
+                    <m:sub>
+                      <m:r>
+                        <w:rPr>
+                          <w:rFonts w:ascii="Cambria Math" w:hAnsi="Cambria Math"/>
+                        </w:rPr>
+                        <m:t>c</m:t>
+                      </m:r>
+                    </m:sub>
+                  </m:sSub>
+                </m:e>
+              </m:d>
+              <m:r>
+                <w:rPr>
+                  <w:rFonts w:ascii="Cambria Math" w:hAnsi="Cambria Math"/>
+                </w:rPr>
+                <m:t xml:space="preserve"> </m:t>
+              </m:r>
+            </m:num>
+            <m:den>
+              <m:r>
+                <w:rPr>
+                  <w:rFonts w:ascii="Cambria Math" w:hAnsi="Cambria Math"/>
+                </w:rPr>
+                <m:t>2</m:t>
+              </m:r>
+            </m:den>
+          </m:f>
+        </m:oMath>
+      </m:oMathPara>
+    </w:p>
+    <w:p/>
+    <w:p>
+      <w:pPr>
+        <w:rPr>
+          <w:rFonts w:eastAsiaTheme="minorEastAsia"/>
+        </w:rPr>
+      </w:pPr>
+      <m:oMathPara>
+        <m:oMath>
+          <m:acc>
+            <m:accPr>
+              <m:chr m:val="́"/>
+              <m:ctrlPr>
+                <w:rPr>
+                  <w:rFonts w:ascii="Cambria Math" w:hAnsi="Cambria Math"/>
+                  <w:i/>
+                </w:rPr>
+              </m:ctrlPr>
+            </m:accPr>
+            <m:e>
+              <m:sSub>
+                <m:sSubPr>
+                  <m:ctrlPr>
+                    <w:rPr>
+                      <w:rFonts w:ascii="Cambria Math" w:hAnsi="Cambria Math"/>
+                      <w:i/>
+                    </w:rPr>
+                  </m:ctrlPr>
+                </m:sSubPr>
+                <m:e>
+                  <m:r>
+                    <w:rPr>
+                      <w:rFonts w:ascii="Cambria Math" w:hAnsi="Cambria Math"/>
+                    </w:rPr>
+                    <m:t>V</m:t>
+                  </m:r>
+                </m:e>
+                <m:sub>
+                  <m:r>
+                    <w:rPr>
+                      <w:rFonts w:ascii="Cambria Math" w:hAnsi="Cambria Math"/>
+                    </w:rPr>
+                    <m:t>a</m:t>
+                  </m:r>
+                </m:sub>
+              </m:sSub>
+            </m:e>
+          </m:acc>
+          <m:r>
+            <w:rPr>
+              <w:rFonts w:ascii="Cambria Math" w:hAnsi="Cambria Math"/>
+            </w:rPr>
+            <m:t xml:space="preserve">= </m:t>
+          </m:r>
+          <m:sSub>
+            <m:sSubPr>
+              <m:ctrlPr>
+                <w:rPr>
+                  <w:rFonts w:ascii="Cambria Math" w:hAnsi="Cambria Math"/>
+                  <w:i/>
+                </w:rPr>
+              </m:ctrlPr>
+            </m:sSubPr>
+            <m:e>
+              <m:r>
+                <w:rPr>
+                  <w:rFonts w:ascii="Cambria Math" w:hAnsi="Cambria Math"/>
+                </w:rPr>
+                <m:t>V</m:t>
+              </m:r>
+            </m:e>
+            <m:sub>
+              <m:r>
+                <w:rPr>
+                  <w:rFonts w:ascii="Cambria Math" w:hAnsi="Cambria Math"/>
+                </w:rPr>
+                <m:t>a</m:t>
+              </m:r>
+            </m:sub>
+          </m:sSub>
+          <m:r>
+            <w:rPr>
+              <w:rFonts w:ascii="Cambria Math" w:hAnsi="Cambria Math"/>
+            </w:rPr>
+            <m:t>+</m:t>
+          </m:r>
+          <m:sSub>
+            <m:sSubPr>
+              <m:ctrlPr>
+                <w:rPr>
+                  <w:rFonts w:ascii="Cambria Math" w:hAnsi="Cambria Math"/>
+                  <w:i/>
+                </w:rPr>
+              </m:ctrlPr>
+            </m:sSubPr>
+            <m:e>
+              <m:r>
+                <w:rPr>
+                  <w:rFonts w:ascii="Cambria Math" w:hAnsi="Cambria Math"/>
+                </w:rPr>
+                <m:t>V</m:t>
+              </m:r>
+            </m:e>
+            <m:sub>
+              <m:r>
+                <w:rPr>
+                  <w:rFonts w:ascii="Cambria Math" w:hAnsi="Cambria Math"/>
+                </w:rPr>
+                <m:t>offset</m:t>
+              </m:r>
+            </m:sub>
+          </m:sSub>
+          <m:r>
+            <w:rPr>
+              <w:rFonts w:ascii="Cambria Math" w:eastAsiaTheme="minorEastAsia" w:hAnsi="Cambria Math"/>
+            </w:rPr>
+            <m:t xml:space="preserve">, same for </m:t>
+          </m:r>
+          <m:acc>
+            <m:accPr>
+              <m:chr m:val="́"/>
+              <m:ctrlPr>
+                <w:rPr>
+                  <w:rFonts w:ascii="Cambria Math" w:hAnsi="Cambria Math"/>
+                  <w:i/>
+                </w:rPr>
+              </m:ctrlPr>
+            </m:accPr>
+            <m:e>
+              <m:sSub>
+                <m:sSubPr>
+                  <m:ctrlPr>
+                    <w:rPr>
+                      <w:rFonts w:ascii="Cambria Math" w:hAnsi="Cambria Math"/>
+                      <w:i/>
+                    </w:rPr>
+                  </m:ctrlPr>
+                </m:sSubPr>
+                <m:e>
+                  <m:r>
+                    <w:rPr>
+                      <w:rFonts w:ascii="Cambria Math" w:hAnsi="Cambria Math"/>
+                    </w:rPr>
+                    <m:t>V</m:t>
+                  </m:r>
+                </m:e>
+                <m:sub>
+                  <m:r>
+                    <w:rPr>
+                      <w:rFonts w:ascii="Cambria Math" w:hAnsi="Cambria Math"/>
+                    </w:rPr>
+                    <m:t>b</m:t>
+                  </m:r>
+                </m:sub>
+              </m:sSub>
+            </m:e>
+          </m:acc>
+          <m:r>
+            <w:rPr>
+              <w:rFonts w:ascii="Cambria Math" w:hAnsi="Cambria Math"/>
+            </w:rPr>
+            <m:t xml:space="preserve">, and </m:t>
+          </m:r>
+          <m:acc>
+            <m:accPr>
+              <m:chr m:val="́"/>
+              <m:ctrlPr>
+                <w:rPr>
+                  <w:rFonts w:ascii="Cambria Math" w:hAnsi="Cambria Math"/>
+                  <w:i/>
+                </w:rPr>
+              </m:ctrlPr>
+            </m:accPr>
+            <m:e>
+              <m:sSub>
+                <m:sSubPr>
+                  <m:ctrlPr>
+                    <w:rPr>
+                      <w:rFonts w:ascii="Cambria Math" w:hAnsi="Cambria Math"/>
+                      <w:i/>
+                    </w:rPr>
+                  </m:ctrlPr>
+                </m:sSubPr>
+                <m:e>
+                  <m:r>
+                    <w:rPr>
+                      <w:rFonts w:ascii="Cambria Math" w:hAnsi="Cambria Math"/>
+                    </w:rPr>
+                    <m:t>V</m:t>
+                  </m:r>
+                </m:e>
+                <m:sub>
+                  <m:r>
+                    <w:rPr>
+                      <w:rFonts w:ascii="Cambria Math" w:hAnsi="Cambria Math"/>
+                    </w:rPr>
+                    <m:t>c</m:t>
+                  </m:r>
+                </m:sub>
+              </m:sSub>
+            </m:e>
+          </m:acc>
+        </m:oMath>
+      </m:oMathPara>
+    </w:p>
+    <w:p>
+      <w:pPr>
+        <w:rPr>
+          <w:rFonts w:eastAsiaTheme="minorEastAsia"/>
+        </w:rPr>
+      </w:pPr>
+    </w:p>
+    <w:p>
+      <w:pPr>
+        <w:rPr>
+          <w:rFonts w:eastAsiaTheme="minorEastAsia"/>
+        </w:rPr>
+      </w:pPr>
+      <m:oMathPara>
+        <m:oMath>
+          <m:sSub>
+            <m:sSubPr>
+              <m:ctrlPr>
+                <w:rPr>
+                  <w:rFonts w:ascii="Cambria Math" w:eastAsiaTheme="minorEastAsia" w:hAnsi="Cambria Math"/>
+                  <w:i/>
+                </w:rPr>
+              </m:ctrlPr>
+            </m:sSubPr>
+            <m:e>
+              <m:r>
+                <w:rPr>
+                  <w:rFonts w:ascii="Cambria Math" w:eastAsiaTheme="minorEastAsia" w:hAnsi="Cambria Math"/>
+                </w:rPr>
+                <m:t>D</m:t>
+              </m:r>
+            </m:e>
+            <m:sub>
+              <m:r>
+                <w:rPr>
+                  <w:rFonts w:ascii="Cambria Math" w:eastAsiaTheme="minorEastAsia" w:hAnsi="Cambria Math"/>
+                </w:rPr>
+                <m:t>A</m:t>
+              </m:r>
+            </m:sub>
+          </m:sSub>
+          <m:r>
+            <w:rPr>
+              <w:rFonts w:ascii="Cambria Math" w:eastAsiaTheme="minorEastAsia" w:hAnsi="Cambria Math"/>
+            </w:rPr>
+            <m:t>=</m:t>
+          </m:r>
+          <m:r>
+            <w:rPr>
+              <w:rFonts w:ascii="Cambria Math" w:eastAsiaTheme="minorEastAsia" w:hAnsi="Cambria Math"/>
+            </w:rPr>
+            <m:t>50+100.</m:t>
+          </m:r>
+          <m:f>
+            <m:fPr>
+              <m:ctrlPr>
+                <w:rPr>
+                  <w:rFonts w:ascii="Cambria Math" w:eastAsiaTheme="minorEastAsia" w:hAnsi="Cambria Math"/>
+                  <w:i/>
+                </w:rPr>
+              </m:ctrlPr>
+            </m:fPr>
+            <m:num>
+              <m:acc>
+                <m:accPr>
+                  <m:chr m:val="́"/>
+                  <m:ctrlPr>
+                    <w:rPr>
+                      <w:rFonts w:ascii="Cambria Math" w:hAnsi="Cambria Math"/>
+                      <w:i/>
+                    </w:rPr>
+                  </m:ctrlPr>
+                </m:accPr>
+                <m:e>
+                  <m:sSub>
+                    <m:sSubPr>
+                      <m:ctrlPr>
+                        <w:rPr>
+                          <w:rFonts w:ascii="Cambria Math" w:hAnsi="Cambria Math"/>
+                          <w:i/>
+                        </w:rPr>
+                      </m:ctrlPr>
+                    </m:sSubPr>
+                    <m:e>
+                      <m:r>
+                        <w:rPr>
+                          <w:rFonts w:ascii="Cambria Math" w:hAnsi="Cambria Math"/>
+                        </w:rPr>
+                        <m:t>V</m:t>
+                      </m:r>
+                    </m:e>
+                    <m:sub>
+                      <m:r>
+                        <w:rPr>
+                          <w:rFonts w:ascii="Cambria Math" w:hAnsi="Cambria Math"/>
+                        </w:rPr>
+                        <m:t>a</m:t>
+                      </m:r>
+                    </m:sub>
+                  </m:sSub>
+                </m:e>
+              </m:acc>
+            </m:num>
+            <m:den>
+              <m:sSub>
+                <m:sSubPr>
+                  <m:ctrlPr>
+                    <w:rPr>
+                      <w:rFonts w:ascii="Cambria Math" w:eastAsiaTheme="minorEastAsia" w:hAnsi="Cambria Math"/>
+                      <w:i/>
+                    </w:rPr>
+                  </m:ctrlPr>
+                </m:sSubPr>
+                <m:e>
+                  <m:r>
+                    <w:rPr>
+                      <w:rFonts w:ascii="Cambria Math" w:eastAsiaTheme="minorEastAsia" w:hAnsi="Cambria Math"/>
+                    </w:rPr>
+                    <m:t>V</m:t>
+                  </m:r>
+                </m:e>
+                <m:sub>
+                  <m:r>
+                    <w:rPr>
+                      <w:rFonts w:ascii="Cambria Math" w:eastAsiaTheme="minorEastAsia" w:hAnsi="Cambria Math"/>
+                    </w:rPr>
+                    <m:t>bus</m:t>
+                  </m:r>
+                </m:sub>
+              </m:sSub>
+            </m:den>
+          </m:f>
+          <m:r>
+            <w:rPr>
+              <w:rFonts w:ascii="Cambria Math" w:eastAsiaTheme="minorEastAsia" w:hAnsi="Cambria Math"/>
+            </w:rPr>
+            <m:t xml:space="preserve">, </m:t>
+          </m:r>
+          <m:sSub>
+            <m:sSubPr>
+              <m:ctrlPr>
+                <w:rPr>
+                  <w:rFonts w:ascii="Cambria Math" w:eastAsiaTheme="minorEastAsia" w:hAnsi="Cambria Math"/>
+                  <w:i/>
+                </w:rPr>
+              </m:ctrlPr>
+            </m:sSubPr>
+            <m:e>
+              <m:r>
+                <w:rPr>
+                  <w:rFonts w:ascii="Cambria Math" w:eastAsiaTheme="minorEastAsia" w:hAnsi="Cambria Math"/>
+                </w:rPr>
+                <m:t>D</m:t>
+              </m:r>
+            </m:e>
+            <m:sub>
+              <m:r>
+                <w:rPr>
+                  <w:rFonts w:ascii="Cambria Math" w:eastAsiaTheme="minorEastAsia" w:hAnsi="Cambria Math"/>
+                </w:rPr>
+                <m:t>B</m:t>
+              </m:r>
+            </m:sub>
+          </m:sSub>
+          <m:r>
+            <w:rPr>
+              <w:rFonts w:ascii="Cambria Math" w:eastAsiaTheme="minorEastAsia" w:hAnsi="Cambria Math"/>
+            </w:rPr>
+            <m:t>=50+100.</m:t>
+          </m:r>
+          <m:f>
+            <m:fPr>
+              <m:ctrlPr>
+                <w:rPr>
+                  <w:rFonts w:ascii="Cambria Math" w:eastAsiaTheme="minorEastAsia" w:hAnsi="Cambria Math"/>
+                  <w:i/>
+                </w:rPr>
+              </m:ctrlPr>
+            </m:fPr>
+            <m:num>
+              <m:acc>
+                <m:accPr>
+                  <m:chr m:val="́"/>
+                  <m:ctrlPr>
+                    <w:rPr>
+                      <w:rFonts w:ascii="Cambria Math" w:hAnsi="Cambria Math"/>
+                      <w:i/>
+                    </w:rPr>
+                  </m:ctrlPr>
+                </m:accPr>
+                <m:e>
+                  <m:sSub>
+                    <m:sSubPr>
+                      <m:ctrlPr>
+                        <w:rPr>
+                          <w:rFonts w:ascii="Cambria Math" w:hAnsi="Cambria Math"/>
+                          <w:i/>
+                        </w:rPr>
+                      </m:ctrlPr>
+                    </m:sSubPr>
+                    <m:e>
+                      <m:r>
+                        <w:rPr>
+                          <w:rFonts w:ascii="Cambria Math" w:hAnsi="Cambria Math"/>
+                        </w:rPr>
+                        <m:t>V</m:t>
+                      </m:r>
+                    </m:e>
+                    <m:sub>
+                      <m:r>
+                        <w:rPr>
+                          <w:rFonts w:ascii="Cambria Math" w:hAnsi="Cambria Math"/>
+                        </w:rPr>
+                        <m:t>b</m:t>
+                      </m:r>
+                    </m:sub>
+                  </m:sSub>
+                </m:e>
+              </m:acc>
+            </m:num>
+            <m:den>
+              <m:sSub>
+                <m:sSubPr>
+                  <m:ctrlPr>
+                    <w:rPr>
+                      <w:rFonts w:ascii="Cambria Math" w:eastAsiaTheme="minorEastAsia" w:hAnsi="Cambria Math"/>
+                      <w:i/>
+                    </w:rPr>
+                  </m:ctrlPr>
+                </m:sSubPr>
+                <m:e>
+                  <m:r>
+                    <w:rPr>
+                      <w:rFonts w:ascii="Cambria Math" w:eastAsiaTheme="minorEastAsia" w:hAnsi="Cambria Math"/>
+                    </w:rPr>
+                    <m:t>V</m:t>
+                  </m:r>
+                </m:e>
+                <m:sub>
+                  <m:r>
+                    <w:rPr>
+                      <w:rFonts w:ascii="Cambria Math" w:eastAsiaTheme="minorEastAsia" w:hAnsi="Cambria Math"/>
+                    </w:rPr>
+                    <m:t>bus</m:t>
+                  </m:r>
+                </m:sub>
+              </m:sSub>
+            </m:den>
+          </m:f>
+          <m:r>
+            <w:rPr>
+              <w:rFonts w:ascii="Cambria Math" w:eastAsiaTheme="minorEastAsia" w:hAnsi="Cambria Math"/>
+            </w:rPr>
+            <m:t xml:space="preserve">, </m:t>
+          </m:r>
+          <m:sSub>
+            <m:sSubPr>
+              <m:ctrlPr>
+                <w:rPr>
+                  <w:rFonts w:ascii="Cambria Math" w:eastAsiaTheme="minorEastAsia" w:hAnsi="Cambria Math"/>
+                  <w:i/>
+                </w:rPr>
+              </m:ctrlPr>
+            </m:sSubPr>
+            <m:e>
+              <m:r>
+                <w:rPr>
+                  <w:rFonts w:ascii="Cambria Math" w:eastAsiaTheme="minorEastAsia" w:hAnsi="Cambria Math"/>
+                </w:rPr>
+                <m:t>D</m:t>
+              </m:r>
+            </m:e>
+            <m:sub>
+              <m:r>
+                <w:rPr>
+                  <w:rFonts w:ascii="Cambria Math" w:eastAsiaTheme="minorEastAsia" w:hAnsi="Cambria Math"/>
+                </w:rPr>
+                <m:t>C</m:t>
+              </m:r>
+            </m:sub>
+          </m:sSub>
+          <m:r>
+            <w:rPr>
+              <w:rFonts w:ascii="Cambria Math" w:eastAsiaTheme="minorEastAsia" w:hAnsi="Cambria Math"/>
+            </w:rPr>
+            <m:t>=50+100.</m:t>
+          </m:r>
+          <m:f>
+            <m:fPr>
+              <m:ctrlPr>
+                <w:rPr>
+                  <w:rFonts w:ascii="Cambria Math" w:eastAsiaTheme="minorEastAsia" w:hAnsi="Cambria Math"/>
+                  <w:i/>
+                </w:rPr>
+              </m:ctrlPr>
+            </m:fPr>
+            <m:num>
+              <m:acc>
+                <m:accPr>
+                  <m:chr m:val="́"/>
+                  <m:ctrlPr>
+                    <w:rPr>
+                      <w:rFonts w:ascii="Cambria Math" w:hAnsi="Cambria Math"/>
+                      <w:i/>
+                    </w:rPr>
+                  </m:ctrlPr>
+                </m:accPr>
+                <m:e>
+                  <m:sSub>
+                    <m:sSubPr>
+                      <m:ctrlPr>
+                        <w:rPr>
+                          <w:rFonts w:ascii="Cambria Math" w:hAnsi="Cambria Math"/>
+                          <w:i/>
+                        </w:rPr>
+                      </m:ctrlPr>
+                    </m:sSubPr>
+                    <m:e>
+                      <m:r>
+                        <w:rPr>
+                          <w:rFonts w:ascii="Cambria Math" w:hAnsi="Cambria Math"/>
+                        </w:rPr>
+                        <m:t>V</m:t>
+                      </m:r>
+                    </m:e>
+                    <m:sub>
+                      <m:r>
+                        <w:rPr>
+                          <w:rFonts w:ascii="Cambria Math" w:hAnsi="Cambria Math"/>
+                        </w:rPr>
+                        <m:t>c</m:t>
+                      </m:r>
+                    </m:sub>
+                  </m:sSub>
+                </m:e>
+              </m:acc>
+            </m:num>
+            <m:den>
+              <m:sSub>
+                <m:sSubPr>
+                  <m:ctrlPr>
+                    <w:rPr>
+                      <w:rFonts w:ascii="Cambria Math" w:eastAsiaTheme="minorEastAsia" w:hAnsi="Cambria Math"/>
+                      <w:i/>
+                    </w:rPr>
+                  </m:ctrlPr>
+                </m:sSubPr>
+                <m:e>
+                  <m:r>
+                    <w:rPr>
+                      <w:rFonts w:ascii="Cambria Math" w:eastAsiaTheme="minorEastAsia" w:hAnsi="Cambria Math"/>
+                    </w:rPr>
+                    <m:t>V</m:t>
+                  </m:r>
+                </m:e>
+                <m:sub>
+                  <m:r>
+                    <w:rPr>
+                      <w:rFonts w:ascii="Cambria Math" w:eastAsiaTheme="minorEastAsia" w:hAnsi="Cambria Math"/>
+                    </w:rPr>
+                    <m:t>bus</m:t>
+                  </m:r>
+                </m:sub>
+              </m:sSub>
+            </m:den>
+          </m:f>
+        </m:oMath>
+      </m:oMathPara>
     </w:p>
     <w:p/>
     <w:p/>
@@ -2875,14 +3735,8 @@
     <w:p/>
     <w:p/>
     <w:p/>
-    <w:p/>
-    <w:p/>
-    <w:p/>
-    <w:p/>
-    <w:p/>
     <w:p>
       <w:r>
-        <w:lastRenderedPageBreak/>
         <w:t>Motor Control Project</w:t>
       </w:r>
     </w:p>
@@ -3245,12 +4099,50 @@
       </w:r>
     </w:p>
     <w:p>
+      <w:pPr>
+        <w:pStyle w:val="ListParagraph"/>
+        <w:numPr>
+          <w:ilvl w:val="0"/>
+          <w:numId w:val="2"/>
+        </w:numPr>
+      </w:pPr>
       <w:r>
         <w:t>Convert Sector-based SVPWM to Min-Max SVPWM</w:t>
       </w:r>
     </w:p>
-    <w:p/>
-    <w:p/>
+    <w:p>
+      <w:pPr>
+        <w:pStyle w:val="ListParagraph"/>
+        <w:numPr>
+          <w:ilvl w:val="0"/>
+          <w:numId w:val="2"/>
+        </w:numPr>
+      </w:pPr>
+      <w:r>
+        <w:t>First OpenLoop voltage run</w:t>
+      </w:r>
+    </w:p>
+    <w:p>
+      <w:r>
+        <w:t xml:space="preserve">So I started off by setting the VOpenLoopVoltage to 0.05 and set the frequency to 2 Hz, then set BEnableMotor to 1, I supplied for this test 12V with 0.5 A over current protection. I gradually increased the frequency and open loop voltage and I can see the motor wobbling and then as I increased the frequency to 10 Hz and open loop voltage to 0.2V the motor started spinning, I further increased the frequency to 20, 30 and so on and I had to increase the open loop voltage to 0.3V. I increased the frequency upto 60 felectrical frequency which corresponds to (60*60)/7 </w:t>
+      </w:r>
+      <w:r>
+        <w:lastRenderedPageBreak/>
+        <w:t xml:space="preserve">= ~514 rpm. If I increased the fElectrical above 65 or VOpenLoopVoltage above 0.3 then the motor stops / struggles and I can see the phase current spike to ~1 A which latches the motor to be disabled. </w:t>
+      </w:r>
+    </w:p>
+    <w:p>
+      <w:pPr>
+        <w:pStyle w:val="ListParagraph"/>
+        <w:numPr>
+          <w:ilvl w:val="0"/>
+          <w:numId w:val="2"/>
+        </w:numPr>
+      </w:pPr>
+      <w:r>
+        <w:t>Turning on and off the motor functionality works as expected as I set 0.3 V and 60 Hz (But the motor has to be aligned which can be done by gradually increasing, if you have this config at start, the motor won’t spin.)</w:t>
+      </w:r>
+    </w:p>
     <w:p/>
     <w:p/>
     <w:p/>
@@ -4169,7 +5061,7 @@
   <w:style w:type="paragraph" w:default="1" w:styleId="Normal">
     <w:name w:val="Normal"/>
     <w:qFormat/>
-    <w:rsid w:val="009F2CAB"/>
+    <w:rsid w:val="000265D3"/>
   </w:style>
   <w:style w:type="paragraph" w:styleId="Heading1">
     <w:name w:val="heading 1"/>
@@ -4700,583 +5592,6 @@
 </w:styles>
 </file>
 
-<file path=word/glossary/document.xml><?xml version="1.0" encoding="utf-8"?>
-<w:glossaryDocument xmlns:wpc="http://schemas.microsoft.com/office/word/2010/wordprocessingCanvas" xmlns:cx="http://schemas.microsoft.com/office/drawing/2014/chartex" xmlns:cx1="http://schemas.microsoft.com/office/drawing/2015/9/8/chartex" xmlns:cx2="http://schemas.microsoft.com/office/drawing/2015/10/21/chartex" xmlns:cx3="http://schemas.microsoft.com/office/drawing/2016/5/9/chartex" xmlns:cx4="http://schemas.microsoft.com/office/drawing/2016/5/10/chartex" xmlns:cx5="http://schemas.microsoft.com/office/drawing/2016/5/11/chartex" xmlns:cx6="http://schemas.microsoft.com/office/drawing/2016/5/12/chartex" xmlns:cx7="http://schemas.microsoft.com/office/drawing/2016/5/13/chartex" xmlns:cx8="http://schemas.microsoft.com/office/drawing/2016/5/14/chartex" xmlns:mc="http://schemas.openxmlformats.org/markup-compatibility/2006" xmlns:aink="http://schemas.microsoft.com/office/drawing/2016/ink" xmlns:am3d="http://schemas.microsoft.com/office/drawing/2017/model3d" xmlns:o="urn:schemas-microsoft-com:office:office" xmlns:oel="http://schemas.microsoft.com/office/2019/extlst" xmlns:r="http://schemas.openxmlformats.org/officeDocument/2006/relationships" xmlns:m="http://schemas.openxmlformats.org/officeDocument/2006/math" xmlns:v="urn:schemas-microsoft-com:vml" xmlns:wp14="http://schemas.microsoft.com/office/word/2010/wordprocessingDrawing" xmlns:wp="http://schemas.openxmlformats.org/drawingml/2006/wordprocessingDrawing" xmlns:w10="urn:schemas-microsoft-com:office:word" xmlns:w="http://schemas.openxmlformats.org/wordprocessingml/2006/main" xmlns:w14="http://schemas.microsoft.com/office/word/2010/wordml" xmlns:w15="http://schemas.microsoft.com/office/word/2012/wordml" xmlns:w16cex="http://schemas.microsoft.com/office/word/2018/wordml/cex" xmlns:w16cid="http://schemas.microsoft.com/office/word/2016/wordml/cid" xmlns:w16="http://schemas.microsoft.com/office/word/2018/wordml" xmlns:w16du="http://schemas.microsoft.com/office/word/2023/wordml/word16du" xmlns:w16sdtdh="http://schemas.microsoft.com/office/word/2020/wordml/sdtdatahash" xmlns:w16sdtfl="http://schemas.microsoft.com/office/word/2024/wordml/sdtformatlock" xmlns:w16se="http://schemas.microsoft.com/office/word/2015/wordml/symex" xmlns:wpg="http://schemas.microsoft.com/office/word/2010/wordprocessingGroup" xmlns:wpi="http://schemas.microsoft.com/office/word/2010/wordprocessingInk" xmlns:wne="http://schemas.microsoft.com/office/word/2006/wordml" xmlns:wps="http://schemas.microsoft.com/office/word/2010/wordprocessingShape" mc:Ignorable="w14 w15 w16se w16cid w16 w16cex w16sdtdh w16sdtfl w16du wp14">
-  <w:docParts>
-    <w:docPart>
-      <w:docPartPr>
-        <w:name w:val="DefaultPlaceholder_2098659789"/>
-        <w:category>
-          <w:name w:val="General"/>
-          <w:gallery w:val="placeholder"/>
-        </w:category>
-        <w:types>
-          <w:type w:val="bbPlcHdr"/>
-        </w:types>
-        <w:behaviors>
-          <w:behavior w:val="content"/>
-        </w:behaviors>
-        <w:guid w:val="{6F2CD091-2851-4303-8CA9-8516E286FFEC}"/>
-      </w:docPartPr>
-      <w:docPartBody>
-        <w:p>
-          <w:r>
-            <w:rPr>
-              <w:rStyle w:val="PlaceholderText"/>
-            </w:rPr>
-            <w:t>Type equation here.</w:t>
-          </w:r>
-        </w:p>
-      </w:docPartBody>
-    </w:docPart>
-  </w:docParts>
-</w:glossaryDocument>
-</file>
-
-<file path=word/glossary/fontTable.xml><?xml version="1.0" encoding="utf-8"?>
-<w:fonts xmlns:mc="http://schemas.openxmlformats.org/markup-compatibility/2006" xmlns:r="http://schemas.openxmlformats.org/officeDocument/2006/relationships" xmlns:w="http://schemas.openxmlformats.org/wordprocessingml/2006/main" xmlns:w14="http://schemas.microsoft.com/office/word/2010/wordml" xmlns:w15="http://schemas.microsoft.com/office/word/2012/wordml" xmlns:w16cex="http://schemas.microsoft.com/office/word/2018/wordml/cex" xmlns:w16cid="http://schemas.microsoft.com/office/word/2016/wordml/cid" xmlns:w16="http://schemas.microsoft.com/office/word/2018/wordml" xmlns:w16du="http://schemas.microsoft.com/office/word/2023/wordml/word16du" xmlns:w16sdtdh="http://schemas.microsoft.com/office/word/2020/wordml/sdtdatahash" xmlns:w16sdtfl="http://schemas.microsoft.com/office/word/2024/wordml/sdtformatlock" xmlns:w16se="http://schemas.microsoft.com/office/word/2015/wordml/symex" mc:Ignorable="w14 w15 w16se w16cid w16 w16cex w16sdtdh w16sdtfl w16du">
-  <w:font w:name="Times New Roman">
-    <w:panose1 w:val="02020603050405020304"/>
-    <w:charset w:val="00"/>
-    <w:family w:val="roman"/>
-    <w:pitch w:val="variable"/>
-    <w:sig w:usb0="E0002EFF" w:usb1="C000785B" w:usb2="00000009" w:usb3="00000000" w:csb0="000001FF" w:csb1="00000000"/>
-  </w:font>
-  <w:font w:name="Aptos">
-    <w:charset w:val="00"/>
-    <w:family w:val="swiss"/>
-    <w:pitch w:val="variable"/>
-    <w:sig w:usb0="20000287" w:usb1="00000003" w:usb2="00000000" w:usb3="00000000" w:csb0="0000019F" w:csb1="00000000"/>
-  </w:font>
-  <w:font w:name="Courier New">
-    <w:panose1 w:val="02070309020205020404"/>
-    <w:charset w:val="00"/>
-    <w:family w:val="modern"/>
-    <w:pitch w:val="fixed"/>
-    <w:sig w:usb0="E0002EFF" w:usb1="C0007843" w:usb2="00000009" w:usb3="00000000" w:csb0="000001FF" w:csb1="00000000"/>
-  </w:font>
-  <w:font w:name="Wingdings">
-    <w:panose1 w:val="05000000000000000000"/>
-    <w:charset w:val="02"/>
-    <w:family w:val="auto"/>
-    <w:pitch w:val="variable"/>
-    <w:sig w:usb0="00000000" w:usb1="10000000" w:usb2="00000000" w:usb3="00000000" w:csb0="80000000" w:csb1="00000000"/>
-  </w:font>
-  <w:font w:name="Symbol">
-    <w:panose1 w:val="05050102010706020507"/>
-    <w:charset w:val="02"/>
-    <w:family w:val="roman"/>
-    <w:pitch w:val="variable"/>
-    <w:sig w:usb0="00000000" w:usb1="10000000" w:usb2="00000000" w:usb3="00000000" w:csb0="80000000" w:csb1="00000000"/>
-  </w:font>
-  <w:font w:name="Aptos Display">
-    <w:charset w:val="00"/>
-    <w:family w:val="swiss"/>
-    <w:pitch w:val="variable"/>
-    <w:sig w:usb0="20000287" w:usb1="00000003" w:usb2="00000000" w:usb3="00000000" w:csb0="0000019F" w:csb1="00000000"/>
-  </w:font>
-  <w:font w:name="Cambria Math">
-    <w:panose1 w:val="02040503050406030204"/>
-    <w:charset w:val="00"/>
-    <w:family w:val="roman"/>
-    <w:pitch w:val="variable"/>
-    <w:sig w:usb0="E00006FF" w:usb1="420024FF" w:usb2="02000000" w:usb3="00000000" w:csb0="0000019F" w:csb1="00000000"/>
-  </w:font>
-</w:fonts>
-</file>
-
-<file path=word/glossary/settings.xml><?xml version="1.0" encoding="utf-8"?>
-<w:settings xmlns:mc="http://schemas.openxmlformats.org/markup-compatibility/2006" xmlns:o="urn:schemas-microsoft-com:office:office" xmlns:r="http://schemas.openxmlformats.org/officeDocument/2006/relationships" xmlns:m="http://schemas.openxmlformats.org/officeDocument/2006/math" xmlns:v="urn:schemas-microsoft-com:vml" xmlns:w10="urn:schemas-microsoft-com:office:word" xmlns:w="http://schemas.openxmlformats.org/wordprocessingml/2006/main" xmlns:w14="http://schemas.microsoft.com/office/word/2010/wordml" xmlns:w15="http://schemas.microsoft.com/office/word/2012/wordml" xmlns:w16cex="http://schemas.microsoft.com/office/word/2018/wordml/cex" xmlns:w16cid="http://schemas.microsoft.com/office/word/2016/wordml/cid" xmlns:w16="http://schemas.microsoft.com/office/word/2018/wordml" xmlns:w16du="http://schemas.microsoft.com/office/word/2023/wordml/word16du" xmlns:w16sdtdh="http://schemas.microsoft.com/office/word/2020/wordml/sdtdatahash" xmlns:w16sdtfl="http://schemas.microsoft.com/office/word/2024/wordml/sdtformatlock" xmlns:w16se="http://schemas.microsoft.com/office/word/2015/wordml/symex" xmlns:sl="http://schemas.openxmlformats.org/schemaLibrary/2006/main" mc:Ignorable="w14 w15 w16se w16cid w16 w16cex w16sdtdh w16sdtfl w16du">
-  <w:view w:val="normal"/>
-  <w:defaultTabStop w:val="720"/>
-  <w:characterSpacingControl w:val="doNotCompress"/>
-  <w:compat>
-    <w:useFELayout/>
-    <w:compatSetting w:name="compatibilityMode" w:uri="http://schemas.microsoft.com/office/word" w:val="15"/>
-    <w:compatSetting w:name="overrideTableStyleFontSizeAndJustification" w:uri="http://schemas.microsoft.com/office/word" w:val="1"/>
-    <w:compatSetting w:name="enableOpenTypeFeatures" w:uri="http://schemas.microsoft.com/office/word" w:val="1"/>
-    <w:compatSetting w:name="doNotFlipMirrorIndents" w:uri="http://schemas.microsoft.com/office/word" w:val="1"/>
-    <w:compatSetting w:name="differentiateMultirowTableHeaders" w:uri="http://schemas.microsoft.com/office/word" w:val="1"/>
-    <w:compatSetting w:name="useWord2013TrackBottomHyphenation" w:uri="http://schemas.microsoft.com/office/word" w:val="0"/>
-  </w:compat>
-  <w:rsids>
-    <w:rsidRoot w:val="00733703"/>
-    <w:rsid w:val="001C1749"/>
-    <w:rsid w:val="00492C65"/>
-    <w:rsid w:val="0055779F"/>
-    <w:rsid w:val="00733703"/>
-    <w:rsid w:val="00D74BF0"/>
-    <w:rsid w:val="00FF782D"/>
-  </w:rsids>
-  <m:mathPr>
-    <m:mathFont m:val="Cambria Math"/>
-    <m:brkBin m:val="before"/>
-    <m:brkBinSub m:val="--"/>
-    <m:smallFrac m:val="0"/>
-    <m:dispDef/>
-    <m:lMargin m:val="0"/>
-    <m:rMargin m:val="0"/>
-    <m:defJc m:val="centerGroup"/>
-    <m:wrapIndent m:val="1440"/>
-    <m:intLim m:val="subSup"/>
-    <m:naryLim m:val="undOvr"/>
-  </m:mathPr>
-  <w:themeFontLang w:val="en-GB"/>
-  <w:clrSchemeMapping w:bg1="light1" w:t1="dark1" w:bg2="light2" w:t2="dark2" w:accent1="accent1" w:accent2="accent2" w:accent3="accent3" w:accent4="accent4" w:accent5="accent5" w:accent6="accent6" w:hyperlink="hyperlink" w:followedHyperlink="followedHyperlink"/>
-  <w:decimalSymbol w:val="."/>
-  <w:listSeparator w:val=","/>
-  <w15:chartTrackingRefBased/>
-</w:settings>
-</file>
-
-<file path=word/glossary/styles.xml><?xml version="1.0" encoding="utf-8"?>
-<w:styles xmlns:mc="http://schemas.openxmlformats.org/markup-compatibility/2006" xmlns:r="http://schemas.openxmlformats.org/officeDocument/2006/relationships" xmlns:w="http://schemas.openxmlformats.org/wordprocessingml/2006/main" xmlns:w14="http://schemas.microsoft.com/office/word/2010/wordml" xmlns:w15="http://schemas.microsoft.com/office/word/2012/wordml" xmlns:w16cex="http://schemas.microsoft.com/office/word/2018/wordml/cex" xmlns:w16cid="http://schemas.microsoft.com/office/word/2016/wordml/cid" xmlns:w16="http://schemas.microsoft.com/office/word/2018/wordml" xmlns:w16du="http://schemas.microsoft.com/office/word/2023/wordml/word16du" xmlns:w16sdtdh="http://schemas.microsoft.com/office/word/2020/wordml/sdtdatahash" xmlns:w16sdtfl="http://schemas.microsoft.com/office/word/2024/wordml/sdtformatlock" xmlns:w16se="http://schemas.microsoft.com/office/word/2015/wordml/symex" mc:Ignorable="w14 w15 w16se w16cid w16 w16cex w16sdtdh w16sdtfl w16du">
-  <w:docDefaults>
-    <w:rPrDefault>
-      <w:rPr>
-        <w:rFonts w:asciiTheme="minorHAnsi" w:eastAsiaTheme="minorEastAsia" w:hAnsiTheme="minorHAnsi" w:cstheme="minorBidi"/>
-        <w:kern w:val="2"/>
-        <w:sz w:val="24"/>
-        <w:szCs w:val="24"/>
-        <w:lang w:val="en-GB" w:eastAsia="en-GB" w:bidi="ar-SA"/>
-        <w14:ligatures w14:val="standardContextual"/>
-      </w:rPr>
-    </w:rPrDefault>
-    <w:pPrDefault>
-      <w:pPr>
-        <w:spacing w:after="160" w:line="278" w:lineRule="auto"/>
-      </w:pPr>
-    </w:pPrDefault>
-  </w:docDefaults>
-  <w:latentStyles w:defLockedState="0" w:defUIPriority="99" w:defSemiHidden="0" w:defUnhideWhenUsed="0" w:defQFormat="0" w:count="376">
-    <w:lsdException w:name="Normal" w:uiPriority="0" w:qFormat="1"/>
-    <w:lsdException w:name="heading 1" w:uiPriority="9" w:qFormat="1"/>
-    <w:lsdException w:name="heading 2" w:semiHidden="1" w:uiPriority="9" w:unhideWhenUsed="1" w:qFormat="1"/>
-    <w:lsdException w:name="heading 3" w:semiHidden="1" w:uiPriority="9" w:unhideWhenUsed="1" w:qFormat="1"/>
-    <w:lsdException w:name="heading 4" w:semiHidden="1" w:uiPriority="9" w:unhideWhenUsed="1" w:qFormat="1"/>
-    <w:lsdException w:name="heading 5" w:semiHidden="1" w:uiPriority="9" w:unhideWhenUsed="1" w:qFormat="1"/>
-    <w:lsdException w:name="heading 6" w:semiHidden="1" w:uiPriority="9" w:unhideWhenUsed="1" w:qFormat="1"/>
-    <w:lsdException w:name="heading 7" w:semiHidden="1" w:uiPriority="9" w:unhideWhenUsed="1" w:qFormat="1"/>
-    <w:lsdException w:name="heading 8" w:semiHidden="1" w:uiPriority="9" w:unhideWhenUsed="1" w:qFormat="1"/>
-    <w:lsdException w:name="heading 9" w:semiHidden="1" w:uiPriority="9" w:unhideWhenUsed="1" w:qFormat="1"/>
-    <w:lsdException w:name="index 1" w:semiHidden="1" w:unhideWhenUsed="1"/>
-    <w:lsdException w:name="index 2" w:semiHidden="1" w:unhideWhenUsed="1"/>
-    <w:lsdException w:name="index 3" w:semiHidden="1" w:unhideWhenUsed="1"/>
-    <w:lsdException w:name="index 4" w:semiHidden="1" w:unhideWhenUsed="1"/>
-    <w:lsdException w:name="index 5" w:semiHidden="1" w:unhideWhenUsed="1"/>
-    <w:lsdException w:name="index 6" w:semiHidden="1" w:unhideWhenUsed="1"/>
-    <w:lsdException w:name="index 7" w:semiHidden="1" w:unhideWhenUsed="1"/>
-    <w:lsdException w:name="index 8" w:semiHidden="1" w:unhideWhenUsed="1"/>
-    <w:lsdException w:name="index 9" w:semiHidden="1" w:unhideWhenUsed="1"/>
-    <w:lsdException w:name="toc 1" w:semiHidden="1" w:uiPriority="39" w:unhideWhenUsed="1"/>
-    <w:lsdException w:name="toc 2" w:semiHidden="1" w:uiPriority="39" w:unhideWhenUsed="1"/>
-    <w:lsdException w:name="toc 3" w:semiHidden="1" w:uiPriority="39" w:unhideWhenUsed="1"/>
-    <w:lsdException w:name="toc 4" w:semiHidden="1" w:uiPriority="39" w:unhideWhenUsed="1"/>
-    <w:lsdException w:name="toc 5" w:semiHidden="1" w:uiPriority="39" w:unhideWhenUsed="1"/>
-    <w:lsdException w:name="toc 6" w:semiHidden="1" w:uiPriority="39" w:unhideWhenUsed="1"/>
-    <w:lsdException w:name="toc 7" w:semiHidden="1" w:uiPriority="39" w:unhideWhenUsed="1"/>
-    <w:lsdException w:name="toc 8" w:semiHidden="1" w:uiPriority="39" w:unhideWhenUsed="1"/>
-    <w:lsdException w:name="toc 9" w:semiHidden="1" w:uiPriority="39" w:unhideWhenUsed="1"/>
-    <w:lsdException w:name="Normal Indent" w:semiHidden="1" w:unhideWhenUsed="1"/>
-    <w:lsdException w:name="footnote text" w:semiHidden="1" w:unhideWhenUsed="1"/>
-    <w:lsdException w:name="annotation text" w:semiHidden="1" w:unhideWhenUsed="1"/>
-    <w:lsdException w:name="header" w:semiHidden="1" w:unhideWhenUsed="1"/>
-    <w:lsdException w:name="footer" w:semiHidden="1" w:unhideWhenUsed="1"/>
-    <w:lsdException w:name="index heading" w:semiHidden="1" w:unhideWhenUsed="1"/>
-    <w:lsdException w:name="caption" w:semiHidden="1" w:uiPriority="35" w:unhideWhenUsed="1" w:qFormat="1"/>
-    <w:lsdException w:name="table of figures" w:semiHidden="1" w:unhideWhenUsed="1"/>
-    <w:lsdException w:name="envelope address" w:semiHidden="1" w:unhideWhenUsed="1"/>
-    <w:lsdException w:name="envelope return" w:semiHidden="1" w:unhideWhenUsed="1"/>
-    <w:lsdException w:name="footnote reference" w:semiHidden="1" w:unhideWhenUsed="1"/>
-    <w:lsdException w:name="annotation reference" w:semiHidden="1" w:unhideWhenUsed="1"/>
-    <w:lsdException w:name="line number" w:semiHidden="1" w:unhideWhenUsed="1"/>
-    <w:lsdException w:name="page number" w:semiHidden="1" w:unhideWhenUsed="1"/>
-    <w:lsdException w:name="endnote reference" w:semiHidden="1" w:unhideWhenUsed="1"/>
-    <w:lsdException w:name="endnote text" w:semiHidden="1" w:unhideWhenUsed="1"/>
-    <w:lsdException w:name="table of authorities" w:semiHidden="1" w:unhideWhenUsed="1"/>
-    <w:lsdException w:name="macro" w:semiHidden="1" w:unhideWhenUsed="1"/>
-    <w:lsdException w:name="toa heading" w:semiHidden="1" w:unhideWhenUsed="1"/>
-    <w:lsdException w:name="List" w:semiHidden="1" w:unhideWhenUsed="1"/>
-    <w:lsdException w:name="List Bullet" w:semiHidden="1" w:unhideWhenUsed="1"/>
-    <w:lsdException w:name="List Number" w:semiHidden="1" w:unhideWhenUsed="1"/>
-    <w:lsdException w:name="List 2" w:semiHidden="1" w:unhideWhenUsed="1"/>
-    <w:lsdException w:name="List 3" w:semiHidden="1" w:unhideWhenUsed="1"/>
-    <w:lsdException w:name="List 4" w:semiHidden="1" w:unhideWhenUsed="1"/>
-    <w:lsdException w:name="List 5" w:semiHidden="1" w:unhideWhenUsed="1"/>
-    <w:lsdException w:name="List Bullet 2" w:semiHidden="1" w:unhideWhenUsed="1"/>
-    <w:lsdException w:name="List Bullet 3" w:semiHidden="1" w:unhideWhenUsed="1"/>
-    <w:lsdException w:name="List Bullet 4" w:semiHidden="1" w:unhideWhenUsed="1"/>
-    <w:lsdException w:name="List Bullet 5" w:semiHidden="1" w:unhideWhenUsed="1"/>
-    <w:lsdException w:name="List Number 2" w:semiHidden="1" w:unhideWhenUsed="1"/>
-    <w:lsdException w:name="List Number 3" w:semiHidden="1" w:unhideWhenUsed="1"/>
-    <w:lsdException w:name="List Number 4" w:semiHidden="1" w:unhideWhenUsed="1"/>
-    <w:lsdException w:name="List Number 5" w:semiHidden="1" w:unhideWhenUsed="1"/>
-    <w:lsdException w:name="Title" w:uiPriority="10" w:qFormat="1"/>
-    <w:lsdException w:name="Closing" w:semiHidden="1" w:unhideWhenUsed="1"/>
-    <w:lsdException w:name="Signature" w:semiHidden="1" w:unhideWhenUsed="1"/>
-    <w:lsdException w:name="Default Paragraph Font" w:semiHidden="1" w:uiPriority="1" w:unhideWhenUsed="1"/>
-    <w:lsdException w:name="Body Text" w:semiHidden="1" w:unhideWhenUsed="1"/>
-    <w:lsdException w:name="Body Text Indent" w:semiHidden="1" w:unhideWhenUsed="1"/>
-    <w:lsdException w:name="List Continue" w:semiHidden="1" w:unhideWhenUsed="1"/>
-    <w:lsdException w:name="List Continue 2" w:semiHidden="1" w:unhideWhenUsed="1"/>
-    <w:lsdException w:name="List Continue 3" w:semiHidden="1" w:unhideWhenUsed="1"/>
-    <w:lsdException w:name="List Continue 4" w:semiHidden="1" w:unhideWhenUsed="1"/>
-    <w:lsdException w:name="List Continue 5" w:semiHidden="1" w:unhideWhenUsed="1"/>
-    <w:lsdException w:name="Message Header" w:semiHidden="1" w:unhideWhenUsed="1"/>
-    <w:lsdException w:name="Subtitle" w:uiPriority="11" w:qFormat="1"/>
-    <w:lsdException w:name="Salutation" w:semiHidden="1" w:unhideWhenUsed="1"/>
-    <w:lsdException w:name="Date" w:semiHidden="1" w:unhideWhenUsed="1"/>
-    <w:lsdException w:name="Body Text First Indent" w:semiHidden="1" w:unhideWhenUsed="1"/>
-    <w:lsdException w:name="Body Text First Indent 2" w:semiHidden="1" w:unhideWhenUsed="1"/>
-    <w:lsdException w:name="Note Heading" w:semiHidden="1" w:unhideWhenUsed="1"/>
-    <w:lsdException w:name="Body Text 2" w:semiHidden="1" w:unhideWhenUsed="1"/>
-    <w:lsdException w:name="Body Text 3" w:semiHidden="1" w:unhideWhenUsed="1"/>
-    <w:lsdException w:name="Body Text Indent 2" w:semiHidden="1" w:unhideWhenUsed="1"/>
-    <w:lsdException w:name="Body Text Indent 3" w:semiHidden="1" w:unhideWhenUsed="1"/>
-    <w:lsdException w:name="Block Text" w:semiHidden="1" w:unhideWhenUsed="1"/>
-    <w:lsdException w:name="Hyperlink" w:semiHidden="1" w:unhideWhenUsed="1"/>
-    <w:lsdException w:name="FollowedHyperlink" w:semiHidden="1" w:unhideWhenUsed="1"/>
-    <w:lsdException w:name="Strong" w:uiPriority="22" w:qFormat="1"/>
-    <w:lsdException w:name="Emphasis" w:uiPriority="20" w:qFormat="1"/>
-    <w:lsdException w:name="Document Map" w:semiHidden="1" w:unhideWhenUsed="1"/>
-    <w:lsdException w:name="Plain Text" w:semiHidden="1" w:unhideWhenUsed="1"/>
-    <w:lsdException w:name="E-mail Signature" w:semiHidden="1" w:unhideWhenUsed="1"/>
-    <w:lsdException w:name="HTML Top of Form" w:semiHidden="1" w:unhideWhenUsed="1"/>
-    <w:lsdException w:name="HTML Bottom of Form" w:semiHidden="1" w:unhideWhenUsed="1"/>
-    <w:lsdException w:name="Normal (Web)" w:semiHidden="1" w:unhideWhenUsed="1"/>
-    <w:lsdException w:name="HTML Acronym" w:semiHidden="1" w:unhideWhenUsed="1"/>
-    <w:lsdException w:name="HTML Address" w:semiHidden="1" w:unhideWhenUsed="1"/>
-    <w:lsdException w:name="HTML Cite" w:semiHidden="1" w:unhideWhenUsed="1"/>
-    <w:lsdException w:name="HTML Code" w:semiHidden="1" w:unhideWhenUsed="1"/>
-    <w:lsdException w:name="HTML Definition" w:semiHidden="1" w:unhideWhenUsed="1"/>
-    <w:lsdException w:name="HTML Keyboard" w:semiHidden="1" w:unhideWhenUsed="1"/>
-    <w:lsdException w:name="HTML Preformatted" w:semiHidden="1" w:unhideWhenUsed="1"/>
-    <w:lsdException w:name="HTML Sample" w:semiHidden="1" w:unhideWhenUsed="1"/>
-    <w:lsdException w:name="HTML Typewriter" w:semiHidden="1" w:unhideWhenUsed="1"/>
-    <w:lsdException w:name="HTML Variable" w:semiHidden="1" w:unhideWhenUsed="1"/>
-    <w:lsdException w:name="Normal Table" w:semiHidden="1" w:unhideWhenUsed="1"/>
-    <w:lsdException w:name="annotation subject" w:semiHidden="1" w:unhideWhenUsed="1"/>
-    <w:lsdException w:name="No List" w:semiHidden="1" w:unhideWhenUsed="1"/>
-    <w:lsdException w:name="Outline List 1" w:semiHidden="1" w:unhideWhenUsed="1"/>
-    <w:lsdException w:name="Outline List 2" w:semiHidden="1" w:unhideWhenUsed="1"/>
-    <w:lsdException w:name="Outline List 3" w:semiHidden="1" w:unhideWhenUsed="1"/>
-    <w:lsdException w:name="Table Simple 1" w:semiHidden="1" w:unhideWhenUsed="1"/>
-    <w:lsdException w:name="Table Simple 2" w:semiHidden="1" w:unhideWhenUsed="1"/>
-    <w:lsdException w:name="Table Simple 3" w:semiHidden="1" w:unhideWhenUsed="1"/>
-    <w:lsdException w:name="Table Classic 1" w:semiHidden="1" w:unhideWhenUsed="1"/>
-    <w:lsdException w:name="Table Classic 2" w:semiHidden="1" w:unhideWhenUsed="1"/>
-    <w:lsdException w:name="Table Classic 3" w:semiHidden="1" w:unhideWhenUsed="1"/>
-    <w:lsdException w:name="Table Classic 4" w:semiHidden="1" w:unhideWhenUsed="1"/>
-    <w:lsdException w:name="Table Colorful 1" w:semiHidden="1" w:unhideWhenUsed="1"/>
-    <w:lsdException w:name="Table Colorful 2" w:semiHidden="1" w:unhideWhenUsed="1"/>
-    <w:lsdException w:name="Table Colorful 3" w:semiHidden="1" w:unhideWhenUsed="1"/>
-    <w:lsdException w:name="Table Columns 1" w:semiHidden="1" w:unhideWhenUsed="1"/>
-    <w:lsdException w:name="Table Columns 2" w:semiHidden="1" w:unhideWhenUsed="1"/>
-    <w:lsdException w:name="Table Columns 3" w:semiHidden="1" w:unhideWhenUsed="1"/>
-    <w:lsdException w:name="Table Columns 4" w:semiHidden="1" w:unhideWhenUsed="1"/>
-    <w:lsdException w:name="Table Columns 5" w:semiHidden="1" w:unhideWhenUsed="1"/>
-    <w:lsdException w:name="Table Grid 1" w:semiHidden="1" w:unhideWhenUsed="1"/>
-    <w:lsdException w:name="Table Grid 2" w:semiHidden="1" w:unhideWhenUsed="1"/>
-    <w:lsdException w:name="Table Grid 3" w:semiHidden="1" w:unhideWhenUsed="1"/>
-    <w:lsdException w:name="Table Grid 4" w:semiHidden="1" w:unhideWhenUsed="1"/>
-    <w:lsdException w:name="Table Grid 5" w:semiHidden="1" w:unhideWhenUsed="1"/>
-    <w:lsdException w:name="Table Grid 6" w:semiHidden="1" w:unhideWhenUsed="1"/>
-    <w:lsdException w:name="Table Grid 7" w:semiHidden="1" w:unhideWhenUsed="1"/>
-    <w:lsdException w:name="Table Grid 8" w:semiHidden="1" w:unhideWhenUsed="1"/>
-    <w:lsdException w:name="Table List 1" w:semiHidden="1" w:unhideWhenUsed="1"/>
-    <w:lsdException w:name="Table List 2" w:semiHidden="1" w:unhideWhenUsed="1"/>
-    <w:lsdException w:name="Table List 3" w:semiHidden="1" w:unhideWhenUsed="1"/>
-    <w:lsdException w:name="Table List 4" w:semiHidden="1" w:unhideWhenUsed="1"/>
-    <w:lsdException w:name="Table List 5" w:semiHidden="1" w:unhideWhenUsed="1"/>
-    <w:lsdException w:name="Table List 6" w:semiHidden="1" w:unhideWhenUsed="1"/>
-    <w:lsdException w:name="Table List 7" w:semiHidden="1" w:unhideWhenUsed="1"/>
-    <w:lsdException w:name="Table List 8" w:semiHidden="1" w:unhideWhenUsed="1"/>
-    <w:lsdException w:name="Table 3D effects 1" w:semiHidden="1" w:unhideWhenUsed="1"/>
-    <w:lsdException w:name="Table 3D effects 2" w:semiHidden="1" w:unhideWhenUsed="1"/>
-    <w:lsdException w:name="Table 3D effects 3" w:semiHidden="1" w:unhideWhenUsed="1"/>
-    <w:lsdException w:name="Table Contemporary" w:semiHidden="1" w:unhideWhenUsed="1"/>
-    <w:lsdException w:name="Table Elegant" w:semiHidden="1" w:unhideWhenUsed="1"/>
-    <w:lsdException w:name="Table Professional" w:semiHidden="1" w:unhideWhenUsed="1"/>
-    <w:lsdException w:name="Table Subtle 1" w:semiHidden="1" w:unhideWhenUsed="1"/>
-    <w:lsdException w:name="Table Subtle 2" w:semiHidden="1" w:unhideWhenUsed="1"/>
-    <w:lsdException w:name="Table Web 1" w:semiHidden="1" w:unhideWhenUsed="1"/>
-    <w:lsdException w:name="Table Web 2" w:semiHidden="1" w:unhideWhenUsed="1"/>
-    <w:lsdException w:name="Table Web 3" w:semiHidden="1" w:unhideWhenUsed="1"/>
-    <w:lsdException w:name="Balloon Text" w:semiHidden="1" w:unhideWhenUsed="1"/>
-    <w:lsdException w:name="Table Grid" w:uiPriority="39"/>
-    <w:lsdException w:name="Table Theme" w:semiHidden="1" w:unhideWhenUsed="1"/>
-    <w:lsdException w:name="Placeholder Text" w:semiHidden="1"/>
-    <w:lsdException w:name="No Spacing" w:uiPriority="1" w:qFormat="1"/>
-    <w:lsdException w:name="Light Shading" w:uiPriority="60"/>
-    <w:lsdException w:name="Light List" w:uiPriority="61"/>
-    <w:lsdException w:name="Light Grid" w:uiPriority="62"/>
-    <w:lsdException w:name="Medium Shading 1" w:uiPriority="63"/>
-    <w:lsdException w:name="Medium Shading 2" w:uiPriority="64"/>
-    <w:lsdException w:name="Medium List 1" w:uiPriority="65"/>
-    <w:lsdException w:name="Medium List 2" w:uiPriority="66"/>
-    <w:lsdException w:name="Medium Grid 1" w:uiPriority="67"/>
-    <w:lsdException w:name="Medium Grid 2" w:uiPriority="68"/>
-    <w:lsdException w:name="Medium Grid 3" w:uiPriority="69"/>
-    <w:lsdException w:name="Dark List" w:uiPriority="70"/>
-    <w:lsdException w:name="Colorful Shading" w:uiPriority="71"/>
-    <w:lsdException w:name="Colorful List" w:uiPriority="72"/>
-    <w:lsdException w:name="Colorful Grid" w:uiPriority="73"/>
-    <w:lsdException w:name="Light Shading Accent 1" w:uiPriority="60"/>
-    <w:lsdException w:name="Light List Accent 1" w:uiPriority="61"/>
-    <w:lsdException w:name="Light Grid Accent 1" w:uiPriority="62"/>
-    <w:lsdException w:name="Medium Shading 1 Accent 1" w:uiPriority="63"/>
-    <w:lsdException w:name="Medium Shading 2 Accent 1" w:uiPriority="64"/>
-    <w:lsdException w:name="Medium List 1 Accent 1" w:uiPriority="65"/>
-    <w:lsdException w:name="Revision" w:semiHidden="1"/>
-    <w:lsdException w:name="List Paragraph" w:uiPriority="34" w:qFormat="1"/>
-    <w:lsdException w:name="Quote" w:uiPriority="29" w:qFormat="1"/>
-    <w:lsdException w:name="Intense Quote" w:uiPriority="30" w:qFormat="1"/>
-    <w:lsdException w:name="Medium List 2 Accent 1" w:uiPriority="66"/>
-    <w:lsdException w:name="Medium Grid 1 Accent 1" w:uiPriority="67"/>
-    <w:lsdException w:name="Medium Grid 2 Accent 1" w:uiPriority="68"/>
-    <w:lsdException w:name="Medium Grid 3 Accent 1" w:uiPriority="69"/>
-    <w:lsdException w:name="Dark List Accent 1" w:uiPriority="70"/>
-    <w:lsdException w:name="Colorful Shading Accent 1" w:uiPriority="71"/>
-    <w:lsdException w:name="Colorful List Accent 1" w:uiPriority="72"/>
-    <w:lsdException w:name="Colorful Grid Accent 1" w:uiPriority="73"/>
-    <w:lsdException w:name="Light Shading Accent 2" w:uiPriority="60"/>
-    <w:lsdException w:name="Light List Accent 2" w:uiPriority="61"/>
-    <w:lsdException w:name="Light Grid Accent 2" w:uiPriority="62"/>
-    <w:lsdException w:name="Medium Shading 1 Accent 2" w:uiPriority="63"/>
-    <w:lsdException w:name="Medium Shading 2 Accent 2" w:uiPriority="64"/>
-    <w:lsdException w:name="Medium List 1 Accent 2" w:uiPriority="65"/>
-    <w:lsdException w:name="Medium List 2 Accent 2" w:uiPriority="66"/>
-    <w:lsdException w:name="Medium Grid 1 Accent 2" w:uiPriority="67"/>
-    <w:lsdException w:name="Medium Grid 2 Accent 2" w:uiPriority="68"/>
-    <w:lsdException w:name="Medium Grid 3 Accent 2" w:uiPriority="69"/>
-    <w:lsdException w:name="Dark List Accent 2" w:uiPriority="70"/>
-    <w:lsdException w:name="Colorful Shading Accent 2" w:uiPriority="71"/>
-    <w:lsdException w:name="Colorful List Accent 2" w:uiPriority="72"/>
-    <w:lsdException w:name="Colorful Grid Accent 2" w:uiPriority="73"/>
-    <w:lsdException w:name="Light Shading Accent 3" w:uiPriority="60"/>
-    <w:lsdException w:name="Light List Accent 3" w:uiPriority="61"/>
-    <w:lsdException w:name="Light Grid Accent 3" w:uiPriority="62"/>
-    <w:lsdException w:name="Medium Shading 1 Accent 3" w:uiPriority="63"/>
-    <w:lsdException w:name="Medium Shading 2 Accent 3" w:uiPriority="64"/>
-    <w:lsdException w:name="Medium List 1 Accent 3" w:uiPriority="65"/>
-    <w:lsdException w:name="Medium List 2 Accent 3" w:uiPriority="66"/>
-    <w:lsdException w:name="Medium Grid 1 Accent 3" w:uiPriority="67"/>
-    <w:lsdException w:name="Medium Grid 2 Accent 3" w:uiPriority="68"/>
-    <w:lsdException w:name="Medium Grid 3 Accent 3" w:uiPriority="69"/>
-    <w:lsdException w:name="Dark List Accent 3" w:uiPriority="70"/>
-    <w:lsdException w:name="Colorful Shading Accent 3" w:uiPriority="71"/>
-    <w:lsdException w:name="Colorful List Accent 3" w:uiPriority="72"/>
-    <w:lsdException w:name="Colorful Grid Accent 3" w:uiPriority="73"/>
-    <w:lsdException w:name="Light Shading Accent 4" w:uiPriority="60"/>
-    <w:lsdException w:name="Light List Accent 4" w:uiPriority="61"/>
-    <w:lsdException w:name="Light Grid Accent 4" w:uiPriority="62"/>
-    <w:lsdException w:name="Medium Shading 1 Accent 4" w:uiPriority="63"/>
-    <w:lsdException w:name="Medium Shading 2 Accent 4" w:uiPriority="64"/>
-    <w:lsdException w:name="Medium List 1 Accent 4" w:uiPriority="65"/>
-    <w:lsdException w:name="Medium List 2 Accent 4" w:uiPriority="66"/>
-    <w:lsdException w:name="Medium Grid 1 Accent 4" w:uiPriority="67"/>
-    <w:lsdException w:name="Medium Grid 2 Accent 4" w:uiPriority="68"/>
-    <w:lsdException w:name="Medium Grid 3 Accent 4" w:uiPriority="69"/>
-    <w:lsdException w:name="Dark List Accent 4" w:uiPriority="70"/>
-    <w:lsdException w:name="Colorful Shading Accent 4" w:uiPriority="71"/>
-    <w:lsdException w:name="Colorful List Accent 4" w:uiPriority="72"/>
-    <w:lsdException w:name="Colorful Grid Accent 4" w:uiPriority="73"/>
-    <w:lsdException w:name="Light Shading Accent 5" w:uiPriority="60"/>
-    <w:lsdException w:name="Light List Accent 5" w:uiPriority="61"/>
-    <w:lsdException w:name="Light Grid Accent 5" w:uiPriority="62"/>
-    <w:lsdException w:name="Medium Shading 1 Accent 5" w:uiPriority="63"/>
-    <w:lsdException w:name="Medium Shading 2 Accent 5" w:uiPriority="64"/>
-    <w:lsdException w:name="Medium List 1 Accent 5" w:uiPriority="65"/>
-    <w:lsdException w:name="Medium List 2 Accent 5" w:uiPriority="66"/>
-    <w:lsdException w:name="Medium Grid 1 Accent 5" w:uiPriority="67"/>
-    <w:lsdException w:name="Medium Grid 2 Accent 5" w:uiPriority="68"/>
-    <w:lsdException w:name="Medium Grid 3 Accent 5" w:uiPriority="69"/>
-    <w:lsdException w:name="Dark List Accent 5" w:uiPriority="70"/>
-    <w:lsdException w:name="Colorful Shading Accent 5" w:uiPriority="71"/>
-    <w:lsdException w:name="Colorful List Accent 5" w:uiPriority="72"/>
-    <w:lsdException w:name="Colorful Grid Accent 5" w:uiPriority="73"/>
-    <w:lsdException w:name="Light Shading Accent 6" w:uiPriority="60"/>
-    <w:lsdException w:name="Light List Accent 6" w:uiPriority="61"/>
-    <w:lsdException w:name="Light Grid Accent 6" w:uiPriority="62"/>
-    <w:lsdException w:name="Medium Shading 1 Accent 6" w:uiPriority="63"/>
-    <w:lsdException w:name="Medium Shading 2 Accent 6" w:uiPriority="64"/>
-    <w:lsdException w:name="Medium List 1 Accent 6" w:uiPriority="65"/>
-    <w:lsdException w:name="Medium List 2 Accent 6" w:uiPriority="66"/>
-    <w:lsdException w:name="Medium Grid 1 Accent 6" w:uiPriority="67"/>
-    <w:lsdException w:name="Medium Grid 2 Accent 6" w:uiPriority="68"/>
-    <w:lsdException w:name="Medium Grid 3 Accent 6" w:uiPriority="69"/>
-    <w:lsdException w:name="Dark List Accent 6" w:uiPriority="70"/>
-    <w:lsdException w:name="Colorful Shading Accent 6" w:uiPriority="71"/>
-    <w:lsdException w:name="Colorful List Accent 6" w:uiPriority="72"/>
-    <w:lsdException w:name="Colorful Grid Accent 6" w:uiPriority="73"/>
-    <w:lsdException w:name="Subtle Emphasis" w:uiPriority="19" w:qFormat="1"/>
-    <w:lsdException w:name="Intense Emphasis" w:uiPriority="21" w:qFormat="1"/>
-    <w:lsdException w:name="Subtle Reference" w:uiPriority="31" w:qFormat="1"/>
-    <w:lsdException w:name="Intense Reference" w:uiPriority="32" w:qFormat="1"/>
-    <w:lsdException w:name="Book Title" w:uiPriority="33" w:qFormat="1"/>
-    <w:lsdException w:name="Bibliography" w:semiHidden="1" w:uiPriority="37" w:unhideWhenUsed="1"/>
-    <w:lsdException w:name="TOC Heading" w:semiHidden="1" w:uiPriority="39" w:unhideWhenUsed="1" w:qFormat="1"/>
-    <w:lsdException w:name="Plain Table 1" w:uiPriority="41"/>
-    <w:lsdException w:name="Plain Table 2" w:uiPriority="42"/>
-    <w:lsdException w:name="Plain Table 3" w:uiPriority="43"/>
-    <w:lsdException w:name="Plain Table 4" w:uiPriority="44"/>
-    <w:lsdException w:name="Plain Table 5" w:uiPriority="45"/>
-    <w:lsdException w:name="Grid Table Light" w:uiPriority="40"/>
-    <w:lsdException w:name="Grid Table 1 Light" w:uiPriority="46"/>
-    <w:lsdException w:name="Grid Table 2" w:uiPriority="47"/>
-    <w:lsdException w:name="Grid Table 3" w:uiPriority="48"/>
-    <w:lsdException w:name="Grid Table 4" w:uiPriority="49"/>
-    <w:lsdException w:name="Grid Table 5 Dark" w:uiPriority="50"/>
-    <w:lsdException w:name="Grid Table 6 Colorful" w:uiPriority="51"/>
-    <w:lsdException w:name="Grid Table 7 Colorful" w:uiPriority="52"/>
-    <w:lsdException w:name="Grid Table 1 Light Accent 1" w:uiPriority="46"/>
-    <w:lsdException w:name="Grid Table 2 Accent 1" w:uiPriority="47"/>
-    <w:lsdException w:name="Grid Table 3 Accent 1" w:uiPriority="48"/>
-    <w:lsdException w:name="Grid Table 4 Accent 1" w:uiPriority="49"/>
-    <w:lsdException w:name="Grid Table 5 Dark Accent 1" w:uiPriority="50"/>
-    <w:lsdException w:name="Grid Table 6 Colorful Accent 1" w:uiPriority="51"/>
-    <w:lsdException w:name="Grid Table 7 Colorful Accent 1" w:uiPriority="52"/>
-    <w:lsdException w:name="Grid Table 1 Light Accent 2" w:uiPriority="46"/>
-    <w:lsdException w:name="Grid Table 2 Accent 2" w:uiPriority="47"/>
-    <w:lsdException w:name="Grid Table 3 Accent 2" w:uiPriority="48"/>
-    <w:lsdException w:name="Grid Table 4 Accent 2" w:uiPriority="49"/>
-    <w:lsdException w:name="Grid Table 5 Dark Accent 2" w:uiPriority="50"/>
-    <w:lsdException w:name="Grid Table 6 Colorful Accent 2" w:uiPriority="51"/>
-    <w:lsdException w:name="Grid Table 7 Colorful Accent 2" w:uiPriority="52"/>
-    <w:lsdException w:name="Grid Table 1 Light Accent 3" w:uiPriority="46"/>
-    <w:lsdException w:name="Grid Table 2 Accent 3" w:uiPriority="47"/>
-    <w:lsdException w:name="Grid Table 3 Accent 3" w:uiPriority="48"/>
-    <w:lsdException w:name="Grid Table 4 Accent 3" w:uiPriority="49"/>
-    <w:lsdException w:name="Grid Table 5 Dark Accent 3" w:uiPriority="50"/>
-    <w:lsdException w:name="Grid Table 6 Colorful Accent 3" w:uiPriority="51"/>
-    <w:lsdException w:name="Grid Table 7 Colorful Accent 3" w:uiPriority="52"/>
-    <w:lsdException w:name="Grid Table 1 Light Accent 4" w:uiPriority="46"/>
-    <w:lsdException w:name="Grid Table 2 Accent 4" w:uiPriority="47"/>
-    <w:lsdException w:name="Grid Table 3 Accent 4" w:uiPriority="48"/>
-    <w:lsdException w:name="Grid Table 4 Accent 4" w:uiPriority="49"/>
-    <w:lsdException w:name="Grid Table 5 Dark Accent 4" w:uiPriority="50"/>
-    <w:lsdException w:name="Grid Table 6 Colorful Accent 4" w:uiPriority="51"/>
-    <w:lsdException w:name="Grid Table 7 Colorful Accent 4" w:uiPriority="52"/>
-    <w:lsdException w:name="Grid Table 1 Light Accent 5" w:uiPriority="46"/>
-    <w:lsdException w:name="Grid Table 2 Accent 5" w:uiPriority="47"/>
-    <w:lsdException w:name="Grid Table 3 Accent 5" w:uiPriority="48"/>
-    <w:lsdException w:name="Grid Table 4 Accent 5" w:uiPriority="49"/>
-    <w:lsdException w:name="Grid Table 5 Dark Accent 5" w:uiPriority="50"/>
-    <w:lsdException w:name="Grid Table 6 Colorful Accent 5" w:uiPriority="51"/>
-    <w:lsdException w:name="Grid Table 7 Colorful Accent 5" w:uiPriority="52"/>
-    <w:lsdException w:name="Grid Table 1 Light Accent 6" w:uiPriority="46"/>
-    <w:lsdException w:name="Grid Table 2 Accent 6" w:uiPriority="47"/>
-    <w:lsdException w:name="Grid Table 3 Accent 6" w:uiPriority="48"/>
-    <w:lsdException w:name="Grid Table 4 Accent 6" w:uiPriority="49"/>
-    <w:lsdException w:name="Grid Table 5 Dark Accent 6" w:uiPriority="50"/>
-    <w:lsdException w:name="Grid Table 6 Colorful Accent 6" w:uiPriority="51"/>
-    <w:lsdException w:name="Grid Table 7 Colorful Accent 6" w:uiPriority="52"/>
-    <w:lsdException w:name="List Table 1 Light" w:uiPriority="46"/>
-    <w:lsdException w:name="List Table 2" w:uiPriority="47"/>
-    <w:lsdException w:name="List Table 3" w:uiPriority="48"/>
-    <w:lsdException w:name="List Table 4" w:uiPriority="49"/>
-    <w:lsdException w:name="List Table 5 Dark" w:uiPriority="50"/>
-    <w:lsdException w:name="List Table 6 Colorful" w:uiPriority="51"/>
-    <w:lsdException w:name="List Table 7 Colorful" w:uiPriority="52"/>
-    <w:lsdException w:name="List Table 1 Light Accent 1" w:uiPriority="46"/>
-    <w:lsdException w:name="List Table 2 Accent 1" w:uiPriority="47"/>
-    <w:lsdException w:name="List Table 3 Accent 1" w:uiPriority="48"/>
-    <w:lsdException w:name="List Table 4 Accent 1" w:uiPriority="49"/>
-    <w:lsdException w:name="List Table 5 Dark Accent 1" w:uiPriority="50"/>
-    <w:lsdException w:name="List Table 6 Colorful Accent 1" w:uiPriority="51"/>
-    <w:lsdException w:name="List Table 7 Colorful Accent 1" w:uiPriority="52"/>
-    <w:lsdException w:name="List Table 1 Light Accent 2" w:uiPriority="46"/>
-    <w:lsdException w:name="List Table 2 Accent 2" w:uiPriority="47"/>
-    <w:lsdException w:name="List Table 3 Accent 2" w:uiPriority="48"/>
-    <w:lsdException w:name="List Table 4 Accent 2" w:uiPriority="49"/>
-    <w:lsdException w:name="List Table 5 Dark Accent 2" w:uiPriority="50"/>
-    <w:lsdException w:name="List Table 6 Colorful Accent 2" w:uiPriority="51"/>
-    <w:lsdException w:name="List Table 7 Colorful Accent 2" w:uiPriority="52"/>
-    <w:lsdException w:name="List Table 1 Light Accent 3" w:uiPriority="46"/>
-    <w:lsdException w:name="List Table 2 Accent 3" w:uiPriority="47"/>
-    <w:lsdException w:name="List Table 3 Accent 3" w:uiPriority="48"/>
-    <w:lsdException w:name="List Table 4 Accent 3" w:uiPriority="49"/>
-    <w:lsdException w:name="List Table 5 Dark Accent 3" w:uiPriority="50"/>
-    <w:lsdException w:name="List Table 6 Colorful Accent 3" w:uiPriority="51"/>
-    <w:lsdException w:name="List Table 7 Colorful Accent 3" w:uiPriority="52"/>
-    <w:lsdException w:name="List Table 1 Light Accent 4" w:uiPriority="46"/>
-    <w:lsdException w:name="List Table 2 Accent 4" w:uiPriority="47"/>
-    <w:lsdException w:name="List Table 3 Accent 4" w:uiPriority="48"/>
-    <w:lsdException w:name="List Table 4 Accent 4" w:uiPriority="49"/>
-    <w:lsdException w:name="List Table 5 Dark Accent 4" w:uiPriority="50"/>
-    <w:lsdException w:name="List Table 6 Colorful Accent 4" w:uiPriority="51"/>
-    <w:lsdException w:name="List Table 7 Colorful Accent 4" w:uiPriority="52"/>
-    <w:lsdException w:name="List Table 1 Light Accent 5" w:uiPriority="46"/>
-    <w:lsdException w:name="List Table 2 Accent 5" w:uiPriority="47"/>
-    <w:lsdException w:name="List Table 3 Accent 5" w:uiPriority="48"/>
-    <w:lsdException w:name="List Table 4 Accent 5" w:uiPriority="49"/>
-    <w:lsdException w:name="List Table 5 Dark Accent 5" w:uiPriority="50"/>
-    <w:lsdException w:name="List Table 6 Colorful Accent 5" w:uiPriority="51"/>
-    <w:lsdException w:name="List Table 7 Colorful Accent 5" w:uiPriority="52"/>
-    <w:lsdException w:name="List Table 1 Light Accent 6" w:uiPriority="46"/>
-    <w:lsdException w:name="List Table 2 Accent 6" w:uiPriority="47"/>
-    <w:lsdException w:name="List Table 3 Accent 6" w:uiPriority="48"/>
-    <w:lsdException w:name="List Table 4 Accent 6" w:uiPriority="49"/>
-    <w:lsdException w:name="List Table 5 Dark Accent 6" w:uiPriority="50"/>
-    <w:lsdException w:name="List Table 6 Colorful Accent 6" w:uiPriority="51"/>
-    <w:lsdException w:name="List Table 7 Colorful Accent 6" w:uiPriority="52"/>
-    <w:lsdException w:name="Mention" w:semiHidden="1" w:unhideWhenUsed="1"/>
-    <w:lsdException w:name="Smart Hyperlink" w:semiHidden="1" w:unhideWhenUsed="1"/>
-    <w:lsdException w:name="Hashtag" w:semiHidden="1" w:unhideWhenUsed="1"/>
-    <w:lsdException w:name="Unresolved Mention" w:semiHidden="1" w:unhideWhenUsed="1"/>
-    <w:lsdException w:name="Smart Link" w:semiHidden="1" w:unhideWhenUsed="1"/>
-  </w:latentStyles>
-  <w:style w:type="paragraph" w:default="1" w:styleId="Normal">
-    <w:name w:val="Normal"/>
-    <w:qFormat/>
-  </w:style>
-  <w:style w:type="character" w:default="1" w:styleId="DefaultParagraphFont">
-    <w:name w:val="Default Paragraph Font"/>
-    <w:uiPriority w:val="1"/>
-    <w:semiHidden/>
-    <w:unhideWhenUsed/>
-  </w:style>
-  <w:style w:type="table" w:default="1" w:styleId="TableNormal">
-    <w:name w:val="Normal Table"/>
-    <w:uiPriority w:val="99"/>
-    <w:semiHidden/>
-    <w:unhideWhenUsed/>
-    <w:tblPr>
-      <w:tblInd w:w="0" w:type="dxa"/>
-      <w:tblCellMar>
-        <w:top w:w="0" w:type="dxa"/>
-        <w:left w:w="108" w:type="dxa"/>
-        <w:bottom w:w="0" w:type="dxa"/>
-        <w:right w:w="108" w:type="dxa"/>
-      </w:tblCellMar>
-    </w:tblPr>
-  </w:style>
-  <w:style w:type="numbering" w:default="1" w:styleId="NoList">
-    <w:name w:val="No List"/>
-    <w:uiPriority w:val="99"/>
-    <w:semiHidden/>
-    <w:unhideWhenUsed/>
-  </w:style>
-  <w:style w:type="character" w:styleId="PlaceholderText">
-    <w:name w:val="Placeholder Text"/>
-    <w:basedOn w:val="DefaultParagraphFont"/>
-    <w:uiPriority w:val="99"/>
-    <w:semiHidden/>
-    <w:rsid w:val="00733703"/>
-    <w:rPr>
-      <w:color w:val="666666"/>
-    </w:rPr>
-  </w:style>
-</w:styles>
-</file>
-
-<file path=word/glossary/webSettings.xml><?xml version="1.0" encoding="utf-8"?>
-<w:webSettings xmlns:mc="http://schemas.openxmlformats.org/markup-compatibility/2006" xmlns:r="http://schemas.openxmlformats.org/officeDocument/2006/relationships" xmlns:w="http://schemas.openxmlformats.org/wordprocessingml/2006/main" xmlns:w14="http://schemas.microsoft.com/office/word/2010/wordml" xmlns:w15="http://schemas.microsoft.com/office/word/2012/wordml" xmlns:w16cex="http://schemas.microsoft.com/office/word/2018/wordml/cex" xmlns:w16cid="http://schemas.microsoft.com/office/word/2016/wordml/cid" xmlns:w16="http://schemas.microsoft.com/office/word/2018/wordml" xmlns:w16du="http://schemas.microsoft.com/office/word/2023/wordml/word16du" xmlns:w16sdtdh="http://schemas.microsoft.com/office/word/2020/wordml/sdtdatahash" xmlns:w16sdtfl="http://schemas.microsoft.com/office/word/2024/wordml/sdtformatlock" xmlns:w16se="http://schemas.microsoft.com/office/word/2015/wordml/symex" mc:Ignorable="w14 w15 w16se w16cid w16 w16cex w16sdtdh w16sdtfl w16du">
-  <w:optimizeForBrowser/>
-  <w:allowPNG/>
-</w:webSettings>
-</file>
-
 <file path=word/theme/theme1.xml><?xml version="1.0" encoding="utf-8"?>
 <a:theme xmlns:a="http://schemas.openxmlformats.org/drawingml/2006/main" name="Office Theme">
   <a:themeElements>

</xml_diff>